<commit_message>
init: structure du projet + conception UML + schema BD
</commit_message>
<xml_diff>
--- a/docs/Cahier_Des_Charges_Tsenantsika.docx
+++ b/docs/Cahier_Des_Charges_Tsenantsika.docx
@@ -53,7 +53,6 @@
         <w:spacing w:after="200"/>
         <w:jc w:val="center"/>
       </w:pPr>
-      <w:proofErr w:type="spellStart"/>
       <w:r>
         <w:rPr>
           <w:b/>
@@ -64,7 +63,6 @@
         </w:rPr>
         <w:t>Tsenan'tsika</w:t>
       </w:r>
-      <w:proofErr w:type="spellEnd"/>
     </w:p>
     <w:p>
       <w:pPr>
@@ -84,7 +82,8 @@
     </w:p>
     <w:p>
       <w:pPr>
-        <w:spacing w:after="800"/>
+        <w:spacing w:after="160"/>
+        <w:jc w:val="center"/>
       </w:pPr>
     </w:p>
     <w:p>
@@ -99,27 +98,7 @@
           <w:sz w:val="26"/>
           <w:szCs w:val="26"/>
         </w:rPr>
-        <w:t xml:space="preserve">RAKOTOJAONA </w:t>
-      </w:r>
-      <w:proofErr w:type="spellStart"/>
-      <w:r>
-        <w:rPr>
-          <w:b/>
-          <w:bCs/>
-          <w:sz w:val="26"/>
-          <w:szCs w:val="26"/>
-        </w:rPr>
-        <w:t>Tsiaronomena</w:t>
-      </w:r>
-      <w:proofErr w:type="spellEnd"/>
-      <w:r>
-        <w:rPr>
-          <w:b/>
-          <w:bCs/>
-          <w:sz w:val="26"/>
-          <w:szCs w:val="26"/>
-        </w:rPr>
-        <w:t xml:space="preserve"> Rohann</w:t>
+        <w:t>RAKOTOJAONA Tsiaronomena Rohann</w:t>
       </w:r>
     </w:p>
     <w:p>
@@ -279,21 +258,12 @@
             </w:tcMar>
           </w:tcPr>
           <w:p>
-            <w:proofErr w:type="spellStart"/>
-            <w:r>
-              <w:rPr>
-                <w:sz w:val="20"/>
-                <w:szCs w:val="20"/>
-              </w:rPr>
-              <w:t>Tsenan'tsika</w:t>
-            </w:r>
-            <w:proofErr w:type="spellEnd"/>
-            <w:r>
-              <w:rPr>
-                <w:sz w:val="20"/>
-                <w:szCs w:val="20"/>
-              </w:rPr>
-              <w:t xml:space="preserve"> — Système national de surveillance des prix alimentaires</w:t>
+            <w:r>
+              <w:rPr>
+                <w:sz w:val="20"/>
+                <w:szCs w:val="20"/>
+              </w:rPr>
+              <w:t>Tsenan'tsika — Système national de surveillance des prix alimentaires</w:t>
             </w:r>
           </w:p>
         </w:tc>
@@ -405,23 +375,7 @@
                 <w:sz w:val="20"/>
                 <w:szCs w:val="20"/>
               </w:rPr>
-              <w:t xml:space="preserve">RAKOTOJAONA </w:t>
-            </w:r>
-            <w:proofErr w:type="spellStart"/>
-            <w:r>
-              <w:rPr>
-                <w:sz w:val="20"/>
-                <w:szCs w:val="20"/>
-              </w:rPr>
-              <w:t>Tsiaronomena</w:t>
-            </w:r>
-            <w:proofErr w:type="spellEnd"/>
-            <w:r>
-              <w:rPr>
-                <w:sz w:val="20"/>
-                <w:szCs w:val="20"/>
-              </w:rPr>
-              <w:t xml:space="preserve"> Rohann</w:t>
+              <w:t>RAKOTOJAONA Tsiaronomena Rohann</w:t>
             </w:r>
           </w:p>
         </w:tc>
@@ -457,7 +411,6 @@
               </w:rPr>
               <w:t>F</w:t>
             </w:r>
-            <w:proofErr w:type="spellStart"/>
             <w:r>
               <w:rPr>
                 <w:sz w:val="20"/>
@@ -466,7 +419,6 @@
               </w:rPr>
               <w:t>ilière</w:t>
             </w:r>
-            <w:proofErr w:type="spellEnd"/>
           </w:p>
         </w:tc>
         <w:tc>
@@ -746,23 +698,7 @@
         <w:spacing w:after="140"/>
       </w:pPr>
       <w:r>
-        <w:t xml:space="preserve">Ce projet démontre la maîtrise de l'architecture logicielle 3-tiers, de la modélisation UML complète, et de l'implémentation manuelle d'algorithmes avancés (Dijkstra, Fenwick </w:t>
-      </w:r>
-      <w:proofErr w:type="spellStart"/>
-      <w:r>
-        <w:t>Tree</w:t>
-      </w:r>
-      <w:proofErr w:type="spellEnd"/>
-      <w:r>
-        <w:t>, Rabin-</w:t>
-      </w:r>
-      <w:proofErr w:type="spellStart"/>
-      <w:r>
-        <w:t>Karp</w:t>
-      </w:r>
-      <w:proofErr w:type="spellEnd"/>
-      <w:r>
-        <w:t>, Top-k). Il répond à toutes les exigences algorithmiques et structurelles du cahier des charges du projet transversal L2.</w:t>
+        <w:t>Ce projet démontre la maîtrise de l'architecture logicielle 3-tiers, de la modélisation UML complète, et de l'implémentation manuelle d'algorithmes avancés (Dijkstra, Fenwick Tree, Rabin-Karp, Top-k). Il répond à toutes les exigences algorithmiques et structurelles du cahier des charges du projet transversal L2.</w:t>
       </w:r>
     </w:p>
     <w:p>
@@ -805,15 +741,9 @@
       <w:pPr>
         <w:spacing w:after="140"/>
       </w:pPr>
-      <w:proofErr w:type="spellStart"/>
       <w:r>
-        <w:t>Tsenan'tsika</w:t>
+        <w:t xml:space="preserve">Tsenan'tsika offre </w:t>
       </w:r>
-      <w:proofErr w:type="spellEnd"/>
-      <w:r>
-        <w:t xml:space="preserve"> offre </w:t>
-      </w:r>
-      <w:proofErr w:type="gramStart"/>
       <w:r>
         <w:t xml:space="preserve">aux citoyens </w:t>
       </w:r>
@@ -823,18 +753,15 @@
         </w:rPr>
         <w:t>m</w:t>
       </w:r>
-      <w:proofErr w:type="spellStart"/>
       <w:r>
         <w:t>alagas</w:t>
       </w:r>
-      <w:proofErr w:type="spellEnd"/>
       <w:r>
         <w:rPr>
           <w:lang w:val="fr-FR"/>
         </w:rPr>
         <w:t>y</w:t>
       </w:r>
-      <w:proofErr w:type="gramEnd"/>
       <w:r>
         <w:t>, aux agents de terrain et aux décideurs du Ministère de l'Agriculture un accès transparent aux prix du marché. En détectant les hausses anormales en temps réel, il contribue directement à la lutte contre la spéculation et à la protection du pouvoir d'achat des ménages les plus vulnérables.</w:t>
       </w:r>
@@ -973,15 +900,7 @@
         <w:spacing w:after="80"/>
       </w:pPr>
       <w:r>
-        <w:t>Garantir l'intégrité des données en détectant les rapports dupliqués ou frauduleux via l'algorithme Rabin-</w:t>
-      </w:r>
-      <w:proofErr w:type="spellStart"/>
-      <w:r>
-        <w:t>Karp</w:t>
-      </w:r>
-      <w:proofErr w:type="spellEnd"/>
-      <w:r>
-        <w:t>.</w:t>
+        <w:t>Garantir l'intégrité des données en détectant les rapports dupliqués ou frauduleux via l'algorithme Rabin-Karp.</w:t>
       </w:r>
     </w:p>
     <w:p>
@@ -994,15 +913,7 @@
         <w:spacing w:after="80"/>
       </w:pPr>
       <w:r>
-        <w:t>Fournir un tableau de bord multilingue (Français / Malgache) accessible via web (React.js) et mobile (</w:t>
-      </w:r>
-      <w:proofErr w:type="spellStart"/>
-      <w:r>
-        <w:t>React</w:t>
-      </w:r>
-      <w:proofErr w:type="spellEnd"/>
-      <w:r>
-        <w:t xml:space="preserve"> Native).</w:t>
+        <w:t>Fournir un tableau de bord multilingue (Français / Malgache) accessible via web (React.js) et mobile (React Native).</w:t>
       </w:r>
     </w:p>
     <w:p>
@@ -1094,15 +1005,7 @@
         <w:spacing w:after="80"/>
       </w:pPr>
       <w:r>
-        <w:t>Interface web (React.js) et application mobile (</w:t>
-      </w:r>
-      <w:proofErr w:type="spellStart"/>
-      <w:r>
-        <w:t>React</w:t>
-      </w:r>
-      <w:proofErr w:type="spellEnd"/>
-      <w:r>
-        <w:t xml:space="preserve"> Native).</w:t>
+        <w:t>Interface web (React.js) et application mobile (React Native).</w:t>
       </w:r>
     </w:p>
     <w:p>
@@ -1115,23 +1018,7 @@
         <w:spacing w:after="80"/>
       </w:pPr>
       <w:r>
-        <w:t xml:space="preserve">Modules algorithmiques implémentés manuellement : Fenwick </w:t>
-      </w:r>
-      <w:proofErr w:type="spellStart"/>
-      <w:r>
-        <w:t>Tree</w:t>
-      </w:r>
-      <w:proofErr w:type="spellEnd"/>
-      <w:r>
-        <w:t>, Top-k (tas binaire), Dijkstra, Rabin-</w:t>
-      </w:r>
-      <w:proofErr w:type="spellStart"/>
-      <w:r>
-        <w:t>Karp</w:t>
-      </w:r>
-      <w:proofErr w:type="spellEnd"/>
-      <w:r>
-        <w:t>.</w:t>
+        <w:t>Modules algorithmiques implémentés manuellement : Fenwick Tree, Top-k (tas binaire), Dijkstra, Rabin-Karp.</w:t>
       </w:r>
     </w:p>
     <w:p>
@@ -1144,23 +1031,7 @@
         <w:spacing w:after="80"/>
       </w:pPr>
       <w:r>
-        <w:t xml:space="preserve">API REST documentée automatiquement via </w:t>
-      </w:r>
-      <w:proofErr w:type="spellStart"/>
-      <w:r>
-        <w:t>FastAPI</w:t>
-      </w:r>
-      <w:proofErr w:type="spellEnd"/>
-      <w:r>
-        <w:t xml:space="preserve"> (</w:t>
-      </w:r>
-      <w:proofErr w:type="spellStart"/>
-      <w:r>
-        <w:t>Swagger</w:t>
-      </w:r>
-      <w:proofErr w:type="spellEnd"/>
-      <w:r>
-        <w:t xml:space="preserve"> UI).</w:t>
+        <w:t>API REST documentée automatiquement via FastAPI (Swagger UI).</w:t>
       </w:r>
     </w:p>
     <w:p>
@@ -1473,23 +1344,7 @@
                 <w:sz w:val="20"/>
                 <w:szCs w:val="20"/>
               </w:rPr>
-              <w:t xml:space="preserve">Un agent saisit le prix observé d'un produit sur un marché local via l'application mobile </w:t>
-            </w:r>
-            <w:proofErr w:type="spellStart"/>
-            <w:r>
-              <w:rPr>
-                <w:sz w:val="20"/>
-                <w:szCs w:val="20"/>
-              </w:rPr>
-              <w:t>React</w:t>
-            </w:r>
-            <w:proofErr w:type="spellEnd"/>
-            <w:r>
-              <w:rPr>
-                <w:sz w:val="20"/>
-                <w:szCs w:val="20"/>
-              </w:rPr>
-              <w:t xml:space="preserve"> Native.</w:t>
+              <w:t>Un agent saisit le prix observé d'un produit sur un marché local via l'application mobile React Native.</w:t>
             </w:r>
           </w:p>
         </w:tc>
@@ -1540,72 +1395,13 @@
             </w:tcMar>
           </w:tcPr>
           <w:p>
-            <w:proofErr w:type="spellStart"/>
-            <w:proofErr w:type="gramStart"/>
-            <w:r>
-              <w:rPr>
-                <w:sz w:val="20"/>
-                <w:szCs w:val="20"/>
-              </w:rPr>
-              <w:t>produit</w:t>
-            </w:r>
-            <w:proofErr w:type="gramEnd"/>
-            <w:r>
-              <w:rPr>
-                <w:sz w:val="20"/>
-                <w:szCs w:val="20"/>
-              </w:rPr>
-              <w:t>_id</w:t>
-            </w:r>
-            <w:proofErr w:type="spellEnd"/>
-            <w:r>
-              <w:rPr>
-                <w:sz w:val="20"/>
-                <w:szCs w:val="20"/>
-              </w:rPr>
-              <w:t xml:space="preserve">, </w:t>
-            </w:r>
-            <w:proofErr w:type="spellStart"/>
-            <w:r>
-              <w:rPr>
-                <w:sz w:val="20"/>
-                <w:szCs w:val="20"/>
-              </w:rPr>
-              <w:t>ville_id</w:t>
-            </w:r>
-            <w:proofErr w:type="spellEnd"/>
-            <w:r>
-              <w:rPr>
-                <w:sz w:val="20"/>
-                <w:szCs w:val="20"/>
-              </w:rPr>
-              <w:t xml:space="preserve">, prix (Ariary/unité), </w:t>
-            </w:r>
-            <w:proofErr w:type="spellStart"/>
-            <w:r>
-              <w:rPr>
-                <w:sz w:val="20"/>
-                <w:szCs w:val="20"/>
-              </w:rPr>
-              <w:t>date_saisie</w:t>
-            </w:r>
-            <w:proofErr w:type="spellEnd"/>
-            <w:r>
-              <w:rPr>
-                <w:sz w:val="20"/>
-                <w:szCs w:val="20"/>
-              </w:rPr>
-              <w:t xml:space="preserve">, </w:t>
-            </w:r>
-            <w:proofErr w:type="spellStart"/>
-            <w:r>
-              <w:rPr>
-                <w:sz w:val="20"/>
-                <w:szCs w:val="20"/>
-              </w:rPr>
-              <w:t>agent_id</w:t>
-            </w:r>
-            <w:proofErr w:type="spellEnd"/>
+            <w:r>
+              <w:rPr>
+                <w:sz w:val="20"/>
+                <w:szCs w:val="20"/>
+              </w:rPr>
+              <w:t>produit_id, ville_id, prix (Ariary/unité), date_saisie, agent_id</w:t>
+            </w:r>
           </w:p>
         </w:tc>
       </w:tr>
@@ -1716,23 +1512,7 @@
                 <w:sz w:val="20"/>
                 <w:szCs w:val="20"/>
               </w:rPr>
-              <w:t>Donnée enregistrée, doublon vérifié (Rabin-</w:t>
-            </w:r>
-            <w:proofErr w:type="spellStart"/>
-            <w:r>
-              <w:rPr>
-                <w:sz w:val="20"/>
-                <w:szCs w:val="20"/>
-              </w:rPr>
-              <w:t>Karp</w:t>
-            </w:r>
-            <w:proofErr w:type="spellEnd"/>
-            <w:r>
-              <w:rPr>
-                <w:sz w:val="20"/>
-                <w:szCs w:val="20"/>
-              </w:rPr>
-              <w:t>), alertes Top-k mises à jour</w:t>
+              <w:t>Donnée enregistrée, doublon vérifié (Rabin-Karp), alertes Top-k mises à jour</w:t>
             </w:r>
           </w:p>
         </w:tc>
@@ -2228,33 +2008,8 @@
                 <w:sz w:val="20"/>
                 <w:szCs w:val="20"/>
               </w:rPr>
-              <w:t xml:space="preserve">Mise à jour </w:t>
-            </w:r>
-            <w:proofErr w:type="gramStart"/>
-            <w:r>
-              <w:rPr>
-                <w:sz w:val="20"/>
-                <w:szCs w:val="20"/>
-              </w:rPr>
-              <w:t>O(</w:t>
-            </w:r>
-            <w:proofErr w:type="gramEnd"/>
-            <w:r>
-              <w:rPr>
-                <w:sz w:val="20"/>
-                <w:szCs w:val="20"/>
-              </w:rPr>
-              <w:t xml:space="preserve">log n) via tas binaire ; moyenne O(log n) via Fenwick </w:t>
-            </w:r>
-            <w:proofErr w:type="spellStart"/>
-            <w:r>
-              <w:rPr>
-                <w:sz w:val="20"/>
-                <w:szCs w:val="20"/>
-              </w:rPr>
-              <w:t>Tree</w:t>
-            </w:r>
-            <w:proofErr w:type="spellEnd"/>
+              <w:t>Mise à jour O(log n) via tas binaire ; moyenne O(log n) via Fenwick Tree</w:t>
+            </w:r>
           </w:p>
         </w:tc>
       </w:tr>
@@ -3149,23 +2904,7 @@
                 <w:sz w:val="20"/>
                 <w:szCs w:val="20"/>
               </w:rPr>
-              <w:t>Rabin-</w:t>
-            </w:r>
-            <w:proofErr w:type="spellStart"/>
-            <w:r>
-              <w:rPr>
-                <w:sz w:val="20"/>
-                <w:szCs w:val="20"/>
-              </w:rPr>
-              <w:t>Karp</w:t>
-            </w:r>
-            <w:proofErr w:type="spellEnd"/>
-            <w:r>
-              <w:rPr>
-                <w:sz w:val="20"/>
-                <w:szCs w:val="20"/>
-              </w:rPr>
-              <w:t xml:space="preserve"> avec fenêtre glissante ; hachage de chaînes</w:t>
+              <w:t>Rabin-Karp avec fenêtre glissante ; hachage de chaînes</w:t>
             </w:r>
           </w:p>
         </w:tc>
@@ -3432,69 +3171,12 @@
             </w:tcMar>
           </w:tcPr>
           <w:p>
-            <w:proofErr w:type="gramStart"/>
-            <w:r>
-              <w:rPr>
-                <w:sz w:val="20"/>
-                <w:szCs w:val="20"/>
-              </w:rPr>
-              <w:t>nom</w:t>
-            </w:r>
-            <w:proofErr w:type="gramEnd"/>
-            <w:r>
-              <w:rPr>
-                <w:sz w:val="20"/>
-                <w:szCs w:val="20"/>
-              </w:rPr>
-              <w:t xml:space="preserve">, prénom, rôle, </w:t>
-            </w:r>
-            <w:proofErr w:type="spellStart"/>
-            <w:r>
-              <w:rPr>
-                <w:sz w:val="20"/>
-                <w:szCs w:val="20"/>
-              </w:rPr>
-              <w:t>district_assigné</w:t>
-            </w:r>
-            <w:proofErr w:type="spellEnd"/>
-            <w:r>
-              <w:rPr>
-                <w:sz w:val="20"/>
-                <w:szCs w:val="20"/>
-              </w:rPr>
-              <w:t xml:space="preserve">, </w:t>
-            </w:r>
-            <w:proofErr w:type="spellStart"/>
-            <w:r>
-              <w:rPr>
-                <w:sz w:val="20"/>
-                <w:szCs w:val="20"/>
-              </w:rPr>
-              <w:t>statut_compte</w:t>
-            </w:r>
-            <w:proofErr w:type="spellEnd"/>
-            <w:r>
-              <w:rPr>
-                <w:sz w:val="20"/>
-                <w:szCs w:val="20"/>
-              </w:rPr>
-              <w:t xml:space="preserve">, </w:t>
-            </w:r>
-            <w:proofErr w:type="spellStart"/>
-            <w:r>
-              <w:rPr>
-                <w:sz w:val="20"/>
-                <w:szCs w:val="20"/>
-              </w:rPr>
-              <w:t>mot_de_passe</w:t>
-            </w:r>
-            <w:proofErr w:type="spellEnd"/>
-            <w:r>
-              <w:rPr>
-                <w:sz w:val="20"/>
-                <w:szCs w:val="20"/>
-              </w:rPr>
-              <w:t xml:space="preserve"> (haché)</w:t>
+            <w:r>
+              <w:rPr>
+                <w:sz w:val="20"/>
+                <w:szCs w:val="20"/>
+              </w:rPr>
+              <w:t>nom, prénom, rôle, district_assigné, statut_compte, mot_de_passe (haché)</w:t>
             </w:r>
           </w:p>
         </w:tc>
@@ -3662,17 +3344,8 @@
                 <w:sz w:val="20"/>
                 <w:szCs w:val="20"/>
               </w:rPr>
-              <w:t xml:space="preserve">Authentification JWT ; hachage </w:t>
-            </w:r>
-            <w:proofErr w:type="spellStart"/>
-            <w:r>
-              <w:rPr>
-                <w:sz w:val="20"/>
-                <w:szCs w:val="20"/>
-              </w:rPr>
-              <w:t>bcrypt</w:t>
-            </w:r>
-            <w:proofErr w:type="spellEnd"/>
+              <w:t>Authentification JWT ; hachage bcrypt</w:t>
+            </w:r>
           </w:p>
         </w:tc>
       </w:tr>
@@ -4111,23 +3784,7 @@
                 <w:sz w:val="20"/>
                 <w:szCs w:val="20"/>
               </w:rPr>
-              <w:t xml:space="preserve">Génération côté backend Python (bibliothèque </w:t>
-            </w:r>
-            <w:proofErr w:type="spellStart"/>
-            <w:r>
-              <w:rPr>
-                <w:sz w:val="20"/>
-                <w:szCs w:val="20"/>
-              </w:rPr>
-              <w:t>ReportLab</w:t>
-            </w:r>
-            <w:proofErr w:type="spellEnd"/>
-            <w:r>
-              <w:rPr>
-                <w:sz w:val="20"/>
-                <w:szCs w:val="20"/>
-              </w:rPr>
-              <w:t>) ; format A4</w:t>
+              <w:t>Génération côté backend Python (bibliothèque ReportLab) ; format A4</w:t>
             </w:r>
           </w:p>
         </w:tc>
@@ -4615,52 +4272,15 @@
       </w:pPr>
       <w:r>
         <w:lastRenderedPageBreak/>
-        <w:t xml:space="preserve">5.3 Analyse des besoins — Méthode </w:t>
+        <w:t>5.3 Analyse des besoins — Méthode MoSCoW</w:t>
       </w:r>
-      <w:proofErr w:type="spellStart"/>
-      <w:r>
-        <w:t>MoSCoW</w:t>
-      </w:r>
-      <w:proofErr w:type="spellEnd"/>
     </w:p>
     <w:p>
       <w:pPr>
         <w:spacing w:after="140"/>
       </w:pPr>
       <w:r>
-        <w:t xml:space="preserve">La méthode </w:t>
-      </w:r>
-      <w:proofErr w:type="spellStart"/>
-      <w:r>
-        <w:t>MoSCoW</w:t>
-      </w:r>
-      <w:proofErr w:type="spellEnd"/>
-      <w:r>
-        <w:t xml:space="preserve"> permet de prioriser les fonctionnalités selon quatre catégories : Must Have (indispensable), </w:t>
-      </w:r>
-      <w:proofErr w:type="spellStart"/>
-      <w:r>
-        <w:t>Should</w:t>
-      </w:r>
-      <w:proofErr w:type="spellEnd"/>
-      <w:r>
-        <w:t xml:space="preserve"> Have (important), </w:t>
-      </w:r>
-      <w:proofErr w:type="spellStart"/>
-      <w:r>
-        <w:t>Could</w:t>
-      </w:r>
-      <w:proofErr w:type="spellEnd"/>
-      <w:r>
-        <w:t xml:space="preserve"> Have (souhaitable), </w:t>
-      </w:r>
-      <w:proofErr w:type="spellStart"/>
-      <w:r>
-        <w:t>Won't</w:t>
-      </w:r>
-      <w:proofErr w:type="spellEnd"/>
-      <w:r>
-        <w:t xml:space="preserve"> Have (hors périmètre pour ce prototype).</w:t>
+        <w:t>La méthode MoSCoW permet de prioriser les fonctionnalités selon quatre catégories : Must Have (indispensable), Should Have (important), Could Have (souhaitable), Won't Have (hors périmètre pour ce prototype).</w:t>
       </w:r>
     </w:p>
     <w:p>
@@ -5082,23 +4702,7 @@
                 <w:sz w:val="20"/>
                 <w:szCs w:val="20"/>
               </w:rPr>
-              <w:t>F4 — Détection doublons (Rabin-</w:t>
-            </w:r>
-            <w:proofErr w:type="spellStart"/>
-            <w:r>
-              <w:rPr>
-                <w:sz w:val="20"/>
-                <w:szCs w:val="20"/>
-              </w:rPr>
-              <w:t>Karp</w:t>
-            </w:r>
-            <w:proofErr w:type="spellEnd"/>
-            <w:r>
-              <w:rPr>
-                <w:sz w:val="20"/>
-                <w:szCs w:val="20"/>
-              </w:rPr>
-              <w:t>)</w:t>
+              <w:t>F4 — Détection doublons (Rabin-Karp)</w:t>
             </w:r>
           </w:p>
         </w:tc>
@@ -5149,21 +4753,12 @@
             </w:tcMar>
           </w:tcPr>
           <w:p>
-            <w:proofErr w:type="spellStart"/>
-            <w:r>
-              <w:rPr>
-                <w:sz w:val="20"/>
-                <w:szCs w:val="20"/>
-              </w:rPr>
-              <w:t>Should</w:t>
-            </w:r>
-            <w:proofErr w:type="spellEnd"/>
-            <w:r>
-              <w:rPr>
-                <w:sz w:val="20"/>
-                <w:szCs w:val="20"/>
-              </w:rPr>
-              <w:t xml:space="preserve"> Have</w:t>
+            <w:r>
+              <w:rPr>
+                <w:sz w:val="20"/>
+                <w:szCs w:val="20"/>
+              </w:rPr>
+              <w:t>Should Have</w:t>
             </w:r>
           </w:p>
         </w:tc>
@@ -5241,21 +4836,12 @@
             </w:tcMar>
           </w:tcPr>
           <w:p>
-            <w:proofErr w:type="spellStart"/>
-            <w:r>
-              <w:rPr>
-                <w:sz w:val="20"/>
-                <w:szCs w:val="20"/>
-              </w:rPr>
-              <w:t>Should</w:t>
-            </w:r>
-            <w:proofErr w:type="spellEnd"/>
-            <w:r>
-              <w:rPr>
-                <w:sz w:val="20"/>
-                <w:szCs w:val="20"/>
-              </w:rPr>
-              <w:t xml:space="preserve"> Have</w:t>
+            <w:r>
+              <w:rPr>
+                <w:sz w:val="20"/>
+                <w:szCs w:val="20"/>
+              </w:rPr>
+              <w:t>Should Have</w:t>
             </w:r>
           </w:p>
         </w:tc>
@@ -5333,21 +4919,12 @@
             </w:tcMar>
           </w:tcPr>
           <w:p>
-            <w:proofErr w:type="spellStart"/>
-            <w:r>
-              <w:rPr>
-                <w:sz w:val="20"/>
-                <w:szCs w:val="20"/>
-              </w:rPr>
-              <w:t>Could</w:t>
-            </w:r>
-            <w:proofErr w:type="spellEnd"/>
-            <w:r>
-              <w:rPr>
-                <w:sz w:val="20"/>
-                <w:szCs w:val="20"/>
-              </w:rPr>
-              <w:t xml:space="preserve"> Have</w:t>
+            <w:r>
+              <w:rPr>
+                <w:sz w:val="20"/>
+                <w:szCs w:val="20"/>
+              </w:rPr>
+              <w:t>Could Have</w:t>
             </w:r>
           </w:p>
         </w:tc>
@@ -5425,21 +5002,12 @@
             </w:tcMar>
           </w:tcPr>
           <w:p>
-            <w:proofErr w:type="spellStart"/>
-            <w:r>
-              <w:rPr>
-                <w:sz w:val="20"/>
-                <w:szCs w:val="20"/>
-              </w:rPr>
-              <w:t>Could</w:t>
-            </w:r>
-            <w:proofErr w:type="spellEnd"/>
-            <w:r>
-              <w:rPr>
-                <w:sz w:val="20"/>
-                <w:szCs w:val="20"/>
-              </w:rPr>
-              <w:t xml:space="preserve"> Have</w:t>
+            <w:r>
+              <w:rPr>
+                <w:sz w:val="20"/>
+                <w:szCs w:val="20"/>
+              </w:rPr>
+              <w:t>Could Have</w:t>
             </w:r>
           </w:p>
         </w:tc>
@@ -5466,23 +5034,7 @@
                 <w:sz w:val="20"/>
                 <w:szCs w:val="20"/>
               </w:rPr>
-              <w:t>Mode hors-ligne (</w:t>
-            </w:r>
-            <w:proofErr w:type="spellStart"/>
-            <w:r>
-              <w:rPr>
-                <w:sz w:val="20"/>
-                <w:szCs w:val="20"/>
-              </w:rPr>
-              <w:t>sync</w:t>
-            </w:r>
-            <w:proofErr w:type="spellEnd"/>
-            <w:r>
-              <w:rPr>
-                <w:sz w:val="20"/>
-                <w:szCs w:val="20"/>
-              </w:rPr>
-              <w:t xml:space="preserve"> différée)</w:t>
+              <w:t>Mode hors-ligne (sync différée)</w:t>
             </w:r>
           </w:p>
         </w:tc>
@@ -5533,21 +5085,12 @@
             </w:tcMar>
           </w:tcPr>
           <w:p>
-            <w:proofErr w:type="spellStart"/>
-            <w:r>
-              <w:rPr>
-                <w:sz w:val="20"/>
-                <w:szCs w:val="20"/>
-              </w:rPr>
-              <w:t>Won't</w:t>
-            </w:r>
-            <w:proofErr w:type="spellEnd"/>
-            <w:r>
-              <w:rPr>
-                <w:sz w:val="20"/>
-                <w:szCs w:val="20"/>
-              </w:rPr>
-              <w:t xml:space="preserve"> Have</w:t>
+            <w:r>
+              <w:rPr>
+                <w:sz w:val="20"/>
+                <w:szCs w:val="20"/>
+              </w:rPr>
+              <w:t>Won't Have</w:t>
             </w:r>
           </w:p>
         </w:tc>
@@ -5625,21 +5168,12 @@
             </w:tcMar>
           </w:tcPr>
           <w:p>
-            <w:proofErr w:type="spellStart"/>
-            <w:r>
-              <w:rPr>
-                <w:sz w:val="20"/>
-                <w:szCs w:val="20"/>
-              </w:rPr>
-              <w:t>Won't</w:t>
-            </w:r>
-            <w:proofErr w:type="spellEnd"/>
-            <w:r>
-              <w:rPr>
-                <w:sz w:val="20"/>
-                <w:szCs w:val="20"/>
-              </w:rPr>
-              <w:t xml:space="preserve"> Have</w:t>
+            <w:r>
+              <w:rPr>
+                <w:sz w:val="20"/>
+                <w:szCs w:val="20"/>
+              </w:rPr>
+              <w:t>Won't Have</w:t>
             </w:r>
           </w:p>
         </w:tc>
@@ -5961,21 +5495,12 @@
             </w:tcMar>
           </w:tcPr>
           <w:p>
-            <w:proofErr w:type="spellStart"/>
-            <w:r>
-              <w:rPr>
-                <w:sz w:val="20"/>
-                <w:szCs w:val="20"/>
-              </w:rPr>
-              <w:t>React</w:t>
-            </w:r>
-            <w:proofErr w:type="spellEnd"/>
-            <w:r>
-              <w:rPr>
-                <w:sz w:val="20"/>
-                <w:szCs w:val="20"/>
-              </w:rPr>
-              <w:t xml:space="preserve"> Native</w:t>
+            <w:r>
+              <w:rPr>
+                <w:sz w:val="20"/>
+                <w:szCs w:val="20"/>
+              </w:rPr>
+              <w:t>React Native</w:t>
             </w:r>
           </w:p>
         </w:tc>
@@ -6002,23 +5527,7 @@
                 <w:sz w:val="20"/>
                 <w:szCs w:val="20"/>
               </w:rPr>
-              <w:t xml:space="preserve">Même codebase JavaScript que </w:t>
-            </w:r>
-            <w:proofErr w:type="spellStart"/>
-            <w:r>
-              <w:rPr>
-                <w:sz w:val="20"/>
-                <w:szCs w:val="20"/>
-              </w:rPr>
-              <w:t>React</w:t>
-            </w:r>
-            <w:proofErr w:type="spellEnd"/>
-            <w:r>
-              <w:rPr>
-                <w:sz w:val="20"/>
-                <w:szCs w:val="20"/>
-              </w:rPr>
-              <w:t xml:space="preserve"> ; déploiement iOS &amp; Android</w:t>
+              <w:t>Même codebase JavaScript que React ; déploiement iOS &amp; Android</w:t>
             </w:r>
           </w:p>
         </w:tc>
@@ -6074,17 +5583,8 @@
                 <w:sz w:val="20"/>
                 <w:szCs w:val="20"/>
               </w:rPr>
-              <w:t xml:space="preserve">Python / </w:t>
-            </w:r>
-            <w:proofErr w:type="spellStart"/>
-            <w:r>
-              <w:rPr>
-                <w:sz w:val="20"/>
-                <w:szCs w:val="20"/>
-              </w:rPr>
-              <w:t>FastAPI</w:t>
-            </w:r>
-            <w:proofErr w:type="spellEnd"/>
+              <w:t>Python / FastAPI</w:t>
+            </w:r>
           </w:p>
         </w:tc>
         <w:tc>
@@ -6110,23 +5610,7 @@
                 <w:sz w:val="20"/>
                 <w:szCs w:val="20"/>
               </w:rPr>
-              <w:t xml:space="preserve">Performance, typage fort, documentation auto </w:t>
-            </w:r>
-            <w:proofErr w:type="spellStart"/>
-            <w:r>
-              <w:rPr>
-                <w:sz w:val="20"/>
-                <w:szCs w:val="20"/>
-              </w:rPr>
-              <w:t>Swagger</w:t>
-            </w:r>
-            <w:proofErr w:type="spellEnd"/>
-            <w:r>
-              <w:rPr>
-                <w:sz w:val="20"/>
-                <w:szCs w:val="20"/>
-              </w:rPr>
-              <w:t xml:space="preserve"> UI intégrée</w:t>
+              <w:t>Performance, typage fort, documentation auto Swagger UI intégrée</w:t>
             </w:r>
           </w:p>
         </w:tc>
@@ -6177,7 +5661,6 @@
             </w:tcMar>
           </w:tcPr>
           <w:p>
-            <w:proofErr w:type="spellStart"/>
             <w:r>
               <w:rPr>
                 <w:sz w:val="20"/>
@@ -6185,7 +5668,6 @@
               </w:rPr>
               <w:t>SQLAlchemy</w:t>
             </w:r>
-            <w:proofErr w:type="spellEnd"/>
           </w:p>
         </w:tc>
         <w:tc>
@@ -6206,21 +5688,12 @@
             </w:tcMar>
           </w:tcPr>
           <w:p>
-            <w:proofErr w:type="spellStart"/>
-            <w:r>
-              <w:rPr>
-                <w:sz w:val="20"/>
-                <w:szCs w:val="20"/>
-              </w:rPr>
-              <w:t>SQLAlchemy</w:t>
-            </w:r>
-            <w:proofErr w:type="spellEnd"/>
-            <w:r>
-              <w:rPr>
-                <w:sz w:val="20"/>
-                <w:szCs w:val="20"/>
-              </w:rPr>
-              <w:t xml:space="preserve"> — ORM Python facilitant les interactions avec PostgreSQL sans SQL brut ; abstraction complète des requêtes, typage fort et gestion des migrations</w:t>
+            <w:r>
+              <w:rPr>
+                <w:sz w:val="20"/>
+                <w:szCs w:val="20"/>
+              </w:rPr>
+              <w:t>SQLAlchemy — ORM Python facilitant les interactions avec PostgreSQL sans SQL brut ; abstraction complète des requêtes, typage fort et gestion des migrations</w:t>
             </w:r>
           </w:p>
         </w:tc>
@@ -6446,23 +5919,7 @@
                 <w:sz w:val="20"/>
                 <w:szCs w:val="20"/>
               </w:rPr>
-              <w:t xml:space="preserve">JWT (JSON Web </w:t>
-            </w:r>
-            <w:proofErr w:type="spellStart"/>
-            <w:r>
-              <w:rPr>
-                <w:sz w:val="20"/>
-                <w:szCs w:val="20"/>
-              </w:rPr>
-              <w:t>Tokens</w:t>
-            </w:r>
-            <w:proofErr w:type="spellEnd"/>
-            <w:r>
-              <w:rPr>
-                <w:sz w:val="20"/>
-                <w:szCs w:val="20"/>
-              </w:rPr>
-              <w:t>)</w:t>
+              <w:t>JWT (JSON Web Tokens)</w:t>
             </w:r>
           </w:p>
         </w:tc>
@@ -6518,17 +5975,8 @@
                 <w:sz w:val="20"/>
                 <w:szCs w:val="20"/>
               </w:rPr>
-              <w:t xml:space="preserve">Hachage </w:t>
-            </w:r>
-            <w:proofErr w:type="spellStart"/>
-            <w:r>
-              <w:rPr>
-                <w:sz w:val="20"/>
-                <w:szCs w:val="20"/>
-              </w:rPr>
-              <w:t>mdp</w:t>
-            </w:r>
-            <w:proofErr w:type="spellEnd"/>
+              <w:t>Hachage mdp</w:t>
+            </w:r>
           </w:p>
         </w:tc>
         <w:tc>
@@ -6549,8 +5997,6 @@
             </w:tcMar>
           </w:tcPr>
           <w:p>
-            <w:proofErr w:type="spellStart"/>
-            <w:proofErr w:type="gramStart"/>
             <w:r>
               <w:rPr>
                 <w:sz w:val="20"/>
@@ -6558,8 +6004,6 @@
               </w:rPr>
               <w:t>bcrypt</w:t>
             </w:r>
-            <w:proofErr w:type="spellEnd"/>
-            <w:proofErr w:type="gramEnd"/>
           </w:p>
         </w:tc>
         <w:tc>
@@ -6636,8 +6080,6 @@
             </w:tcMar>
           </w:tcPr>
           <w:p>
-            <w:proofErr w:type="spellStart"/>
-            <w:proofErr w:type="gramStart"/>
             <w:r>
               <w:rPr>
                 <w:sz w:val="20"/>
@@ -6645,8 +6087,6 @@
               </w:rPr>
               <w:t>pytest</w:t>
             </w:r>
-            <w:proofErr w:type="spellEnd"/>
-            <w:proofErr w:type="gramEnd"/>
           </w:p>
         </w:tc>
         <w:tc>
@@ -6723,7 +6163,6 @@
             </w:tcMar>
           </w:tcPr>
           <w:p>
-            <w:proofErr w:type="spellStart"/>
             <w:r>
               <w:rPr>
                 <w:sz w:val="20"/>
@@ -6731,7 +6170,6 @@
               </w:rPr>
               <w:t>ReportLab</w:t>
             </w:r>
-            <w:proofErr w:type="spellEnd"/>
           </w:p>
         </w:tc>
         <w:tc>
@@ -6840,23 +6278,7 @@
                 <w:sz w:val="20"/>
                 <w:szCs w:val="20"/>
               </w:rPr>
-              <w:t xml:space="preserve">Traçabilité des </w:t>
-            </w:r>
-            <w:proofErr w:type="spellStart"/>
-            <w:r>
-              <w:rPr>
-                <w:sz w:val="20"/>
-                <w:szCs w:val="20"/>
-              </w:rPr>
-              <w:t>commits</w:t>
-            </w:r>
-            <w:proofErr w:type="spellEnd"/>
-            <w:r>
-              <w:rPr>
-                <w:sz w:val="20"/>
-                <w:szCs w:val="20"/>
-              </w:rPr>
-              <w:t xml:space="preserve"> et historique du développement</w:t>
+              <w:t>Traçabilité des commits et historique du développement</w:t>
             </w:r>
           </w:p>
         </w:tc>
@@ -7022,17 +6444,8 @@
                 <w:sz w:val="20"/>
                 <w:szCs w:val="20"/>
               </w:rPr>
-              <w:t xml:space="preserve">Développement, test et débogage avec extensions Python et </w:t>
-            </w:r>
-            <w:proofErr w:type="spellStart"/>
-            <w:r>
-              <w:rPr>
-                <w:sz w:val="20"/>
-                <w:szCs w:val="20"/>
-              </w:rPr>
-              <w:t>React</w:t>
-            </w:r>
-            <w:proofErr w:type="spellEnd"/>
+              <w:t>Développement, test et débogage avec extensions Python et React</w:t>
+            </w:r>
           </w:p>
         </w:tc>
       </w:tr>
@@ -7082,37 +6495,12 @@
             </w:tcMar>
           </w:tcPr>
           <w:p>
-            <w:proofErr w:type="spellStart"/>
-            <w:r>
-              <w:rPr>
-                <w:sz w:val="20"/>
-                <w:szCs w:val="20"/>
-              </w:rPr>
-              <w:t>Swagger</w:t>
-            </w:r>
-            <w:proofErr w:type="spellEnd"/>
-            <w:r>
-              <w:rPr>
-                <w:sz w:val="20"/>
-                <w:szCs w:val="20"/>
-              </w:rPr>
-              <w:t xml:space="preserve"> UI (intégré </w:t>
-            </w:r>
-            <w:proofErr w:type="spellStart"/>
-            <w:r>
-              <w:rPr>
-                <w:sz w:val="20"/>
-                <w:szCs w:val="20"/>
-              </w:rPr>
-              <w:t>FastAPI</w:t>
-            </w:r>
-            <w:proofErr w:type="spellEnd"/>
-            <w:r>
-              <w:rPr>
-                <w:sz w:val="20"/>
-                <w:szCs w:val="20"/>
-              </w:rPr>
-              <w:t>)</w:t>
+            <w:r>
+              <w:rPr>
+                <w:sz w:val="20"/>
+                <w:szCs w:val="20"/>
+              </w:rPr>
+              <w:t>Swagger UI (intégré FastAPI)</w:t>
             </w:r>
           </w:p>
         </w:tc>
@@ -7439,39 +6827,7 @@
                 <w:sz w:val="20"/>
                 <w:szCs w:val="20"/>
               </w:rPr>
-              <w:t>Validation stricte côté backend (</w:t>
-            </w:r>
-            <w:proofErr w:type="spellStart"/>
-            <w:r>
-              <w:rPr>
-                <w:sz w:val="20"/>
-                <w:szCs w:val="20"/>
-              </w:rPr>
-              <w:t>FastAPI</w:t>
-            </w:r>
-            <w:proofErr w:type="spellEnd"/>
-            <w:r>
-              <w:rPr>
-                <w:sz w:val="20"/>
-                <w:szCs w:val="20"/>
-              </w:rPr>
-              <w:t xml:space="preserve">) ; gestion des valeurs nulles via </w:t>
-            </w:r>
-            <w:proofErr w:type="spellStart"/>
-            <w:r>
-              <w:rPr>
-                <w:sz w:val="20"/>
-                <w:szCs w:val="20"/>
-              </w:rPr>
-              <w:t>SQLAlchemy</w:t>
-            </w:r>
-            <w:proofErr w:type="spellEnd"/>
-            <w:r>
-              <w:rPr>
-                <w:sz w:val="20"/>
-                <w:szCs w:val="20"/>
-              </w:rPr>
-              <w:t xml:space="preserve"> ; rejet des valeurs hors plage.</w:t>
+              <w:t>Validation stricte côté backend (FastAPI) ; gestion des valeurs nulles via SQLAlchemy ; rejet des valeurs hors plage.</w:t>
             </w:r>
           </w:p>
         </w:tc>
@@ -7498,39 +6854,7 @@
                 <w:sz w:val="20"/>
                 <w:szCs w:val="20"/>
               </w:rPr>
-              <w:t>Rabin-</w:t>
-            </w:r>
-            <w:proofErr w:type="spellStart"/>
-            <w:r>
-              <w:rPr>
-                <w:sz w:val="20"/>
-                <w:szCs w:val="20"/>
-              </w:rPr>
-              <w:t>Karp</w:t>
-            </w:r>
-            <w:proofErr w:type="spellEnd"/>
-            <w:r>
-              <w:rPr>
-                <w:sz w:val="20"/>
-                <w:szCs w:val="20"/>
-              </w:rPr>
-              <w:t xml:space="preserve"> détecte les doublons ; Fenwick </w:t>
-            </w:r>
-            <w:proofErr w:type="spellStart"/>
-            <w:r>
-              <w:rPr>
-                <w:sz w:val="20"/>
-                <w:szCs w:val="20"/>
-              </w:rPr>
-              <w:t>Tree</w:t>
-            </w:r>
-            <w:proofErr w:type="spellEnd"/>
-            <w:r>
-              <w:rPr>
-                <w:sz w:val="20"/>
-                <w:szCs w:val="20"/>
-              </w:rPr>
-              <w:t xml:space="preserve"> tolère les gaps dans l'historique.</w:t>
+              <w:t>Rabin-Karp détecte les doublons ; Fenwick Tree tolère les gaps dans l'historique.</w:t>
             </w:r>
           </w:p>
         </w:tc>
@@ -7674,39 +6998,7 @@
                 <w:sz w:val="20"/>
                 <w:szCs w:val="20"/>
               </w:rPr>
-              <w:t xml:space="preserve">Fenwick </w:t>
-            </w:r>
-            <w:proofErr w:type="spellStart"/>
-            <w:r>
-              <w:rPr>
-                <w:sz w:val="20"/>
-                <w:szCs w:val="20"/>
-              </w:rPr>
-              <w:t>Tree</w:t>
-            </w:r>
-            <w:proofErr w:type="spellEnd"/>
-            <w:r>
-              <w:rPr>
-                <w:sz w:val="20"/>
-                <w:szCs w:val="20"/>
-              </w:rPr>
-              <w:t xml:space="preserve"> </w:t>
-            </w:r>
-            <w:proofErr w:type="gramStart"/>
-            <w:r>
-              <w:rPr>
-                <w:sz w:val="20"/>
-                <w:szCs w:val="20"/>
-              </w:rPr>
-              <w:t>O(</w:t>
-            </w:r>
-            <w:proofErr w:type="gramEnd"/>
-            <w:r>
-              <w:rPr>
-                <w:sz w:val="20"/>
-                <w:szCs w:val="20"/>
-              </w:rPr>
-              <w:t>log n) vs O(n) naïf ; Dijkstra sur graphe extensible par ajout de nœuds.</w:t>
+              <w:t>Fenwick Tree O(log n) vs O(n) naïf ; Dijkstra sur graphe extensible par ajout de nœuds.</w:t>
             </w:r>
           </w:p>
         </w:tc>
@@ -7816,39 +7108,7 @@
                 <w:sz w:val="20"/>
                 <w:szCs w:val="20"/>
               </w:rPr>
-              <w:t xml:space="preserve">File d'attente locale </w:t>
-            </w:r>
-            <w:proofErr w:type="spellStart"/>
-            <w:r>
-              <w:rPr>
-                <w:sz w:val="20"/>
-                <w:szCs w:val="20"/>
-              </w:rPr>
-              <w:t>React</w:t>
-            </w:r>
-            <w:proofErr w:type="spellEnd"/>
-            <w:r>
-              <w:rPr>
-                <w:sz w:val="20"/>
-                <w:szCs w:val="20"/>
-              </w:rPr>
-              <w:t xml:space="preserve"> Native (</w:t>
-            </w:r>
-            <w:proofErr w:type="spellStart"/>
-            <w:r>
-              <w:rPr>
-                <w:sz w:val="20"/>
-                <w:szCs w:val="20"/>
-              </w:rPr>
-              <w:t>AsyncStorage</w:t>
-            </w:r>
-            <w:proofErr w:type="spellEnd"/>
-            <w:r>
-              <w:rPr>
-                <w:sz w:val="20"/>
-                <w:szCs w:val="20"/>
-              </w:rPr>
-              <w:t>) ; synchronisation différée à la reconnexion ; API idempotente.</w:t>
+              <w:t>File d'attente locale React Native (AsyncStorage) ; synchronisation différée à la reconnexion ; API idempotente.</w:t>
             </w:r>
           </w:p>
         </w:tc>
@@ -7980,69 +7240,12 @@
             </w:tcMar>
           </w:tcPr>
           <w:p>
-            <w:proofErr w:type="spellStart"/>
-            <w:r>
-              <w:rPr>
-                <w:sz w:val="20"/>
-                <w:szCs w:val="20"/>
-              </w:rPr>
-              <w:t>Endpoints</w:t>
-            </w:r>
-            <w:proofErr w:type="spellEnd"/>
-            <w:r>
-              <w:rPr>
-                <w:sz w:val="20"/>
-                <w:szCs w:val="20"/>
-              </w:rPr>
-              <w:t xml:space="preserve"> </w:t>
-            </w:r>
-            <w:proofErr w:type="spellStart"/>
-            <w:r>
-              <w:rPr>
-                <w:sz w:val="20"/>
-                <w:szCs w:val="20"/>
-              </w:rPr>
-              <w:t>FastAPI</w:t>
-            </w:r>
-            <w:proofErr w:type="spellEnd"/>
-            <w:r>
-              <w:rPr>
-                <w:sz w:val="20"/>
-                <w:szCs w:val="20"/>
-              </w:rPr>
-              <w:t xml:space="preserve"> asynchrones (</w:t>
-            </w:r>
-            <w:proofErr w:type="spellStart"/>
-            <w:r>
-              <w:rPr>
-                <w:sz w:val="20"/>
-                <w:szCs w:val="20"/>
-              </w:rPr>
-              <w:t>async</w:t>
-            </w:r>
-            <w:proofErr w:type="spellEnd"/>
-            <w:r>
-              <w:rPr>
-                <w:sz w:val="20"/>
-                <w:szCs w:val="20"/>
-              </w:rPr>
-              <w:t>/</w:t>
-            </w:r>
-            <w:proofErr w:type="spellStart"/>
-            <w:r>
-              <w:rPr>
-                <w:sz w:val="20"/>
-                <w:szCs w:val="20"/>
-              </w:rPr>
-              <w:t>await</w:t>
-            </w:r>
-            <w:proofErr w:type="spellEnd"/>
-            <w:r>
-              <w:rPr>
-                <w:sz w:val="20"/>
-                <w:szCs w:val="20"/>
-              </w:rPr>
-              <w:t>) ; pagination des résultats.</w:t>
+            <w:r>
+              <w:rPr>
+                <w:sz w:val="20"/>
+                <w:szCs w:val="20"/>
+              </w:rPr>
+              <w:t>Endpoints FastAPI asynchrones (async/await) ; pagination des résultats.</w:t>
             </w:r>
           </w:p>
         </w:tc>
@@ -8069,23 +7272,7 @@
                 <w:sz w:val="20"/>
                 <w:szCs w:val="20"/>
               </w:rPr>
-              <w:t xml:space="preserve">Top-k </w:t>
-            </w:r>
-            <w:proofErr w:type="gramStart"/>
-            <w:r>
-              <w:rPr>
-                <w:sz w:val="20"/>
-                <w:szCs w:val="20"/>
-              </w:rPr>
-              <w:t>O(</w:t>
-            </w:r>
-            <w:proofErr w:type="gramEnd"/>
-            <w:r>
-              <w:rPr>
-                <w:sz w:val="20"/>
-                <w:szCs w:val="20"/>
-              </w:rPr>
-              <w:t>log k) par insertion (tas binaire) ; évite un tri complet O(n log n) à chaque mise à jour.</w:t>
+              <w:t>Top-k O(log k) par insertion (tas binaire) ; évite un tri complet O(n log n) à chaque mise à jour.</w:t>
             </w:r>
           </w:p>
         </w:tc>
@@ -8399,23 +7586,7 @@
                 <w:sz w:val="20"/>
                 <w:szCs w:val="20"/>
               </w:rPr>
-              <w:t xml:space="preserve">Priorisation stricte </w:t>
-            </w:r>
-            <w:proofErr w:type="spellStart"/>
-            <w:r>
-              <w:rPr>
-                <w:sz w:val="20"/>
-                <w:szCs w:val="20"/>
-              </w:rPr>
-              <w:t>MoSCoW</w:t>
-            </w:r>
-            <w:proofErr w:type="spellEnd"/>
-            <w:r>
-              <w:rPr>
-                <w:sz w:val="20"/>
-                <w:szCs w:val="20"/>
-              </w:rPr>
-              <w:t xml:space="preserve"> obligatoire ; planning Gantt rigoureux sur 12 semaines ; risque élevé de surcharge si un algorithme dépasse l'estimation de temps prévue.</w:t>
+              <w:t>Priorisation stricte MoSCoW obligatoire ; planning Gantt rigoureux sur 12 semaines ; risque élevé de surcharge si un algorithme dépasse l'estimation de temps prévue.</w:t>
             </w:r>
           </w:p>
         </w:tc>
@@ -8635,23 +7806,7 @@
                 <w:sz w:val="20"/>
                 <w:szCs w:val="20"/>
               </w:rPr>
-              <w:t xml:space="preserve">Visibilité personnelle du </w:t>
-            </w:r>
-            <w:proofErr w:type="spellStart"/>
-            <w:r>
-              <w:rPr>
-                <w:sz w:val="20"/>
-                <w:szCs w:val="20"/>
-              </w:rPr>
-              <w:t>backlog</w:t>
-            </w:r>
-            <w:proofErr w:type="spellEnd"/>
-            <w:r>
-              <w:rPr>
-                <w:sz w:val="20"/>
-                <w:szCs w:val="20"/>
-              </w:rPr>
-              <w:t xml:space="preserve"> ; nécessité d'une discipline individuelle forte pour respecter le Gantt.</w:t>
+              <w:t>Visibilité personnelle du backlog ; nécessité d'une discipline individuelle forte pour respecter le Gantt.</w:t>
             </w:r>
           </w:p>
         </w:tc>
@@ -8776,23 +7931,7 @@
                 <w:sz w:val="20"/>
                 <w:szCs w:val="20"/>
               </w:rPr>
-              <w:t xml:space="preserve">Les fonctionnalités </w:t>
-            </w:r>
-            <w:proofErr w:type="spellStart"/>
-            <w:r>
-              <w:rPr>
-                <w:sz w:val="20"/>
-                <w:szCs w:val="20"/>
-              </w:rPr>
-              <w:t>Could</w:t>
-            </w:r>
-            <w:proofErr w:type="spellEnd"/>
-            <w:r>
-              <w:rPr>
-                <w:sz w:val="20"/>
-                <w:szCs w:val="20"/>
-              </w:rPr>
-              <w:t xml:space="preserve"> Have (export PDF, mode offline complet) peuvent être sacrifiées si le délai est menacé.</w:t>
+              <w:t>Les fonctionnalités Could Have (export PDF, mode offline complet) peuvent être sacrifiées si le délai est menacé.</w:t>
             </w:r>
           </w:p>
         </w:tc>
@@ -9061,55 +8200,7 @@
                 <w:sz w:val="20"/>
                 <w:szCs w:val="20"/>
               </w:rPr>
-              <w:t xml:space="preserve">Authentification JWT (JSON Web </w:t>
-            </w:r>
-            <w:proofErr w:type="spellStart"/>
-            <w:r>
-              <w:rPr>
-                <w:sz w:val="20"/>
-                <w:szCs w:val="20"/>
-              </w:rPr>
-              <w:t>Tokens</w:t>
-            </w:r>
-            <w:proofErr w:type="spellEnd"/>
-            <w:r>
-              <w:rPr>
-                <w:sz w:val="20"/>
-                <w:szCs w:val="20"/>
-              </w:rPr>
-              <w:t xml:space="preserve">) ; middleware de vérification du rôle sur chaque </w:t>
-            </w:r>
-            <w:proofErr w:type="spellStart"/>
-            <w:r>
-              <w:rPr>
-                <w:sz w:val="20"/>
-                <w:szCs w:val="20"/>
-              </w:rPr>
-              <w:t>endpoint</w:t>
-            </w:r>
-            <w:proofErr w:type="spellEnd"/>
-            <w:r>
-              <w:rPr>
-                <w:sz w:val="20"/>
-                <w:szCs w:val="20"/>
-              </w:rPr>
-              <w:t xml:space="preserve"> </w:t>
-            </w:r>
-            <w:proofErr w:type="spellStart"/>
-            <w:r>
-              <w:rPr>
-                <w:sz w:val="20"/>
-                <w:szCs w:val="20"/>
-              </w:rPr>
-              <w:t>FastAPI</w:t>
-            </w:r>
-            <w:proofErr w:type="spellEnd"/>
-            <w:r>
-              <w:rPr>
-                <w:sz w:val="20"/>
-                <w:szCs w:val="20"/>
-              </w:rPr>
-              <w:t>.</w:t>
+              <w:t>Authentification JWT (JSON Web Tokens) ; middleware de vérification du rôle sur chaque endpoint FastAPI.</w:t>
             </w:r>
           </w:p>
         </w:tc>
@@ -9219,23 +8310,7 @@
                 <w:sz w:val="20"/>
                 <w:szCs w:val="20"/>
               </w:rPr>
-              <w:t xml:space="preserve">Hachage </w:t>
-            </w:r>
-            <w:proofErr w:type="spellStart"/>
-            <w:r>
-              <w:rPr>
-                <w:sz w:val="20"/>
-                <w:szCs w:val="20"/>
-              </w:rPr>
-              <w:t>bcrypt</w:t>
-            </w:r>
-            <w:proofErr w:type="spellEnd"/>
-            <w:r>
-              <w:rPr>
-                <w:sz w:val="20"/>
-                <w:szCs w:val="20"/>
-              </w:rPr>
-              <w:t xml:space="preserve"> avec sel aléatoire ; jamais de mot de passe en clair dans les logs.</w:t>
+              <w:t>Hachage bcrypt avec sel aléatoire ; jamais de mot de passe en clair dans les logs.</w:t>
             </w:r>
           </w:p>
         </w:tc>
@@ -9346,55 +8421,7 @@
                 <w:sz w:val="20"/>
                 <w:szCs w:val="20"/>
               </w:rPr>
-              <w:t xml:space="preserve">Validation </w:t>
-            </w:r>
-            <w:proofErr w:type="spellStart"/>
-            <w:r>
-              <w:rPr>
-                <w:sz w:val="20"/>
-                <w:szCs w:val="20"/>
-              </w:rPr>
-              <w:t>Pydantic</w:t>
-            </w:r>
-            <w:proofErr w:type="spellEnd"/>
-            <w:r>
-              <w:rPr>
-                <w:sz w:val="20"/>
-                <w:szCs w:val="20"/>
-              </w:rPr>
-              <w:t xml:space="preserve"> côté </w:t>
-            </w:r>
-            <w:proofErr w:type="spellStart"/>
-            <w:r>
-              <w:rPr>
-                <w:sz w:val="20"/>
-                <w:szCs w:val="20"/>
-              </w:rPr>
-              <w:t>FastAPI</w:t>
-            </w:r>
-            <w:proofErr w:type="spellEnd"/>
-            <w:r>
-              <w:rPr>
-                <w:sz w:val="20"/>
-                <w:szCs w:val="20"/>
-              </w:rPr>
-              <w:t xml:space="preserve"> ; typage strict des champs (</w:t>
-            </w:r>
-            <w:proofErr w:type="spellStart"/>
-            <w:r>
-              <w:rPr>
-                <w:sz w:val="20"/>
-                <w:szCs w:val="20"/>
-              </w:rPr>
-              <w:t>float</w:t>
-            </w:r>
-            <w:proofErr w:type="spellEnd"/>
-            <w:r>
-              <w:rPr>
-                <w:sz w:val="20"/>
-                <w:szCs w:val="20"/>
-              </w:rPr>
-              <w:t xml:space="preserve"> positif, date ISO 8601).</w:t>
+              <w:t>Validation Pydantic côté FastAPI ; typage strict des champs (float positif, date ISO 8601).</w:t>
             </w:r>
           </w:p>
         </w:tc>
@@ -9499,21 +8526,12 @@
             </w:tcMar>
           </w:tcPr>
           <w:p>
-            <w:proofErr w:type="spellStart"/>
-            <w:r>
-              <w:rPr>
-                <w:sz w:val="20"/>
-                <w:szCs w:val="20"/>
-              </w:rPr>
-              <w:t>SQLAlchemy</w:t>
-            </w:r>
-            <w:proofErr w:type="spellEnd"/>
-            <w:r>
-              <w:rPr>
-                <w:sz w:val="20"/>
-                <w:szCs w:val="20"/>
-              </w:rPr>
-              <w:t xml:space="preserve"> ORM utilisé exclusivement ; aucune requête SQL construite par concaténation de chaînes.</w:t>
+            <w:r>
+              <w:rPr>
+                <w:sz w:val="20"/>
+                <w:szCs w:val="20"/>
+              </w:rPr>
+              <w:t>SQLAlchemy ORM utilisé exclusivement ; aucune requête SQL construite par concaténation de chaînes.</w:t>
             </w:r>
           </w:p>
         </w:tc>
@@ -9777,23 +8795,7 @@
                 <w:sz w:val="20"/>
                 <w:szCs w:val="20"/>
               </w:rPr>
-              <w:t xml:space="preserve">Collecte minimale des données (principe de minimisation) ; pas de géolocalisation précise stockée ; données </w:t>
-            </w:r>
-            <w:proofErr w:type="spellStart"/>
-            <w:r>
-              <w:rPr>
-                <w:sz w:val="20"/>
-                <w:szCs w:val="20"/>
-              </w:rPr>
-              <w:t>pseudonymisées</w:t>
-            </w:r>
-            <w:proofErr w:type="spellEnd"/>
-            <w:r>
-              <w:rPr>
-                <w:sz w:val="20"/>
-                <w:szCs w:val="20"/>
-              </w:rPr>
-              <w:t xml:space="preserve"> dans les logs.</w:t>
+              <w:t>Collecte minimale des données (principe de minimisation) ; pas de géolocalisation précise stockée ; données pseudonymisées dans les logs.</w:t>
             </w:r>
           </w:p>
         </w:tc>
@@ -9986,55 +8988,7 @@
                 <w:sz w:val="20"/>
                 <w:szCs w:val="20"/>
               </w:rPr>
-              <w:t>Les bibliothèques open-source utilisées (</w:t>
-            </w:r>
-            <w:proofErr w:type="spellStart"/>
-            <w:r>
-              <w:rPr>
-                <w:sz w:val="20"/>
-                <w:szCs w:val="20"/>
-              </w:rPr>
-              <w:t>FastAPI</w:t>
-            </w:r>
-            <w:proofErr w:type="spellEnd"/>
-            <w:r>
-              <w:rPr>
-                <w:sz w:val="20"/>
-                <w:szCs w:val="20"/>
-              </w:rPr>
-              <w:t xml:space="preserve">, </w:t>
-            </w:r>
-            <w:proofErr w:type="spellStart"/>
-            <w:r>
-              <w:rPr>
-                <w:sz w:val="20"/>
-                <w:szCs w:val="20"/>
-              </w:rPr>
-              <w:t>React</w:t>
-            </w:r>
-            <w:proofErr w:type="spellEnd"/>
-            <w:r>
-              <w:rPr>
-                <w:sz w:val="20"/>
-                <w:szCs w:val="20"/>
-              </w:rPr>
-              <w:t xml:space="preserve">, </w:t>
-            </w:r>
-            <w:proofErr w:type="spellStart"/>
-            <w:r>
-              <w:rPr>
-                <w:sz w:val="20"/>
-                <w:szCs w:val="20"/>
-              </w:rPr>
-              <w:t>SQLAlchemy</w:t>
-            </w:r>
-            <w:proofErr w:type="spellEnd"/>
-            <w:r>
-              <w:rPr>
-                <w:sz w:val="20"/>
-                <w:szCs w:val="20"/>
-              </w:rPr>
-              <w:t>, etc.) doivent être compatibles avec un usage académique.</w:t>
+              <w:t>Les bibliothèques open-source utilisées (FastAPI, React, SQLAlchemy, etc.) doivent être compatibles avec un usage académique.</w:t>
             </w:r>
           </w:p>
         </w:tc>
@@ -10330,23 +9284,7 @@
                 <w:sz w:val="20"/>
                 <w:szCs w:val="20"/>
               </w:rPr>
-              <w:t>PostgreSQL déployé en local (</w:t>
-            </w:r>
-            <w:proofErr w:type="gramStart"/>
-            <w:r>
-              <w:rPr>
-                <w:sz w:val="20"/>
-                <w:szCs w:val="20"/>
-              </w:rPr>
-              <w:t>localhost:</w:t>
-            </w:r>
-            <w:proofErr w:type="gramEnd"/>
-            <w:r>
-              <w:rPr>
-                <w:sz w:val="20"/>
-                <w:szCs w:val="20"/>
-              </w:rPr>
-              <w:t>5432) — configuration légère via un serveur local ; prototype exécutable sur machine personnelle avec les ressources disponibles</w:t>
+              <w:t>PostgreSQL déployé en local (localhost:5432) — configuration légère via un serveur local ; prototype exécutable sur machine personnelle avec les ressources disponibles</w:t>
             </w:r>
             <w:r>
               <w:rPr>
@@ -10458,21 +9396,12 @@
             </w:tcMar>
           </w:tcPr>
           <w:p>
-            <w:proofErr w:type="spellStart"/>
-            <w:r>
-              <w:rPr>
-                <w:sz w:val="20"/>
-                <w:szCs w:val="20"/>
-              </w:rPr>
-              <w:t>React</w:t>
-            </w:r>
-            <w:proofErr w:type="spellEnd"/>
-            <w:r>
-              <w:rPr>
-                <w:sz w:val="20"/>
-                <w:szCs w:val="20"/>
-              </w:rPr>
-              <w:t xml:space="preserve"> Native optimisé pour Android first ; éviter les animations </w:t>
+            <w:r>
+              <w:rPr>
+                <w:sz w:val="20"/>
+                <w:szCs w:val="20"/>
+              </w:rPr>
+              <w:t xml:space="preserve">React Native optimisé pour Android first ; éviter les animations </w:t>
             </w:r>
             <w:r>
               <w:rPr>
@@ -10591,23 +9520,7 @@
                 <w:sz w:val="20"/>
                 <w:szCs w:val="20"/>
               </w:rPr>
-              <w:t xml:space="preserve">README avec instructions d'installation complètes ; données synthétiques </w:t>
-            </w:r>
-            <w:proofErr w:type="spellStart"/>
-            <w:r>
-              <w:rPr>
-                <w:sz w:val="20"/>
-                <w:szCs w:val="20"/>
-              </w:rPr>
-              <w:t>pré-chargées</w:t>
-            </w:r>
-            <w:proofErr w:type="spellEnd"/>
-            <w:r>
-              <w:rPr>
-                <w:sz w:val="20"/>
-                <w:szCs w:val="20"/>
-              </w:rPr>
-              <w:t xml:space="preserve"> pour la démo.</w:t>
+              <w:t>README avec instructions d'installation complètes ; données synthétiques pré-chargées pour la démo.</w:t>
             </w:r>
           </w:p>
         </w:tc>
@@ -10948,21 +9861,12 @@
             </w:tcMar>
           </w:tcPr>
           <w:p>
-            <w:proofErr w:type="gramStart"/>
-            <w:r>
-              <w:rPr>
-                <w:sz w:val="20"/>
-                <w:szCs w:val="20"/>
-              </w:rPr>
-              <w:t>O(</w:t>
-            </w:r>
-            <w:proofErr w:type="gramEnd"/>
-            <w:r>
-              <w:rPr>
-                <w:sz w:val="20"/>
-                <w:szCs w:val="20"/>
-              </w:rPr>
-              <w:t>(V + E) log V)</w:t>
+            <w:r>
+              <w:rPr>
+                <w:sz w:val="20"/>
+                <w:szCs w:val="20"/>
+              </w:rPr>
+              <w:t>O((V + E) log V)</w:t>
             </w:r>
           </w:p>
         </w:tc>
@@ -11018,23 +9922,7 @@
                 <w:sz w:val="20"/>
                 <w:szCs w:val="20"/>
               </w:rPr>
-              <w:t>Top-k (Tas binaire / Min-</w:t>
-            </w:r>
-            <w:proofErr w:type="spellStart"/>
-            <w:r>
-              <w:rPr>
-                <w:sz w:val="20"/>
-                <w:szCs w:val="20"/>
-              </w:rPr>
-              <w:t>Heap</w:t>
-            </w:r>
-            <w:proofErr w:type="spellEnd"/>
-            <w:r>
-              <w:rPr>
-                <w:sz w:val="20"/>
-                <w:szCs w:val="20"/>
-              </w:rPr>
-              <w:t>)</w:t>
+              <w:t>Top-k (Tas binaire / Min-Heap)</w:t>
             </w:r>
           </w:p>
         </w:tc>
@@ -11110,21 +9998,12 @@
             </w:tcMar>
           </w:tcPr>
           <w:p>
-            <w:proofErr w:type="gramStart"/>
-            <w:r>
-              <w:rPr>
-                <w:sz w:val="20"/>
-                <w:szCs w:val="20"/>
-              </w:rPr>
-              <w:t>O(</w:t>
-            </w:r>
-            <w:proofErr w:type="gramEnd"/>
-            <w:r>
-              <w:rPr>
-                <w:sz w:val="20"/>
-                <w:szCs w:val="20"/>
-              </w:rPr>
-              <w:t>log k) par insertion</w:t>
+            <w:r>
+              <w:rPr>
+                <w:sz w:val="20"/>
+                <w:szCs w:val="20"/>
+              </w:rPr>
+              <w:t>O(log k) par insertion</w:t>
             </w:r>
           </w:p>
         </w:tc>
@@ -11151,23 +10030,7 @@
                 <w:sz w:val="20"/>
                 <w:szCs w:val="20"/>
               </w:rPr>
-              <w:t xml:space="preserve">Évite un tri complet </w:t>
-            </w:r>
-            <w:proofErr w:type="gramStart"/>
-            <w:r>
-              <w:rPr>
-                <w:sz w:val="20"/>
-                <w:szCs w:val="20"/>
-              </w:rPr>
-              <w:t>O(</w:t>
-            </w:r>
-            <w:proofErr w:type="gramEnd"/>
-            <w:r>
-              <w:rPr>
-                <w:sz w:val="20"/>
-                <w:szCs w:val="20"/>
-              </w:rPr>
-              <w:t>n log n) à chaque nouvelle donnée</w:t>
+              <w:t>Évite un tri complet O(n log n) à chaque nouvelle donnée</w:t>
             </w:r>
           </w:p>
         </w:tc>
@@ -11196,23 +10059,7 @@
                 <w:sz w:val="20"/>
                 <w:szCs w:val="20"/>
               </w:rPr>
-              <w:t xml:space="preserve">Fenwick </w:t>
-            </w:r>
-            <w:proofErr w:type="spellStart"/>
-            <w:r>
-              <w:rPr>
-                <w:sz w:val="20"/>
-                <w:szCs w:val="20"/>
-              </w:rPr>
-              <w:t>Tree</w:t>
-            </w:r>
-            <w:proofErr w:type="spellEnd"/>
-            <w:r>
-              <w:rPr>
-                <w:sz w:val="20"/>
-                <w:szCs w:val="20"/>
-              </w:rPr>
-              <w:t xml:space="preserve"> (BIT)</w:t>
+              <w:t>Fenwick Tree (BIT)</w:t>
             </w:r>
           </w:p>
         </w:tc>
@@ -11288,21 +10135,12 @@
             </w:tcMar>
           </w:tcPr>
           <w:p>
-            <w:proofErr w:type="gramStart"/>
-            <w:r>
-              <w:rPr>
-                <w:sz w:val="20"/>
-                <w:szCs w:val="20"/>
-              </w:rPr>
-              <w:t>O(</w:t>
-            </w:r>
-            <w:proofErr w:type="gramEnd"/>
-            <w:r>
-              <w:rPr>
-                <w:sz w:val="20"/>
-                <w:szCs w:val="20"/>
-              </w:rPr>
-              <w:t>log n) requête et mise à jour</w:t>
+            <w:r>
+              <w:rPr>
+                <w:sz w:val="20"/>
+                <w:szCs w:val="20"/>
+              </w:rPr>
+              <w:t>O(log n) requête et mise à jour</w:t>
             </w:r>
           </w:p>
         </w:tc>
@@ -11358,17 +10196,8 @@
                 <w:sz w:val="20"/>
                 <w:szCs w:val="20"/>
               </w:rPr>
-              <w:t>Rabin-</w:t>
-            </w:r>
-            <w:proofErr w:type="spellStart"/>
-            <w:r>
-              <w:rPr>
-                <w:sz w:val="20"/>
-                <w:szCs w:val="20"/>
-              </w:rPr>
-              <w:t>Karp</w:t>
-            </w:r>
-            <w:proofErr w:type="spellEnd"/>
+              <w:t>Rabin-Karp</w:t>
+            </w:r>
           </w:p>
         </w:tc>
         <w:tc>
@@ -11731,21 +10560,12 @@
             </w:tcMar>
           </w:tcPr>
           <w:p>
-            <w:proofErr w:type="gramStart"/>
-            <w:r>
-              <w:rPr>
-                <w:sz w:val="20"/>
-                <w:szCs w:val="20"/>
-              </w:rPr>
-              <w:t>O(</w:t>
-            </w:r>
-            <w:proofErr w:type="gramEnd"/>
-            <w:r>
-              <w:rPr>
-                <w:sz w:val="20"/>
-                <w:szCs w:val="20"/>
-              </w:rPr>
-              <w:t>V + E) espace</w:t>
+            <w:r>
+              <w:rPr>
+                <w:sz w:val="20"/>
+                <w:szCs w:val="20"/>
+              </w:rPr>
+              <w:t>O(V + E) espace</w:t>
             </w:r>
           </w:p>
         </w:tc>
@@ -11801,23 +10621,7 @@
                 <w:sz w:val="20"/>
                 <w:szCs w:val="20"/>
               </w:rPr>
-              <w:t>Tas binaire (Min-</w:t>
-            </w:r>
-            <w:proofErr w:type="spellStart"/>
-            <w:r>
-              <w:rPr>
-                <w:sz w:val="20"/>
-                <w:szCs w:val="20"/>
-              </w:rPr>
-              <w:t>Heap</w:t>
-            </w:r>
-            <w:proofErr w:type="spellEnd"/>
-            <w:r>
-              <w:rPr>
-                <w:sz w:val="20"/>
-                <w:szCs w:val="20"/>
-              </w:rPr>
-              <w:t>)</w:t>
+              <w:t>Tas binaire (Min-Heap)</w:t>
             </w:r>
           </w:p>
         </w:tc>
@@ -11866,21 +10670,12 @@
             </w:tcMar>
           </w:tcPr>
           <w:p>
-            <w:proofErr w:type="gramStart"/>
-            <w:r>
-              <w:rPr>
-                <w:sz w:val="20"/>
-                <w:szCs w:val="20"/>
-              </w:rPr>
-              <w:t>O(</w:t>
-            </w:r>
-            <w:proofErr w:type="gramEnd"/>
-            <w:r>
-              <w:rPr>
-                <w:sz w:val="20"/>
-                <w:szCs w:val="20"/>
-              </w:rPr>
-              <w:t>log n) insertion/extraction</w:t>
+            <w:r>
+              <w:rPr>
+                <w:sz w:val="20"/>
+                <w:szCs w:val="20"/>
+              </w:rPr>
+              <w:t>O(log n) insertion/extraction</w:t>
             </w:r>
           </w:p>
         </w:tc>
@@ -11907,23 +10702,7 @@
                 <w:sz w:val="20"/>
                 <w:szCs w:val="20"/>
               </w:rPr>
-              <w:t xml:space="preserve">Structure native pour les algorithmes de priorité ; </w:t>
-            </w:r>
-            <w:proofErr w:type="gramStart"/>
-            <w:r>
-              <w:rPr>
-                <w:sz w:val="20"/>
-                <w:szCs w:val="20"/>
-              </w:rPr>
-              <w:t>O(</w:t>
-            </w:r>
-            <w:proofErr w:type="gramEnd"/>
-            <w:r>
-              <w:rPr>
-                <w:sz w:val="20"/>
-                <w:szCs w:val="20"/>
-              </w:rPr>
-              <w:t>1) pour accéder au minimum</w:t>
+              <w:t>Structure native pour les algorithmes de priorité ; O(1) pour accéder au minimum</w:t>
             </w:r>
           </w:p>
         </w:tc>
@@ -11952,23 +10731,7 @@
                 <w:sz w:val="20"/>
                 <w:szCs w:val="20"/>
               </w:rPr>
-              <w:t xml:space="preserve">Fenwick </w:t>
-            </w:r>
-            <w:proofErr w:type="spellStart"/>
-            <w:r>
-              <w:rPr>
-                <w:sz w:val="20"/>
-                <w:szCs w:val="20"/>
-              </w:rPr>
-              <w:t>Tree</w:t>
-            </w:r>
-            <w:proofErr w:type="spellEnd"/>
-            <w:r>
-              <w:rPr>
-                <w:sz w:val="20"/>
-                <w:szCs w:val="20"/>
-              </w:rPr>
-              <w:t xml:space="preserve"> (BIT)</w:t>
+              <w:t>Fenwick Tree (BIT)</w:t>
             </w:r>
           </w:p>
         </w:tc>
@@ -12017,31 +10780,13 @@
             </w:tcMar>
           </w:tcPr>
           <w:p>
-            <w:proofErr w:type="gramStart"/>
-            <w:r>
-              <w:rPr>
-                <w:sz w:val="20"/>
-                <w:szCs w:val="20"/>
-              </w:rPr>
-              <w:t>O(</w:t>
-            </w:r>
-            <w:proofErr w:type="gramEnd"/>
-            <w:r>
-              <w:rPr>
-                <w:sz w:val="20"/>
-                <w:szCs w:val="20"/>
-              </w:rPr>
-              <w:t>log n) update/</w:t>
-            </w:r>
-            <w:proofErr w:type="spellStart"/>
-            <w:r>
-              <w:rPr>
-                <w:sz w:val="20"/>
-                <w:szCs w:val="20"/>
-              </w:rPr>
-              <w:t>query</w:t>
-            </w:r>
-            <w:proofErr w:type="spellEnd"/>
+            <w:r>
+              <w:rPr>
+                <w:sz w:val="20"/>
+                <w:szCs w:val="20"/>
+              </w:rPr>
+              <w:t>O(log n) update/query</w:t>
+            </w:r>
           </w:p>
         </w:tc>
         <w:tc>
@@ -12067,23 +10812,7 @@
                 <w:sz w:val="20"/>
                 <w:szCs w:val="20"/>
               </w:rPr>
-              <w:t xml:space="preserve">Optimal pour requêtes d'intervalle dynamiques vs O(n) </w:t>
-            </w:r>
-            <w:proofErr w:type="spellStart"/>
-            <w:r>
-              <w:rPr>
-                <w:sz w:val="20"/>
-                <w:szCs w:val="20"/>
-              </w:rPr>
-              <w:t>array</w:t>
-            </w:r>
-            <w:proofErr w:type="spellEnd"/>
-            <w:r>
-              <w:rPr>
-                <w:sz w:val="20"/>
-                <w:szCs w:val="20"/>
-              </w:rPr>
-              <w:t xml:space="preserve"> naïf</w:t>
+              <w:t>Optimal pour requêtes d'intervalle dynamiques vs O(n) array naïf</w:t>
             </w:r>
           </w:p>
         </w:tc>
@@ -12139,17 +10868,8 @@
                 <w:sz w:val="20"/>
                 <w:szCs w:val="20"/>
               </w:rPr>
-              <w:t>Stockage des métadonnées produits et cache des empreintes Rabin-</w:t>
-            </w:r>
-            <w:proofErr w:type="spellStart"/>
-            <w:r>
-              <w:rPr>
-                <w:sz w:val="20"/>
-                <w:szCs w:val="20"/>
-              </w:rPr>
-              <w:t>Karp</w:t>
-            </w:r>
-            <w:proofErr w:type="spellEnd"/>
+              <w:t>Stockage des métadonnées produits et cache des empreintes Rabin-Karp</w:t>
+            </w:r>
           </w:p>
         </w:tc>
         <w:tc>
@@ -12170,21 +10890,12 @@
             </w:tcMar>
           </w:tcPr>
           <w:p>
-            <w:proofErr w:type="gramStart"/>
-            <w:r>
-              <w:rPr>
-                <w:sz w:val="20"/>
-                <w:szCs w:val="20"/>
-              </w:rPr>
-              <w:t>O(</w:t>
-            </w:r>
-            <w:proofErr w:type="gramEnd"/>
-            <w:r>
-              <w:rPr>
-                <w:sz w:val="20"/>
-                <w:szCs w:val="20"/>
-              </w:rPr>
-              <w:t>1) amorti</w:t>
+            <w:r>
+              <w:rPr>
+                <w:sz w:val="20"/>
+                <w:szCs w:val="20"/>
+              </w:rPr>
+              <w:t>O(1) amorti</w:t>
             </w:r>
           </w:p>
         </w:tc>
@@ -12240,23 +10951,7 @@
                 <w:sz w:val="20"/>
                 <w:szCs w:val="20"/>
               </w:rPr>
-              <w:t>Union-</w:t>
-            </w:r>
-            <w:proofErr w:type="spellStart"/>
-            <w:r>
-              <w:rPr>
-                <w:sz w:val="20"/>
-                <w:szCs w:val="20"/>
-              </w:rPr>
-              <w:t>Find</w:t>
-            </w:r>
-            <w:proofErr w:type="spellEnd"/>
-            <w:r>
-              <w:rPr>
-                <w:sz w:val="20"/>
-                <w:szCs w:val="20"/>
-              </w:rPr>
-              <w:t xml:space="preserve"> (DSU)</w:t>
+              <w:t>Union-Find (DSU)</w:t>
             </w:r>
           </w:p>
         </w:tc>
@@ -12375,15 +11070,7 @@
         <w:spacing w:after="140"/>
       </w:pPr>
       <w:r>
-        <w:t xml:space="preserve">Le modèle COCOMO (Constructive </w:t>
-      </w:r>
-      <w:proofErr w:type="spellStart"/>
-      <w:r>
-        <w:t>Cost</w:t>
-      </w:r>
-      <w:proofErr w:type="spellEnd"/>
-      <w:r>
-        <w:t xml:space="preserve"> Model) est une méthode d'estimation de l'effort de développement logiciel basée sur le nombre de lignes de code source (KLOC — milliers de lignes de code). Pour un projet académique individuel de type « organique » (petite équipe, domaine bien maîtrisé), les formules de base sont :</w:t>
+        <w:t>Le modèle COCOMO (Constructive Cost Model) est une méthode d'estimation de l'effort de développement logiciel basée sur le nombre de lignes de code source (KLOC — milliers de lignes de code). Pour un projet académique individuel de type « organique » (petite équipe, domaine bien maîtrisé), les formules de base sont :</w:t>
       </w:r>
     </w:p>
     <w:p>
@@ -12397,25 +11084,7 @@
           <w:bCs/>
           <w:color w:val="2E4D8A"/>
         </w:rPr>
-        <w:t>Effort (E) = 2.4 × (KLOC)^1.</w:t>
-      </w:r>
-      <w:proofErr w:type="gramStart"/>
-      <w:r>
-        <w:rPr>
-          <w:b/>
-          <w:bCs/>
-          <w:color w:val="2E4D8A"/>
-        </w:rPr>
-        <w:t>05  [</w:t>
-      </w:r>
-      <w:proofErr w:type="gramEnd"/>
-      <w:r>
-        <w:rPr>
-          <w:b/>
-          <w:bCs/>
-          <w:color w:val="2E4D8A"/>
-        </w:rPr>
-        <w:t>en personnes-mois]</w:t>
+        <w:t>Effort (E) = 2.4 × (KLOC)^1.05  [en personnes-mois]</w:t>
       </w:r>
     </w:p>
     <w:p>
@@ -12429,25 +11098,7 @@
           <w:bCs/>
           <w:color w:val="2E4D8A"/>
         </w:rPr>
-        <w:t>Durée (D) = 2.5 × E^0.</w:t>
-      </w:r>
-      <w:proofErr w:type="gramStart"/>
-      <w:r>
-        <w:rPr>
-          <w:b/>
-          <w:bCs/>
-          <w:color w:val="2E4D8A"/>
-        </w:rPr>
-        <w:t>38  [</w:t>
-      </w:r>
-      <w:proofErr w:type="gramEnd"/>
-      <w:r>
-        <w:rPr>
-          <w:b/>
-          <w:bCs/>
-          <w:color w:val="2E4D8A"/>
-        </w:rPr>
-        <w:t>en mois]</w:t>
+        <w:t>Durée (D) = 2.5 × E^0.38  [en mois]</w:t>
       </w:r>
     </w:p>
     <w:p>
@@ -12628,39 +11279,7 @@
                 <w:sz w:val="20"/>
                 <w:szCs w:val="20"/>
               </w:rPr>
-              <w:t xml:space="preserve">Fenwick </w:t>
-            </w:r>
-            <w:proofErr w:type="spellStart"/>
-            <w:r>
-              <w:rPr>
-                <w:sz w:val="20"/>
-                <w:szCs w:val="20"/>
-              </w:rPr>
-              <w:t>Tree</w:t>
-            </w:r>
-            <w:proofErr w:type="spellEnd"/>
-            <w:r>
-              <w:rPr>
-                <w:sz w:val="20"/>
-                <w:szCs w:val="20"/>
-              </w:rPr>
-              <w:t>, Top-k, Dijkstra, Rabin-</w:t>
-            </w:r>
-            <w:proofErr w:type="spellStart"/>
-            <w:r>
-              <w:rPr>
-                <w:sz w:val="20"/>
-                <w:szCs w:val="20"/>
-              </w:rPr>
-              <w:t>Karp</w:t>
-            </w:r>
-            <w:proofErr w:type="spellEnd"/>
-            <w:r>
-              <w:rPr>
-                <w:sz w:val="20"/>
-                <w:szCs w:val="20"/>
-              </w:rPr>
-              <w:t xml:space="preserve"> + tests unitaires</w:t>
+              <w:t>Fenwick Tree, Top-k, Dijkstra, Rabin-Karp + tests unitaires</w:t>
             </w:r>
           </w:p>
         </w:tc>
@@ -12716,17 +11335,8 @@
                 <w:sz w:val="20"/>
                 <w:szCs w:val="20"/>
               </w:rPr>
-              <w:t xml:space="preserve">Backend </w:t>
-            </w:r>
-            <w:proofErr w:type="spellStart"/>
-            <w:r>
-              <w:rPr>
-                <w:sz w:val="20"/>
-                <w:szCs w:val="20"/>
-              </w:rPr>
-              <w:t>FastAPI</w:t>
-            </w:r>
-            <w:proofErr w:type="spellEnd"/>
+              <w:t>Backend FastAPI</w:t>
+            </w:r>
           </w:p>
         </w:tc>
         <w:tc>
@@ -12752,23 +11362,7 @@
                 <w:sz w:val="20"/>
                 <w:szCs w:val="20"/>
               </w:rPr>
-              <w:t xml:space="preserve">Routes, </w:t>
-            </w:r>
-            <w:proofErr w:type="spellStart"/>
-            <w:r>
-              <w:rPr>
-                <w:sz w:val="20"/>
-                <w:szCs w:val="20"/>
-              </w:rPr>
-              <w:t>controllers</w:t>
-            </w:r>
-            <w:proofErr w:type="spellEnd"/>
-            <w:r>
-              <w:rPr>
-                <w:sz w:val="20"/>
-                <w:szCs w:val="20"/>
-              </w:rPr>
-              <w:t>, services, repositories, config</w:t>
+              <w:t>Routes, controllers, services, repositories, config</w:t>
             </w:r>
           </w:p>
         </w:tc>
@@ -12851,39 +11445,7 @@
                 <w:sz w:val="20"/>
                 <w:szCs w:val="20"/>
               </w:rPr>
-              <w:t xml:space="preserve">Schéma PostgreSQL, migrations </w:t>
-            </w:r>
-            <w:proofErr w:type="spellStart"/>
-            <w:r>
-              <w:rPr>
-                <w:sz w:val="20"/>
-                <w:szCs w:val="20"/>
-              </w:rPr>
-              <w:t>SQLAlchemy</w:t>
-            </w:r>
-            <w:proofErr w:type="spellEnd"/>
-            <w:r>
-              <w:rPr>
-                <w:sz w:val="20"/>
-                <w:szCs w:val="20"/>
-              </w:rPr>
-              <w:t xml:space="preserve">, </w:t>
-            </w:r>
-            <w:proofErr w:type="spellStart"/>
-            <w:r>
-              <w:rPr>
-                <w:sz w:val="20"/>
-                <w:szCs w:val="20"/>
-              </w:rPr>
-              <w:t>seed</w:t>
-            </w:r>
-            <w:proofErr w:type="spellEnd"/>
-            <w:r>
-              <w:rPr>
-                <w:sz w:val="20"/>
-                <w:szCs w:val="20"/>
-              </w:rPr>
-              <w:t xml:space="preserve"> data — 0.4 KLOC</w:t>
+              <w:t>Schéma PostgreSQL, migrations SQLAlchemy, seed data — 0.4 KLOC</w:t>
             </w:r>
           </w:p>
         </w:tc>
@@ -13022,23 +11584,7 @@
                 <w:sz w:val="20"/>
                 <w:szCs w:val="20"/>
               </w:rPr>
-              <w:t xml:space="preserve">Application </w:t>
-            </w:r>
-            <w:proofErr w:type="spellStart"/>
-            <w:r>
-              <w:rPr>
-                <w:sz w:val="20"/>
-                <w:szCs w:val="20"/>
-              </w:rPr>
-              <w:t>React</w:t>
-            </w:r>
-            <w:proofErr w:type="spellEnd"/>
-            <w:r>
-              <w:rPr>
-                <w:sz w:val="20"/>
-                <w:szCs w:val="20"/>
-              </w:rPr>
-              <w:t xml:space="preserve"> Native</w:t>
+              <w:t>Application React Native</w:t>
             </w:r>
           </w:p>
         </w:tc>
@@ -13065,23 +11611,7 @@
                 <w:sz w:val="20"/>
                 <w:szCs w:val="20"/>
               </w:rPr>
-              <w:t xml:space="preserve">Écrans mobile, navigation, </w:t>
-            </w:r>
-            <w:proofErr w:type="spellStart"/>
-            <w:r>
-              <w:rPr>
-                <w:sz w:val="20"/>
-                <w:szCs w:val="20"/>
-              </w:rPr>
-              <w:t>sync</w:t>
-            </w:r>
-            <w:proofErr w:type="spellEnd"/>
-            <w:r>
-              <w:rPr>
-                <w:sz w:val="20"/>
-                <w:szCs w:val="20"/>
-              </w:rPr>
-              <w:t xml:space="preserve"> offline</w:t>
+              <w:t>Écrans mobile, navigation, sync offline</w:t>
             </w:r>
           </w:p>
         </w:tc>
@@ -13533,23 +12063,7 @@
                 <w:sz w:val="20"/>
                 <w:szCs w:val="20"/>
               </w:rPr>
-              <w:t>2.4 × (</w:t>
-            </w:r>
-            <w:proofErr w:type="gramStart"/>
-            <w:r>
-              <w:rPr>
-                <w:sz w:val="20"/>
-                <w:szCs w:val="20"/>
-              </w:rPr>
-              <w:t>6.5)^</w:t>
-            </w:r>
-            <w:proofErr w:type="gramEnd"/>
-            <w:r>
-              <w:rPr>
-                <w:sz w:val="20"/>
-                <w:szCs w:val="20"/>
-              </w:rPr>
-              <w:t>1.05</w:t>
+              <w:t>2.4 × (6.5)^1.05</w:t>
             </w:r>
           </w:p>
         </w:tc>
@@ -13632,23 +12146,7 @@
                 <w:sz w:val="20"/>
                 <w:szCs w:val="20"/>
               </w:rPr>
-              <w:t>2.5 × (</w:t>
-            </w:r>
-            <w:proofErr w:type="gramStart"/>
-            <w:r>
-              <w:rPr>
-                <w:sz w:val="20"/>
-                <w:szCs w:val="20"/>
-              </w:rPr>
-              <w:t>17.2)^</w:t>
-            </w:r>
-            <w:proofErr w:type="gramEnd"/>
-            <w:r>
-              <w:rPr>
-                <w:sz w:val="20"/>
-                <w:szCs w:val="20"/>
-              </w:rPr>
-              <w:t>0.38</w:t>
+              <w:t>2.5 × (17.2)^0.38</w:t>
             </w:r>
           </w:p>
         </w:tc>
@@ -13867,25 +12365,7 @@
           <w:iCs/>
           <w:color w:val="555555"/>
         </w:rPr>
-        <w:t xml:space="preserve">Note : Le COCOMO confirme que 12 semaines est un délai serré mais réaliste pour un prototype fonctionnel. La priorité </w:t>
-      </w:r>
-      <w:proofErr w:type="spellStart"/>
-      <w:r>
-        <w:rPr>
-          <w:i/>
-          <w:iCs/>
-          <w:color w:val="555555"/>
-        </w:rPr>
-        <w:t>MoSCoW</w:t>
-      </w:r>
-      <w:proofErr w:type="spellEnd"/>
-      <w:r>
-        <w:rPr>
-          <w:i/>
-          <w:iCs/>
-          <w:color w:val="555555"/>
-        </w:rPr>
-        <w:t xml:space="preserve"> garantit que les livrables essentiels (Must Have) sont livrés en premier.</w:t>
+        <w:t>Note : Le COCOMO confirme que 12 semaines est un délai serré mais réaliste pour un prototype fonctionnel. La priorité MoSCoW garantit que les livrables essentiels (Must Have) sont livrés en premier.</w:t>
       </w:r>
     </w:p>
     <w:p>
@@ -15229,17 +13709,8 @@
                 <w:sz w:val="18"/>
                 <w:szCs w:val="18"/>
               </w:rPr>
-              <w:t xml:space="preserve">Fenwick </w:t>
-            </w:r>
-            <w:proofErr w:type="spellStart"/>
-            <w:r>
-              <w:rPr>
-                <w:sz w:val="18"/>
-                <w:szCs w:val="18"/>
-              </w:rPr>
-              <w:t>Tree</w:t>
-            </w:r>
-            <w:proofErr w:type="spellEnd"/>
+              <w:t>Fenwick Tree</w:t>
+            </w:r>
           </w:p>
         </w:tc>
         <w:tc>
@@ -16063,17 +14534,8 @@
                 <w:sz w:val="18"/>
                 <w:szCs w:val="18"/>
               </w:rPr>
-              <w:t>Rabin-</w:t>
-            </w:r>
-            <w:proofErr w:type="spellStart"/>
-            <w:r>
-              <w:rPr>
-                <w:sz w:val="18"/>
-                <w:szCs w:val="18"/>
-              </w:rPr>
-              <w:t>Karp</w:t>
-            </w:r>
-            <w:proofErr w:type="spellEnd"/>
+              <w:t>Rabin-Karp</w:t>
+            </w:r>
           </w:p>
         </w:tc>
         <w:tc>
@@ -16622,17 +15084,8 @@
                 <w:sz w:val="18"/>
                 <w:szCs w:val="18"/>
               </w:rPr>
-              <w:t xml:space="preserve">Backend </w:t>
-            </w:r>
-            <w:proofErr w:type="spellStart"/>
-            <w:r>
-              <w:rPr>
-                <w:sz w:val="18"/>
-                <w:szCs w:val="18"/>
-              </w:rPr>
-              <w:t>FastAPI</w:t>
-            </w:r>
-            <w:proofErr w:type="spellEnd"/>
+              <w:t>Backend FastAPI</w:t>
+            </w:r>
           </w:p>
         </w:tc>
         <w:tc>
@@ -16915,23 +15368,7 @@
                 <w:sz w:val="18"/>
                 <w:szCs w:val="18"/>
               </w:rPr>
-              <w:t xml:space="preserve">Frontend </w:t>
-            </w:r>
-            <w:proofErr w:type="spellStart"/>
-            <w:r>
-              <w:rPr>
-                <w:sz w:val="18"/>
-                <w:szCs w:val="18"/>
-              </w:rPr>
-              <w:t>React</w:t>
-            </w:r>
-            <w:proofErr w:type="spellEnd"/>
-            <w:r>
-              <w:rPr>
-                <w:sz w:val="18"/>
-                <w:szCs w:val="18"/>
-              </w:rPr>
-              <w:t>/RN</w:t>
+              <w:t>Frontend React/RN</w:t>
             </w:r>
           </w:p>
         </w:tc>
@@ -17952,23 +16389,7 @@
                 <w:sz w:val="20"/>
                 <w:szCs w:val="20"/>
               </w:rPr>
-              <w:t xml:space="preserve">Complexité algorithmique sous-estimée (Dijkstra, Fenwick </w:t>
-            </w:r>
-            <w:proofErr w:type="spellStart"/>
-            <w:r>
-              <w:rPr>
-                <w:sz w:val="20"/>
-                <w:szCs w:val="20"/>
-              </w:rPr>
-              <w:t>Tree</w:t>
-            </w:r>
-            <w:proofErr w:type="spellEnd"/>
-            <w:r>
-              <w:rPr>
-                <w:sz w:val="20"/>
-                <w:szCs w:val="20"/>
-              </w:rPr>
-              <w:t>)</w:t>
+              <w:t>Complexité algorithmique sous-estimée (Dijkstra, Fenwick Tree)</w:t>
             </w:r>
           </w:p>
         </w:tc>
@@ -18105,23 +16526,7 @@
                 <w:sz w:val="20"/>
                 <w:szCs w:val="20"/>
               </w:rPr>
-              <w:t>Manque de temps pour le frontend mobile (</w:t>
-            </w:r>
-            <w:proofErr w:type="spellStart"/>
-            <w:r>
-              <w:rPr>
-                <w:sz w:val="20"/>
-                <w:szCs w:val="20"/>
-              </w:rPr>
-              <w:t>React</w:t>
-            </w:r>
-            <w:proofErr w:type="spellEnd"/>
-            <w:r>
-              <w:rPr>
-                <w:sz w:val="20"/>
-                <w:szCs w:val="20"/>
-              </w:rPr>
-              <w:t xml:space="preserve"> Native)</w:t>
+              <w:t>Manque de temps pour le frontend mobile (React Native)</w:t>
             </w:r>
           </w:p>
         </w:tc>
@@ -18229,23 +16634,7 @@
                 <w:sz w:val="20"/>
                 <w:szCs w:val="20"/>
               </w:rPr>
-              <w:t xml:space="preserve">Prioriser </w:t>
-            </w:r>
-            <w:proofErr w:type="spellStart"/>
-            <w:r>
-              <w:rPr>
-                <w:sz w:val="20"/>
-                <w:szCs w:val="20"/>
-              </w:rPr>
-              <w:t>MoSCoW</w:t>
-            </w:r>
-            <w:proofErr w:type="spellEnd"/>
-            <w:r>
-              <w:rPr>
-                <w:sz w:val="20"/>
-                <w:szCs w:val="20"/>
-              </w:rPr>
-              <w:t xml:space="preserve"> : interface web d'abord, mobile en semaine 10-12 si le temps le permet</w:t>
+              <w:t>Prioriser MoSCoW : interface web d'abord, mobile en semaine 10-12 si le temps le permet</w:t>
             </w:r>
           </w:p>
         </w:tc>
@@ -18411,23 +16800,7 @@
                 <w:sz w:val="20"/>
                 <w:szCs w:val="20"/>
               </w:rPr>
-              <w:t xml:space="preserve">Problèmes de compatibilité </w:t>
-            </w:r>
-            <w:proofErr w:type="spellStart"/>
-            <w:r>
-              <w:rPr>
-                <w:sz w:val="20"/>
-                <w:szCs w:val="20"/>
-              </w:rPr>
-              <w:t>SQLAlchemy</w:t>
-            </w:r>
-            <w:proofErr w:type="spellEnd"/>
-            <w:r>
-              <w:rPr>
-                <w:sz w:val="20"/>
-                <w:szCs w:val="20"/>
-              </w:rPr>
-              <w:t xml:space="preserve"> +</w:t>
+              <w:t>Problèmes de compatibilité SQLAlchemy +</w:t>
             </w:r>
             <w:r>
               <w:rPr>
@@ -18550,23 +16923,7 @@
                 <w:sz w:val="20"/>
                 <w:szCs w:val="20"/>
               </w:rPr>
-              <w:t xml:space="preserve">Tester la connexion dès la mise en place ; </w:t>
-            </w:r>
-            <w:proofErr w:type="spellStart"/>
-            <w:r>
-              <w:rPr>
-                <w:sz w:val="20"/>
-                <w:szCs w:val="20"/>
-              </w:rPr>
-              <w:t>SQLAlchemy</w:t>
-            </w:r>
-            <w:proofErr w:type="spellEnd"/>
-            <w:r>
-              <w:rPr>
-                <w:sz w:val="20"/>
-                <w:szCs w:val="20"/>
-              </w:rPr>
-              <w:t xml:space="preserve"> est bien documenté pour PostgreSQL, vérifier que le serveur PostgreSQL est bien lancé en local avant chaque session de développement</w:t>
+              <w:t>Tester la connexion dès la mise en place ; SQLAlchemy est bien documenté pour PostgreSQL, vérifier que le serveur PostgreSQL est bien lancé en local avant chaque session de développement</w:t>
             </w:r>
           </w:p>
         </w:tc>
@@ -18703,23 +17060,7 @@
                 <w:sz w:val="20"/>
                 <w:szCs w:val="20"/>
               </w:rPr>
-              <w:t xml:space="preserve">Préparer une version de démo figée (données </w:t>
-            </w:r>
-            <w:proofErr w:type="spellStart"/>
-            <w:r>
-              <w:rPr>
-                <w:sz w:val="20"/>
-                <w:szCs w:val="20"/>
-              </w:rPr>
-              <w:t>pré-chargées</w:t>
-            </w:r>
-            <w:proofErr w:type="spellEnd"/>
-            <w:r>
-              <w:rPr>
-                <w:sz w:val="20"/>
-                <w:szCs w:val="20"/>
-              </w:rPr>
-              <w:t>) en plus du prototype live</w:t>
+              <w:t>Préparer une version de démo figée (données pré-chargées) en plus du prototype live</w:t>
             </w:r>
           </w:p>
         </w:tc>
@@ -19156,23 +17497,7 @@
                 <w:sz w:val="20"/>
                 <w:szCs w:val="20"/>
               </w:rPr>
-              <w:t xml:space="preserve">Fenwick </w:t>
-            </w:r>
-            <w:proofErr w:type="spellStart"/>
-            <w:r>
-              <w:rPr>
-                <w:sz w:val="20"/>
-                <w:szCs w:val="20"/>
-              </w:rPr>
-              <w:t>Tree</w:t>
-            </w:r>
-            <w:proofErr w:type="spellEnd"/>
-            <w:r>
-              <w:rPr>
-                <w:sz w:val="20"/>
-                <w:szCs w:val="20"/>
-              </w:rPr>
-              <w:t xml:space="preserve"> (BIT)</w:t>
+              <w:t>Fenwick Tree (BIT)</w:t>
             </w:r>
           </w:p>
         </w:tc>
@@ -19199,71 +17524,7 @@
                 <w:sz w:val="20"/>
                 <w:szCs w:val="20"/>
               </w:rPr>
-              <w:t xml:space="preserve">Structure de données permettant des mises à jour et des requêtes de sommes préfixes en </w:t>
-            </w:r>
-            <w:proofErr w:type="gramStart"/>
-            <w:r>
-              <w:rPr>
-                <w:sz w:val="20"/>
-                <w:szCs w:val="20"/>
-              </w:rPr>
-              <w:t>O(</w:t>
-            </w:r>
-            <w:proofErr w:type="gramEnd"/>
-            <w:r>
-              <w:rPr>
-                <w:sz w:val="20"/>
-                <w:szCs w:val="20"/>
-              </w:rPr>
-              <w:t xml:space="preserve">log n). Aussi appelée </w:t>
-            </w:r>
-            <w:proofErr w:type="spellStart"/>
-            <w:r>
-              <w:rPr>
-                <w:sz w:val="20"/>
-                <w:szCs w:val="20"/>
-              </w:rPr>
-              <w:t>Binary</w:t>
-            </w:r>
-            <w:proofErr w:type="spellEnd"/>
-            <w:r>
-              <w:rPr>
-                <w:sz w:val="20"/>
-                <w:szCs w:val="20"/>
-              </w:rPr>
-              <w:t xml:space="preserve"> </w:t>
-            </w:r>
-            <w:proofErr w:type="spellStart"/>
-            <w:r>
-              <w:rPr>
-                <w:sz w:val="20"/>
-                <w:szCs w:val="20"/>
-              </w:rPr>
-              <w:t>Indexed</w:t>
-            </w:r>
-            <w:proofErr w:type="spellEnd"/>
-            <w:r>
-              <w:rPr>
-                <w:sz w:val="20"/>
-                <w:szCs w:val="20"/>
-              </w:rPr>
-              <w:t xml:space="preserve"> </w:t>
-            </w:r>
-            <w:proofErr w:type="spellStart"/>
-            <w:r>
-              <w:rPr>
-                <w:sz w:val="20"/>
-                <w:szCs w:val="20"/>
-              </w:rPr>
-              <w:t>Tree</w:t>
-            </w:r>
-            <w:proofErr w:type="spellEnd"/>
-            <w:r>
-              <w:rPr>
-                <w:sz w:val="20"/>
-                <w:szCs w:val="20"/>
-              </w:rPr>
-              <w:t>.</w:t>
+              <w:t>Structure de données permettant des mises à jour et des requêtes de sommes préfixes en O(log n). Aussi appelée Binary Indexed Tree.</w:t>
             </w:r>
           </w:p>
         </w:tc>
@@ -19287,7 +17548,6 @@
             </w:tcMar>
           </w:tcPr>
           <w:p>
-            <w:proofErr w:type="spellStart"/>
             <w:r>
               <w:rPr>
                 <w:sz w:val="20"/>
@@ -19295,7 +17555,6 @@
               </w:rPr>
               <w:t>FastAPI</w:t>
             </w:r>
-            <w:proofErr w:type="spellEnd"/>
           </w:p>
         </w:tc>
         <w:tc>
@@ -19321,23 +17580,7 @@
                 <w:sz w:val="20"/>
                 <w:szCs w:val="20"/>
               </w:rPr>
-              <w:t>Framework Python moderne pour créer des API REST avec documentation automatique (</w:t>
-            </w:r>
-            <w:proofErr w:type="spellStart"/>
-            <w:r>
-              <w:rPr>
-                <w:sz w:val="20"/>
-                <w:szCs w:val="20"/>
-              </w:rPr>
-              <w:t>Swagger</w:t>
-            </w:r>
-            <w:proofErr w:type="spellEnd"/>
-            <w:r>
-              <w:rPr>
-                <w:sz w:val="20"/>
-                <w:szCs w:val="20"/>
-              </w:rPr>
-              <w:t xml:space="preserve"> UI) et typage fort.</w:t>
+              <w:t>Framework Python moderne pour créer des API REST avec documentation automatique (Swagger UI) et typage fort.</w:t>
             </w:r>
           </w:p>
         </w:tc>
@@ -19417,7 +17660,6 @@
             </w:tcMar>
           </w:tcPr>
           <w:p>
-            <w:proofErr w:type="spellStart"/>
             <w:r>
               <w:rPr>
                 <w:sz w:val="20"/>
@@ -19425,7 +17667,6 @@
               </w:rPr>
               <w:t>MoSCoW</w:t>
             </w:r>
-            <w:proofErr w:type="spellEnd"/>
           </w:p>
         </w:tc>
         <w:tc>
@@ -19451,55 +17692,7 @@
                 <w:sz w:val="20"/>
                 <w:szCs w:val="20"/>
               </w:rPr>
-              <w:t xml:space="preserve">Méthode de priorisation des besoins en quatre catégories : Must Have, </w:t>
-            </w:r>
-            <w:proofErr w:type="spellStart"/>
-            <w:r>
-              <w:rPr>
-                <w:sz w:val="20"/>
-                <w:szCs w:val="20"/>
-              </w:rPr>
-              <w:t>Should</w:t>
-            </w:r>
-            <w:proofErr w:type="spellEnd"/>
-            <w:r>
-              <w:rPr>
-                <w:sz w:val="20"/>
-                <w:szCs w:val="20"/>
-              </w:rPr>
-              <w:t xml:space="preserve"> Have, </w:t>
-            </w:r>
-            <w:proofErr w:type="spellStart"/>
-            <w:r>
-              <w:rPr>
-                <w:sz w:val="20"/>
-                <w:szCs w:val="20"/>
-              </w:rPr>
-              <w:t>Could</w:t>
-            </w:r>
-            <w:proofErr w:type="spellEnd"/>
-            <w:r>
-              <w:rPr>
-                <w:sz w:val="20"/>
-                <w:szCs w:val="20"/>
-              </w:rPr>
-              <w:t xml:space="preserve"> Have, </w:t>
-            </w:r>
-            <w:proofErr w:type="spellStart"/>
-            <w:r>
-              <w:rPr>
-                <w:sz w:val="20"/>
-                <w:szCs w:val="20"/>
-              </w:rPr>
-              <w:t>Won't</w:t>
-            </w:r>
-            <w:proofErr w:type="spellEnd"/>
-            <w:r>
-              <w:rPr>
-                <w:sz w:val="20"/>
-                <w:szCs w:val="20"/>
-              </w:rPr>
-              <w:t xml:space="preserve"> Have.</w:t>
+              <w:t>Méthode de priorisation des besoins en quatre catégories : Must Have, Should Have, Could Have, Won't Have.</w:t>
             </w:r>
           </w:p>
         </w:tc>
@@ -19528,17 +17721,8 @@
                 <w:sz w:val="20"/>
                 <w:szCs w:val="20"/>
               </w:rPr>
-              <w:t>Rabin-</w:t>
-            </w:r>
-            <w:proofErr w:type="spellStart"/>
-            <w:r>
-              <w:rPr>
-                <w:sz w:val="20"/>
-                <w:szCs w:val="20"/>
-              </w:rPr>
-              <w:t>Karp</w:t>
-            </w:r>
-            <w:proofErr w:type="spellEnd"/>
+              <w:t>Rabin-Karp</w:t>
+            </w:r>
           </w:p>
         </w:tc>
         <w:tc>
@@ -19588,21 +17772,12 @@
             </w:tcMar>
           </w:tcPr>
           <w:p>
-            <w:proofErr w:type="spellStart"/>
-            <w:r>
-              <w:rPr>
-                <w:sz w:val="20"/>
-                <w:szCs w:val="20"/>
-              </w:rPr>
-              <w:t>React</w:t>
-            </w:r>
-            <w:proofErr w:type="spellEnd"/>
-            <w:r>
-              <w:rPr>
-                <w:sz w:val="20"/>
-                <w:szCs w:val="20"/>
-              </w:rPr>
-              <w:t xml:space="preserve"> Native</w:t>
+            <w:r>
+              <w:rPr>
+                <w:sz w:val="20"/>
+                <w:szCs w:val="20"/>
+              </w:rPr>
+              <w:t>React Native</w:t>
             </w:r>
           </w:p>
         </w:tc>
@@ -19653,7 +17828,6 @@
             </w:tcMar>
           </w:tcPr>
           <w:p>
-            <w:proofErr w:type="spellStart"/>
             <w:r>
               <w:rPr>
                 <w:sz w:val="20"/>
@@ -19661,7 +17835,6 @@
               </w:rPr>
               <w:t>SQLAlchemy</w:t>
             </w:r>
-            <w:proofErr w:type="spellEnd"/>
           </w:p>
         </w:tc>
         <w:tc>
@@ -19687,23 +17860,7 @@
                 <w:sz w:val="20"/>
                 <w:szCs w:val="20"/>
               </w:rPr>
-              <w:t>ORM (Object-</w:t>
-            </w:r>
-            <w:proofErr w:type="spellStart"/>
-            <w:r>
-              <w:rPr>
-                <w:sz w:val="20"/>
-                <w:szCs w:val="20"/>
-              </w:rPr>
-              <w:t>Relational</w:t>
-            </w:r>
-            <w:proofErr w:type="spellEnd"/>
-            <w:r>
-              <w:rPr>
-                <w:sz w:val="20"/>
-                <w:szCs w:val="20"/>
-              </w:rPr>
-              <w:t xml:space="preserve"> Mapper) Python qui permet de manipuler une base de données en écrivant du code Python plutôt que du SQL brut.</w:t>
+              <w:t>ORM (Object-Relational Mapper) Python qui permet de manipuler une base de données en écrivant du code Python plutôt que du SQL brut.</w:t>
             </w:r>
           </w:p>
         </w:tc>
@@ -19727,21 +17884,12 @@
             </w:tcMar>
           </w:tcPr>
           <w:p>
-            <w:proofErr w:type="spellStart"/>
-            <w:r>
-              <w:rPr>
-                <w:sz w:val="20"/>
-                <w:szCs w:val="20"/>
-              </w:rPr>
-              <w:t>Swagger</w:t>
-            </w:r>
-            <w:proofErr w:type="spellEnd"/>
-            <w:r>
-              <w:rPr>
-                <w:sz w:val="20"/>
-                <w:szCs w:val="20"/>
-              </w:rPr>
-              <w:t xml:space="preserve"> UI</w:t>
+            <w:r>
+              <w:rPr>
+                <w:sz w:val="20"/>
+                <w:szCs w:val="20"/>
+              </w:rPr>
+              <w:t>Swagger UI</w:t>
             </w:r>
           </w:p>
         </w:tc>
@@ -19768,39 +17916,7 @@
                 <w:sz w:val="20"/>
                 <w:szCs w:val="20"/>
               </w:rPr>
-              <w:t xml:space="preserve">Interface web auto-générée par </w:t>
-            </w:r>
-            <w:proofErr w:type="spellStart"/>
-            <w:r>
-              <w:rPr>
-                <w:sz w:val="20"/>
-                <w:szCs w:val="20"/>
-              </w:rPr>
-              <w:t>FastAPI</w:t>
-            </w:r>
-            <w:proofErr w:type="spellEnd"/>
-            <w:r>
-              <w:rPr>
-                <w:sz w:val="20"/>
-                <w:szCs w:val="20"/>
-              </w:rPr>
-              <w:t xml:space="preserve"> permettant de tester tous les </w:t>
-            </w:r>
-            <w:proofErr w:type="spellStart"/>
-            <w:r>
-              <w:rPr>
-                <w:sz w:val="20"/>
-                <w:szCs w:val="20"/>
-              </w:rPr>
-              <w:t>endpoints</w:t>
-            </w:r>
-            <w:proofErr w:type="spellEnd"/>
-            <w:r>
-              <w:rPr>
-                <w:sz w:val="20"/>
-                <w:szCs w:val="20"/>
-              </w:rPr>
-              <w:t xml:space="preserve"> de l'API directement dans le navigateur.</w:t>
+              <w:t>Interface web auto-générée par FastAPI permettant de tester tous les endpoints de l'API directement dans le navigateur.</w:t>
             </w:r>
           </w:p>
         </w:tc>
@@ -19829,23 +17945,7 @@
                 <w:sz w:val="20"/>
                 <w:szCs w:val="20"/>
               </w:rPr>
-              <w:t>Tas binaire (Min-</w:t>
-            </w:r>
-            <w:proofErr w:type="spellStart"/>
-            <w:r>
-              <w:rPr>
-                <w:sz w:val="20"/>
-                <w:szCs w:val="20"/>
-              </w:rPr>
-              <w:t>Heap</w:t>
-            </w:r>
-            <w:proofErr w:type="spellEnd"/>
-            <w:r>
-              <w:rPr>
-                <w:sz w:val="20"/>
-                <w:szCs w:val="20"/>
-              </w:rPr>
-              <w:t>)</w:t>
+              <w:t>Tas binaire (Min-Heap)</w:t>
             </w:r>
           </w:p>
         </w:tc>
@@ -19952,7 +18052,6 @@
             </w:tcMar>
           </w:tcPr>
           <w:p>
-            <w:proofErr w:type="spellStart"/>
             <w:r>
               <w:rPr>
                 <w:sz w:val="20"/>
@@ -19960,7 +18059,6 @@
               </w:rPr>
               <w:t>Tsenan'tsika</w:t>
             </w:r>
-            <w:proofErr w:type="spellEnd"/>
           </w:p>
         </w:tc>
         <w:tc>
@@ -20015,23 +18113,7 @@
                 <w:sz w:val="20"/>
                 <w:szCs w:val="20"/>
               </w:rPr>
-              <w:t>Union-</w:t>
-            </w:r>
-            <w:proofErr w:type="spellStart"/>
-            <w:r>
-              <w:rPr>
-                <w:sz w:val="20"/>
-                <w:szCs w:val="20"/>
-              </w:rPr>
-              <w:t>Find</w:t>
-            </w:r>
-            <w:proofErr w:type="spellEnd"/>
-            <w:r>
-              <w:rPr>
-                <w:sz w:val="20"/>
-                <w:szCs w:val="20"/>
-              </w:rPr>
-              <w:t xml:space="preserve"> (DSU)</w:t>
+              <w:t>Union-Find (DSU)</w:t>
             </w:r>
           </w:p>
         </w:tc>
@@ -20126,23 +18208,7 @@
                 <w:sz w:val="20"/>
                 <w:szCs w:val="20"/>
               </w:rPr>
-              <w:t xml:space="preserve">Système de gestion de base de données relationnelle open-source avancé, utilisé comme couche de persistance du système. Accessible via </w:t>
-            </w:r>
-            <w:proofErr w:type="spellStart"/>
-            <w:r>
-              <w:rPr>
-                <w:sz w:val="20"/>
-                <w:szCs w:val="20"/>
-              </w:rPr>
-              <w:t>SQLAlchemy</w:t>
-            </w:r>
-            <w:proofErr w:type="spellEnd"/>
-            <w:r>
-              <w:rPr>
-                <w:sz w:val="20"/>
-                <w:szCs w:val="20"/>
-              </w:rPr>
-              <w:t xml:space="preserve"> sur le port 5432.</w:t>
+              <w:t>Système de gestion de base de données relationnelle open-source avancé, utilisé comme couche de persistance du système. Accessible via SQLAlchemy sur le port 5432.</w:t>
             </w:r>
           </w:p>
         </w:tc>
@@ -20166,29 +18232,7 @@
           <w:sz w:val="18"/>
           <w:szCs w:val="18"/>
         </w:rPr>
-        <w:t xml:space="preserve">RAKOTOJAONA </w:t>
-      </w:r>
-      <w:proofErr w:type="spellStart"/>
-      <w:r>
-        <w:rPr>
-          <w:i/>
-          <w:iCs/>
-          <w:color w:val="888888"/>
-          <w:sz w:val="18"/>
-          <w:szCs w:val="18"/>
-        </w:rPr>
-        <w:t>Tsiaronomena</w:t>
-      </w:r>
-      <w:proofErr w:type="spellEnd"/>
-      <w:r>
-        <w:rPr>
-          <w:i/>
-          <w:iCs/>
-          <w:color w:val="888888"/>
-          <w:sz w:val="18"/>
-          <w:szCs w:val="18"/>
-        </w:rPr>
-        <w:t xml:space="preserve"> Rohann — NIE : SE20240253 — 12 Mars 2026</w:t>
+        <w:t>RAKOTOJAONA Tsiaronomena Rohann — NIE : SE20240253 — 12 Mars 2026</w:t>
       </w:r>
     </w:p>
     <w:sectPr>

</xml_diff>

<commit_message>
feat: implementation complete des fonctionnalites administrateur F4 et F5
</commit_message>
<xml_diff>
--- a/docs/Cahier_Des_Charges_Tsenantsika.docx
+++ b/docs/Cahier_Des_Charges_Tsenantsika.docx
@@ -53,6 +53,7 @@
         <w:spacing w:after="200"/>
         <w:jc w:val="center"/>
       </w:pPr>
+      <w:proofErr w:type="spellStart"/>
       <w:r>
         <w:rPr>
           <w:b/>
@@ -63,6 +64,7 @@
         </w:rPr>
         <w:t>Tsenan'tsika</w:t>
       </w:r>
+      <w:proofErr w:type="spellEnd"/>
     </w:p>
     <w:p>
       <w:pPr>
@@ -98,7 +100,27 @@
           <w:sz w:val="26"/>
           <w:szCs w:val="26"/>
         </w:rPr>
-        <w:t>RAKOTOJAONA Tsiaronomena Rohann</w:t>
+        <w:t xml:space="preserve">RAKOTOJAONA </w:t>
+      </w:r>
+      <w:proofErr w:type="spellStart"/>
+      <w:r>
+        <w:rPr>
+          <w:b/>
+          <w:bCs/>
+          <w:sz w:val="26"/>
+          <w:szCs w:val="26"/>
+        </w:rPr>
+        <w:t>Tsiaronomena</w:t>
+      </w:r>
+      <w:proofErr w:type="spellEnd"/>
+      <w:r>
+        <w:rPr>
+          <w:b/>
+          <w:bCs/>
+          <w:sz w:val="26"/>
+          <w:szCs w:val="26"/>
+        </w:rPr>
+        <w:t xml:space="preserve"> Rohann</w:t>
       </w:r>
     </w:p>
     <w:p>
@@ -258,12 +280,21 @@
             </w:tcMar>
           </w:tcPr>
           <w:p>
-            <w:r>
-              <w:rPr>
-                <w:sz w:val="20"/>
-                <w:szCs w:val="20"/>
-              </w:rPr>
-              <w:t>Tsenan'tsika — Système national de surveillance des prix alimentaires</w:t>
+            <w:proofErr w:type="spellStart"/>
+            <w:r>
+              <w:rPr>
+                <w:sz w:val="20"/>
+                <w:szCs w:val="20"/>
+              </w:rPr>
+              <w:t>Tsenan'tsika</w:t>
+            </w:r>
+            <w:proofErr w:type="spellEnd"/>
+            <w:r>
+              <w:rPr>
+                <w:sz w:val="20"/>
+                <w:szCs w:val="20"/>
+              </w:rPr>
+              <w:t xml:space="preserve"> — Système national de surveillance des prix alimentaires</w:t>
             </w:r>
           </w:p>
         </w:tc>
@@ -375,7 +406,23 @@
                 <w:sz w:val="20"/>
                 <w:szCs w:val="20"/>
               </w:rPr>
-              <w:t>RAKOTOJAONA Tsiaronomena Rohann</w:t>
+              <w:t xml:space="preserve">RAKOTOJAONA </w:t>
+            </w:r>
+            <w:proofErr w:type="spellStart"/>
+            <w:r>
+              <w:rPr>
+                <w:sz w:val="20"/>
+                <w:szCs w:val="20"/>
+              </w:rPr>
+              <w:t>Tsiaronomena</w:t>
+            </w:r>
+            <w:proofErr w:type="spellEnd"/>
+            <w:r>
+              <w:rPr>
+                <w:sz w:val="20"/>
+                <w:szCs w:val="20"/>
+              </w:rPr>
+              <w:t xml:space="preserve"> Rohann</w:t>
             </w:r>
           </w:p>
         </w:tc>
@@ -411,6 +458,7 @@
               </w:rPr>
               <w:t>F</w:t>
             </w:r>
+            <w:proofErr w:type="spellStart"/>
             <w:r>
               <w:rPr>
                 <w:sz w:val="20"/>
@@ -419,6 +467,7 @@
               </w:rPr>
               <w:t>ilière</w:t>
             </w:r>
+            <w:proofErr w:type="spellEnd"/>
           </w:p>
         </w:tc>
         <w:tc>
@@ -698,7 +747,23 @@
         <w:spacing w:after="140"/>
       </w:pPr>
       <w:r>
-        <w:t>Ce projet démontre la maîtrise de l'architecture logicielle 3-tiers, de la modélisation UML complète, et de l'implémentation manuelle d'algorithmes avancés (Dijkstra, Fenwick Tree, Rabin-Karp, Top-k). Il répond à toutes les exigences algorithmiques et structurelles du cahier des charges du projet transversal L2.</w:t>
+        <w:t xml:space="preserve">Ce projet démontre la maîtrise de l'architecture logicielle 3-tiers, de la modélisation UML complète, et de l'implémentation manuelle d'algorithmes avancés (Dijkstra, Fenwick </w:t>
+      </w:r>
+      <w:proofErr w:type="spellStart"/>
+      <w:r>
+        <w:t>Tree</w:t>
+      </w:r>
+      <w:proofErr w:type="spellEnd"/>
+      <w:r>
+        <w:t>, Rabin-</w:t>
+      </w:r>
+      <w:proofErr w:type="spellStart"/>
+      <w:r>
+        <w:t>Karp</w:t>
+      </w:r>
+      <w:proofErr w:type="spellEnd"/>
+      <w:r>
+        <w:t>, Top-k). Il répond à toutes les exigences algorithmiques et structurelles du cahier des charges du projet transversal L2.</w:t>
       </w:r>
     </w:p>
     <w:p>
@@ -741,9 +806,15 @@
       <w:pPr>
         <w:spacing w:after="140"/>
       </w:pPr>
+      <w:proofErr w:type="spellStart"/>
       <w:r>
-        <w:t xml:space="preserve">Tsenan'tsika offre </w:t>
+        <w:t>Tsenan'tsika</w:t>
       </w:r>
+      <w:proofErr w:type="spellEnd"/>
+      <w:r>
+        <w:t xml:space="preserve"> offre </w:t>
+      </w:r>
+      <w:proofErr w:type="gramStart"/>
       <w:r>
         <w:t xml:space="preserve">aux citoyens </w:t>
       </w:r>
@@ -753,15 +824,18 @@
         </w:rPr>
         <w:t>m</w:t>
       </w:r>
+      <w:proofErr w:type="spellStart"/>
       <w:r>
         <w:t>alagas</w:t>
       </w:r>
+      <w:proofErr w:type="spellEnd"/>
       <w:r>
         <w:rPr>
           <w:lang w:val="fr-FR"/>
         </w:rPr>
         <w:t>y</w:t>
       </w:r>
+      <w:proofErr w:type="gramEnd"/>
       <w:r>
         <w:t>, aux agents de terrain et aux décideurs du Ministère de l'Agriculture un accès transparent aux prix du marché. En détectant les hausses anormales en temps réel, il contribue directement à la lutte contre la spéculation et à la protection du pouvoir d'achat des ménages les plus vulnérables.</w:t>
       </w:r>
@@ -900,7 +974,15 @@
         <w:spacing w:after="80"/>
       </w:pPr>
       <w:r>
-        <w:t>Garantir l'intégrité des données en détectant les rapports dupliqués ou frauduleux via l'algorithme Rabin-Karp.</w:t>
+        <w:t>Garantir l'intégrité des données en détectant les rapports dupliqués ou frauduleux via l'algorithme Rabin-</w:t>
+      </w:r>
+      <w:proofErr w:type="spellStart"/>
+      <w:r>
+        <w:t>Karp</w:t>
+      </w:r>
+      <w:proofErr w:type="spellEnd"/>
+      <w:r>
+        <w:t>.</w:t>
       </w:r>
     </w:p>
     <w:p>
@@ -913,7 +995,15 @@
         <w:spacing w:after="80"/>
       </w:pPr>
       <w:r>
-        <w:t>Fournir un tableau de bord multilingue (Français / Malgache) accessible via web (React.js) et mobile (React Native).</w:t>
+        <w:t>Fournir un tableau de bord multilingue (Français / Malgache) accessible via web (React.js) et mobile (</w:t>
+      </w:r>
+      <w:proofErr w:type="spellStart"/>
+      <w:r>
+        <w:t>React</w:t>
+      </w:r>
+      <w:proofErr w:type="spellEnd"/>
+      <w:r>
+        <w:t xml:space="preserve"> Native).</w:t>
       </w:r>
     </w:p>
     <w:p>
@@ -1005,7 +1095,15 @@
         <w:spacing w:after="80"/>
       </w:pPr>
       <w:r>
-        <w:t>Interface web (React.js) et application mobile (React Native).</w:t>
+        <w:t>Interface web (React.js) et application mobile (</w:t>
+      </w:r>
+      <w:proofErr w:type="spellStart"/>
+      <w:r>
+        <w:t>React</w:t>
+      </w:r>
+      <w:proofErr w:type="spellEnd"/>
+      <w:r>
+        <w:t xml:space="preserve"> Native).</w:t>
       </w:r>
     </w:p>
     <w:p>
@@ -1018,7 +1116,23 @@
         <w:spacing w:after="80"/>
       </w:pPr>
       <w:r>
-        <w:t>Modules algorithmiques implémentés manuellement : Fenwick Tree, Top-k (tas binaire), Dijkstra, Rabin-Karp.</w:t>
+        <w:t xml:space="preserve">Modules algorithmiques implémentés manuellement : Fenwick </w:t>
+      </w:r>
+      <w:proofErr w:type="spellStart"/>
+      <w:r>
+        <w:t>Tree</w:t>
+      </w:r>
+      <w:proofErr w:type="spellEnd"/>
+      <w:r>
+        <w:t>, Top-k (tas binaire), Dijkstra, Rabin-</w:t>
+      </w:r>
+      <w:proofErr w:type="spellStart"/>
+      <w:r>
+        <w:t>Karp</w:t>
+      </w:r>
+      <w:proofErr w:type="spellEnd"/>
+      <w:r>
+        <w:t>.</w:t>
       </w:r>
     </w:p>
     <w:p>
@@ -1031,7 +1145,23 @@
         <w:spacing w:after="80"/>
       </w:pPr>
       <w:r>
-        <w:t>API REST documentée automatiquement via FastAPI (Swagger UI).</w:t>
+        <w:t xml:space="preserve">API REST documentée automatiquement via </w:t>
+      </w:r>
+      <w:proofErr w:type="spellStart"/>
+      <w:r>
+        <w:t>FastAPI</w:t>
+      </w:r>
+      <w:proofErr w:type="spellEnd"/>
+      <w:r>
+        <w:t xml:space="preserve"> (</w:t>
+      </w:r>
+      <w:proofErr w:type="spellStart"/>
+      <w:r>
+        <w:t>Swagger</w:t>
+      </w:r>
+      <w:proofErr w:type="spellEnd"/>
+      <w:r>
+        <w:t xml:space="preserve"> UI).</w:t>
       </w:r>
     </w:p>
     <w:p>
@@ -1344,7 +1474,23 @@
                 <w:sz w:val="20"/>
                 <w:szCs w:val="20"/>
               </w:rPr>
-              <w:t>Un agent saisit le prix observé d'un produit sur un marché local via l'application mobile React Native.</w:t>
+              <w:t xml:space="preserve">Un agent saisit le prix observé d'un produit sur un marché local via l'application mobile </w:t>
+            </w:r>
+            <w:proofErr w:type="spellStart"/>
+            <w:r>
+              <w:rPr>
+                <w:sz w:val="20"/>
+                <w:szCs w:val="20"/>
+              </w:rPr>
+              <w:t>React</w:t>
+            </w:r>
+            <w:proofErr w:type="spellEnd"/>
+            <w:r>
+              <w:rPr>
+                <w:sz w:val="20"/>
+                <w:szCs w:val="20"/>
+              </w:rPr>
+              <w:t xml:space="preserve"> Native.</w:t>
             </w:r>
           </w:p>
         </w:tc>
@@ -1395,13 +1541,72 @@
             </w:tcMar>
           </w:tcPr>
           <w:p>
-            <w:r>
-              <w:rPr>
-                <w:sz w:val="20"/>
-                <w:szCs w:val="20"/>
-              </w:rPr>
-              <w:t>produit_id, ville_id, prix (Ariary/unité), date_saisie, agent_id</w:t>
-            </w:r>
+            <w:proofErr w:type="spellStart"/>
+            <w:proofErr w:type="gramStart"/>
+            <w:r>
+              <w:rPr>
+                <w:sz w:val="20"/>
+                <w:szCs w:val="20"/>
+              </w:rPr>
+              <w:t>produit</w:t>
+            </w:r>
+            <w:proofErr w:type="gramEnd"/>
+            <w:r>
+              <w:rPr>
+                <w:sz w:val="20"/>
+                <w:szCs w:val="20"/>
+              </w:rPr>
+              <w:t>_id</w:t>
+            </w:r>
+            <w:proofErr w:type="spellEnd"/>
+            <w:r>
+              <w:rPr>
+                <w:sz w:val="20"/>
+                <w:szCs w:val="20"/>
+              </w:rPr>
+              <w:t xml:space="preserve">, </w:t>
+            </w:r>
+            <w:proofErr w:type="spellStart"/>
+            <w:r>
+              <w:rPr>
+                <w:sz w:val="20"/>
+                <w:szCs w:val="20"/>
+              </w:rPr>
+              <w:t>ville_id</w:t>
+            </w:r>
+            <w:proofErr w:type="spellEnd"/>
+            <w:r>
+              <w:rPr>
+                <w:sz w:val="20"/>
+                <w:szCs w:val="20"/>
+              </w:rPr>
+              <w:t xml:space="preserve">, prix (Ariary/unité), </w:t>
+            </w:r>
+            <w:proofErr w:type="spellStart"/>
+            <w:r>
+              <w:rPr>
+                <w:sz w:val="20"/>
+                <w:szCs w:val="20"/>
+              </w:rPr>
+              <w:t>date_saisie</w:t>
+            </w:r>
+            <w:proofErr w:type="spellEnd"/>
+            <w:r>
+              <w:rPr>
+                <w:sz w:val="20"/>
+                <w:szCs w:val="20"/>
+              </w:rPr>
+              <w:t xml:space="preserve">, </w:t>
+            </w:r>
+            <w:proofErr w:type="spellStart"/>
+            <w:r>
+              <w:rPr>
+                <w:sz w:val="20"/>
+                <w:szCs w:val="20"/>
+              </w:rPr>
+              <w:t>agent_id</w:t>
+            </w:r>
+            <w:proofErr w:type="spellEnd"/>
           </w:p>
         </w:tc>
       </w:tr>
@@ -1512,7 +1717,23 @@
                 <w:sz w:val="20"/>
                 <w:szCs w:val="20"/>
               </w:rPr>
-              <w:t>Donnée enregistrée, doublon vérifié (Rabin-Karp), alertes Top-k mises à jour</w:t>
+              <w:t>Donnée enregistrée, doublon vérifié (Rabin-</w:t>
+            </w:r>
+            <w:proofErr w:type="spellStart"/>
+            <w:r>
+              <w:rPr>
+                <w:sz w:val="20"/>
+                <w:szCs w:val="20"/>
+              </w:rPr>
+              <w:t>Karp</w:t>
+            </w:r>
+            <w:proofErr w:type="spellEnd"/>
+            <w:r>
+              <w:rPr>
+                <w:sz w:val="20"/>
+                <w:szCs w:val="20"/>
+              </w:rPr>
+              <w:t>), alertes Top-k mises à jour</w:t>
             </w:r>
           </w:p>
         </w:tc>
@@ -1891,12 +2112,16 @@
             </w:tcMar>
           </w:tcPr>
           <w:p>
-            <w:r>
-              <w:rPr>
-                <w:sz w:val="20"/>
-                <w:szCs w:val="20"/>
-              </w:rPr>
-              <w:t>Analyste ministère, Citoyen</w:t>
+            <w:pPr>
+              <w:rPr>
+                <w:lang w:val="fr-FR"/>
+              </w:rPr>
+            </w:pPr>
+            <w:r>
+              <w:rPr>
+                <w:lang w:val="fr-FR"/>
+              </w:rPr>
+              <w:t>Tous les acteurs</w:t>
             </w:r>
           </w:p>
         </w:tc>
@@ -2008,8 +2233,33 @@
                 <w:sz w:val="20"/>
                 <w:szCs w:val="20"/>
               </w:rPr>
-              <w:t>Mise à jour O(log n) via tas binaire ; moyenne O(log n) via Fenwick Tree</w:t>
-            </w:r>
+              <w:t xml:space="preserve">Mise à jour </w:t>
+            </w:r>
+            <w:proofErr w:type="gramStart"/>
+            <w:r>
+              <w:rPr>
+                <w:sz w:val="20"/>
+                <w:szCs w:val="20"/>
+              </w:rPr>
+              <w:t>O(</w:t>
+            </w:r>
+            <w:proofErr w:type="gramEnd"/>
+            <w:r>
+              <w:rPr>
+                <w:sz w:val="20"/>
+                <w:szCs w:val="20"/>
+              </w:rPr>
+              <w:t xml:space="preserve">log n) via tas binaire ; moyenne O(log n) via Fenwick </w:t>
+            </w:r>
+            <w:proofErr w:type="spellStart"/>
+            <w:r>
+              <w:rPr>
+                <w:sz w:val="20"/>
+                <w:szCs w:val="20"/>
+              </w:rPr>
+              <w:t>Tree</w:t>
+            </w:r>
+            <w:proofErr w:type="spellEnd"/>
           </w:p>
         </w:tc>
       </w:tr>
@@ -2904,7 +3154,23 @@
                 <w:sz w:val="20"/>
                 <w:szCs w:val="20"/>
               </w:rPr>
-              <w:t>Rabin-Karp avec fenêtre glissante ; hachage de chaînes</w:t>
+              <w:t>Rabin-</w:t>
+            </w:r>
+            <w:proofErr w:type="spellStart"/>
+            <w:r>
+              <w:rPr>
+                <w:sz w:val="20"/>
+                <w:szCs w:val="20"/>
+              </w:rPr>
+              <w:t>Karp</w:t>
+            </w:r>
+            <w:proofErr w:type="spellEnd"/>
+            <w:r>
+              <w:rPr>
+                <w:sz w:val="20"/>
+                <w:szCs w:val="20"/>
+              </w:rPr>
+              <w:t xml:space="preserve"> avec fenêtre glissante ; hachage de chaînes</w:t>
             </w:r>
           </w:p>
         </w:tc>
@@ -3171,12 +3437,69 @@
             </w:tcMar>
           </w:tcPr>
           <w:p>
-            <w:r>
-              <w:rPr>
-                <w:sz w:val="20"/>
-                <w:szCs w:val="20"/>
-              </w:rPr>
-              <w:t>nom, prénom, rôle, district_assigné, statut_compte, mot_de_passe (haché)</w:t>
+            <w:proofErr w:type="gramStart"/>
+            <w:r>
+              <w:rPr>
+                <w:sz w:val="20"/>
+                <w:szCs w:val="20"/>
+              </w:rPr>
+              <w:t>nom</w:t>
+            </w:r>
+            <w:proofErr w:type="gramEnd"/>
+            <w:r>
+              <w:rPr>
+                <w:sz w:val="20"/>
+                <w:szCs w:val="20"/>
+              </w:rPr>
+              <w:t xml:space="preserve">, prénom, rôle, </w:t>
+            </w:r>
+            <w:proofErr w:type="spellStart"/>
+            <w:r>
+              <w:rPr>
+                <w:sz w:val="20"/>
+                <w:szCs w:val="20"/>
+              </w:rPr>
+              <w:t>district_assigné</w:t>
+            </w:r>
+            <w:proofErr w:type="spellEnd"/>
+            <w:r>
+              <w:rPr>
+                <w:sz w:val="20"/>
+                <w:szCs w:val="20"/>
+              </w:rPr>
+              <w:t xml:space="preserve">, </w:t>
+            </w:r>
+            <w:proofErr w:type="spellStart"/>
+            <w:r>
+              <w:rPr>
+                <w:sz w:val="20"/>
+                <w:szCs w:val="20"/>
+              </w:rPr>
+              <w:t>statut_compte</w:t>
+            </w:r>
+            <w:proofErr w:type="spellEnd"/>
+            <w:r>
+              <w:rPr>
+                <w:sz w:val="20"/>
+                <w:szCs w:val="20"/>
+              </w:rPr>
+              <w:t xml:space="preserve">, </w:t>
+            </w:r>
+            <w:proofErr w:type="spellStart"/>
+            <w:r>
+              <w:rPr>
+                <w:sz w:val="20"/>
+                <w:szCs w:val="20"/>
+              </w:rPr>
+              <w:t>mot_de_passe</w:t>
+            </w:r>
+            <w:proofErr w:type="spellEnd"/>
+            <w:r>
+              <w:rPr>
+                <w:sz w:val="20"/>
+                <w:szCs w:val="20"/>
+              </w:rPr>
+              <w:t xml:space="preserve"> (haché)</w:t>
             </w:r>
           </w:p>
         </w:tc>
@@ -3344,8 +3667,17 @@
                 <w:sz w:val="20"/>
                 <w:szCs w:val="20"/>
               </w:rPr>
-              <w:t>Authentification JWT ; hachage bcrypt</w:t>
-            </w:r>
+              <w:t xml:space="preserve">Authentification JWT ; hachage </w:t>
+            </w:r>
+            <w:proofErr w:type="spellStart"/>
+            <w:r>
+              <w:rPr>
+                <w:sz w:val="20"/>
+                <w:szCs w:val="20"/>
+              </w:rPr>
+              <w:t>bcrypt</w:t>
+            </w:r>
+            <w:proofErr w:type="spellEnd"/>
           </w:p>
         </w:tc>
       </w:tr>
@@ -3784,7 +4116,23 @@
                 <w:sz w:val="20"/>
                 <w:szCs w:val="20"/>
               </w:rPr>
-              <w:t>Génération côté backend Python (bibliothèque ReportLab) ; format A4</w:t>
+              <w:t xml:space="preserve">Génération côté backend Python (bibliothèque </w:t>
+            </w:r>
+            <w:proofErr w:type="spellStart"/>
+            <w:r>
+              <w:rPr>
+                <w:sz w:val="20"/>
+                <w:szCs w:val="20"/>
+              </w:rPr>
+              <w:t>ReportLab</w:t>
+            </w:r>
+            <w:proofErr w:type="spellEnd"/>
+            <w:r>
+              <w:rPr>
+                <w:sz w:val="20"/>
+                <w:szCs w:val="20"/>
+              </w:rPr>
+              <w:t>) ; format A4</w:t>
             </w:r>
           </w:p>
         </w:tc>
@@ -3996,12 +4344,25 @@
             </w:tcMar>
           </w:tcPr>
           <w:p>
+            <w:pPr>
+              <w:rPr>
+                <w:lang w:val="fr-FR"/>
+              </w:rPr>
+            </w:pPr>
             <w:r>
               <w:rPr>
                 <w:sz w:val="20"/>
                 <w:szCs w:val="20"/>
               </w:rPr>
               <w:t>F1 (saisie), F4 (déclencheur doublon)</w:t>
+            </w:r>
+            <w:r>
+              <w:rPr>
+                <w:sz w:val="20"/>
+                <w:szCs w:val="20"/>
+                <w:lang w:val="fr-FR"/>
+              </w:rPr>
+              <w:t>, F2</w:t>
             </w:r>
           </w:p>
         </w:tc>
@@ -4245,12 +4606,25 @@
             </w:tcMar>
           </w:tcPr>
           <w:p>
+            <w:pPr>
+              <w:rPr>
+                <w:lang w:val="fr-FR"/>
+              </w:rPr>
+            </w:pPr>
             <w:r>
               <w:rPr>
                 <w:sz w:val="20"/>
                 <w:szCs w:val="20"/>
               </w:rPr>
               <w:t>F4, F5</w:t>
+            </w:r>
+            <w:r>
+              <w:rPr>
+                <w:sz w:val="20"/>
+                <w:szCs w:val="20"/>
+                <w:lang w:val="fr-FR"/>
+              </w:rPr>
+              <w:t xml:space="preserve">, F2 </w:t>
             </w:r>
           </w:p>
         </w:tc>
@@ -4272,15 +4646,52 @@
       </w:pPr>
       <w:r>
         <w:lastRenderedPageBreak/>
-        <w:t>5.3 Analyse des besoins — Méthode MoSCoW</w:t>
+        <w:t xml:space="preserve">5.3 Analyse des besoins — Méthode </w:t>
       </w:r>
+      <w:proofErr w:type="spellStart"/>
+      <w:r>
+        <w:t>MoSCoW</w:t>
+      </w:r>
+      <w:proofErr w:type="spellEnd"/>
     </w:p>
     <w:p>
       <w:pPr>
         <w:spacing w:after="140"/>
       </w:pPr>
       <w:r>
-        <w:t>La méthode MoSCoW permet de prioriser les fonctionnalités selon quatre catégories : Must Have (indispensable), Should Have (important), Could Have (souhaitable), Won't Have (hors périmètre pour ce prototype).</w:t>
+        <w:t xml:space="preserve">La méthode </w:t>
+      </w:r>
+      <w:proofErr w:type="spellStart"/>
+      <w:r>
+        <w:t>MoSCoW</w:t>
+      </w:r>
+      <w:proofErr w:type="spellEnd"/>
+      <w:r>
+        <w:t xml:space="preserve"> permet de prioriser les fonctionnalités selon quatre catégories : Must Have (indispensable), </w:t>
+      </w:r>
+      <w:proofErr w:type="spellStart"/>
+      <w:r>
+        <w:t>Should</w:t>
+      </w:r>
+      <w:proofErr w:type="spellEnd"/>
+      <w:r>
+        <w:t xml:space="preserve"> Have (important), </w:t>
+      </w:r>
+      <w:proofErr w:type="spellStart"/>
+      <w:r>
+        <w:t>Could</w:t>
+      </w:r>
+      <w:proofErr w:type="spellEnd"/>
+      <w:r>
+        <w:t xml:space="preserve"> Have (souhaitable), </w:t>
+      </w:r>
+      <w:proofErr w:type="spellStart"/>
+      <w:r>
+        <w:t>Won't</w:t>
+      </w:r>
+      <w:proofErr w:type="spellEnd"/>
+      <w:r>
+        <w:t xml:space="preserve"> Have (hors périmètre pour ce prototype).</w:t>
       </w:r>
     </w:p>
     <w:p>
@@ -4702,7 +5113,23 @@
                 <w:sz w:val="20"/>
                 <w:szCs w:val="20"/>
               </w:rPr>
-              <w:t>F4 — Détection doublons (Rabin-Karp)</w:t>
+              <w:t>F4 — Détection doublons (Rabin-</w:t>
+            </w:r>
+            <w:proofErr w:type="spellStart"/>
+            <w:r>
+              <w:rPr>
+                <w:sz w:val="20"/>
+                <w:szCs w:val="20"/>
+              </w:rPr>
+              <w:t>Karp</w:t>
+            </w:r>
+            <w:proofErr w:type="spellEnd"/>
+            <w:r>
+              <w:rPr>
+                <w:sz w:val="20"/>
+                <w:szCs w:val="20"/>
+              </w:rPr>
+              <w:t>)</w:t>
             </w:r>
           </w:p>
         </w:tc>
@@ -4753,12 +5180,21 @@
             </w:tcMar>
           </w:tcPr>
           <w:p>
-            <w:r>
-              <w:rPr>
-                <w:sz w:val="20"/>
-                <w:szCs w:val="20"/>
-              </w:rPr>
-              <w:t>Should Have</w:t>
+            <w:proofErr w:type="spellStart"/>
+            <w:r>
+              <w:rPr>
+                <w:sz w:val="20"/>
+                <w:szCs w:val="20"/>
+              </w:rPr>
+              <w:t>Should</w:t>
+            </w:r>
+            <w:proofErr w:type="spellEnd"/>
+            <w:r>
+              <w:rPr>
+                <w:sz w:val="20"/>
+                <w:szCs w:val="20"/>
+              </w:rPr>
+              <w:t xml:space="preserve"> Have</w:t>
             </w:r>
           </w:p>
         </w:tc>
@@ -4836,12 +5272,21 @@
             </w:tcMar>
           </w:tcPr>
           <w:p>
-            <w:r>
-              <w:rPr>
-                <w:sz w:val="20"/>
-                <w:szCs w:val="20"/>
-              </w:rPr>
-              <w:t>Should Have</w:t>
+            <w:proofErr w:type="spellStart"/>
+            <w:r>
+              <w:rPr>
+                <w:sz w:val="20"/>
+                <w:szCs w:val="20"/>
+              </w:rPr>
+              <w:t>Should</w:t>
+            </w:r>
+            <w:proofErr w:type="spellEnd"/>
+            <w:r>
+              <w:rPr>
+                <w:sz w:val="20"/>
+                <w:szCs w:val="20"/>
+              </w:rPr>
+              <w:t xml:space="preserve"> Have</w:t>
             </w:r>
           </w:p>
         </w:tc>
@@ -4919,12 +5364,21 @@
             </w:tcMar>
           </w:tcPr>
           <w:p>
-            <w:r>
-              <w:rPr>
-                <w:sz w:val="20"/>
-                <w:szCs w:val="20"/>
-              </w:rPr>
-              <w:t>Could Have</w:t>
+            <w:proofErr w:type="spellStart"/>
+            <w:r>
+              <w:rPr>
+                <w:sz w:val="20"/>
+                <w:szCs w:val="20"/>
+              </w:rPr>
+              <w:t>Could</w:t>
+            </w:r>
+            <w:proofErr w:type="spellEnd"/>
+            <w:r>
+              <w:rPr>
+                <w:sz w:val="20"/>
+                <w:szCs w:val="20"/>
+              </w:rPr>
+              <w:t xml:space="preserve"> Have</w:t>
             </w:r>
           </w:p>
         </w:tc>
@@ -5002,12 +5456,21 @@
             </w:tcMar>
           </w:tcPr>
           <w:p>
-            <w:r>
-              <w:rPr>
-                <w:sz w:val="20"/>
-                <w:szCs w:val="20"/>
-              </w:rPr>
-              <w:t>Could Have</w:t>
+            <w:proofErr w:type="spellStart"/>
+            <w:r>
+              <w:rPr>
+                <w:sz w:val="20"/>
+                <w:szCs w:val="20"/>
+              </w:rPr>
+              <w:t>Could</w:t>
+            </w:r>
+            <w:proofErr w:type="spellEnd"/>
+            <w:r>
+              <w:rPr>
+                <w:sz w:val="20"/>
+                <w:szCs w:val="20"/>
+              </w:rPr>
+              <w:t xml:space="preserve"> Have</w:t>
             </w:r>
           </w:p>
         </w:tc>
@@ -5034,7 +5497,23 @@
                 <w:sz w:val="20"/>
                 <w:szCs w:val="20"/>
               </w:rPr>
-              <w:t>Mode hors-ligne (sync différée)</w:t>
+              <w:t>Mode hors-ligne (</w:t>
+            </w:r>
+            <w:proofErr w:type="spellStart"/>
+            <w:r>
+              <w:rPr>
+                <w:sz w:val="20"/>
+                <w:szCs w:val="20"/>
+              </w:rPr>
+              <w:t>sync</w:t>
+            </w:r>
+            <w:proofErr w:type="spellEnd"/>
+            <w:r>
+              <w:rPr>
+                <w:sz w:val="20"/>
+                <w:szCs w:val="20"/>
+              </w:rPr>
+              <w:t xml:space="preserve"> différée)</w:t>
             </w:r>
           </w:p>
         </w:tc>
@@ -5085,12 +5564,21 @@
             </w:tcMar>
           </w:tcPr>
           <w:p>
-            <w:r>
-              <w:rPr>
-                <w:sz w:val="20"/>
-                <w:szCs w:val="20"/>
-              </w:rPr>
-              <w:t>Won't Have</w:t>
+            <w:proofErr w:type="spellStart"/>
+            <w:r>
+              <w:rPr>
+                <w:sz w:val="20"/>
+                <w:szCs w:val="20"/>
+              </w:rPr>
+              <w:t>Won't</w:t>
+            </w:r>
+            <w:proofErr w:type="spellEnd"/>
+            <w:r>
+              <w:rPr>
+                <w:sz w:val="20"/>
+                <w:szCs w:val="20"/>
+              </w:rPr>
+              <w:t xml:space="preserve"> Have</w:t>
             </w:r>
           </w:p>
         </w:tc>
@@ -5168,12 +5656,21 @@
             </w:tcMar>
           </w:tcPr>
           <w:p>
-            <w:r>
-              <w:rPr>
-                <w:sz w:val="20"/>
-                <w:szCs w:val="20"/>
-              </w:rPr>
-              <w:t>Won't Have</w:t>
+            <w:proofErr w:type="spellStart"/>
+            <w:r>
+              <w:rPr>
+                <w:sz w:val="20"/>
+                <w:szCs w:val="20"/>
+              </w:rPr>
+              <w:t>Won't</w:t>
+            </w:r>
+            <w:proofErr w:type="spellEnd"/>
+            <w:r>
+              <w:rPr>
+                <w:sz w:val="20"/>
+                <w:szCs w:val="20"/>
+              </w:rPr>
+              <w:t xml:space="preserve"> Have</w:t>
             </w:r>
           </w:p>
         </w:tc>
@@ -5495,12 +5992,21 @@
             </w:tcMar>
           </w:tcPr>
           <w:p>
-            <w:r>
-              <w:rPr>
-                <w:sz w:val="20"/>
-                <w:szCs w:val="20"/>
-              </w:rPr>
-              <w:t>React Native</w:t>
+            <w:proofErr w:type="spellStart"/>
+            <w:r>
+              <w:rPr>
+                <w:sz w:val="20"/>
+                <w:szCs w:val="20"/>
+              </w:rPr>
+              <w:t>React</w:t>
+            </w:r>
+            <w:proofErr w:type="spellEnd"/>
+            <w:r>
+              <w:rPr>
+                <w:sz w:val="20"/>
+                <w:szCs w:val="20"/>
+              </w:rPr>
+              <w:t xml:space="preserve"> Native</w:t>
             </w:r>
           </w:p>
         </w:tc>
@@ -5527,7 +6033,23 @@
                 <w:sz w:val="20"/>
                 <w:szCs w:val="20"/>
               </w:rPr>
-              <w:t>Même codebase JavaScript que React ; déploiement iOS &amp; Android</w:t>
+              <w:t xml:space="preserve">Même codebase JavaScript que </w:t>
+            </w:r>
+            <w:proofErr w:type="spellStart"/>
+            <w:r>
+              <w:rPr>
+                <w:sz w:val="20"/>
+                <w:szCs w:val="20"/>
+              </w:rPr>
+              <w:t>React</w:t>
+            </w:r>
+            <w:proofErr w:type="spellEnd"/>
+            <w:r>
+              <w:rPr>
+                <w:sz w:val="20"/>
+                <w:szCs w:val="20"/>
+              </w:rPr>
+              <w:t xml:space="preserve"> ; déploiement iOS &amp; Android</w:t>
             </w:r>
           </w:p>
         </w:tc>
@@ -5583,8 +6105,17 @@
                 <w:sz w:val="20"/>
                 <w:szCs w:val="20"/>
               </w:rPr>
-              <w:t>Python / FastAPI</w:t>
-            </w:r>
+              <w:t xml:space="preserve">Python / </w:t>
+            </w:r>
+            <w:proofErr w:type="spellStart"/>
+            <w:r>
+              <w:rPr>
+                <w:sz w:val="20"/>
+                <w:szCs w:val="20"/>
+              </w:rPr>
+              <w:t>FastAPI</w:t>
+            </w:r>
+            <w:proofErr w:type="spellEnd"/>
           </w:p>
         </w:tc>
         <w:tc>
@@ -5610,7 +6141,23 @@
                 <w:sz w:val="20"/>
                 <w:szCs w:val="20"/>
               </w:rPr>
-              <w:t>Performance, typage fort, documentation auto Swagger UI intégrée</w:t>
+              <w:t xml:space="preserve">Performance, typage fort, documentation auto </w:t>
+            </w:r>
+            <w:proofErr w:type="spellStart"/>
+            <w:r>
+              <w:rPr>
+                <w:sz w:val="20"/>
+                <w:szCs w:val="20"/>
+              </w:rPr>
+              <w:t>Swagger</w:t>
+            </w:r>
+            <w:proofErr w:type="spellEnd"/>
+            <w:r>
+              <w:rPr>
+                <w:sz w:val="20"/>
+                <w:szCs w:val="20"/>
+              </w:rPr>
+              <w:t xml:space="preserve"> UI intégrée</w:t>
             </w:r>
           </w:p>
         </w:tc>
@@ -5661,6 +6208,7 @@
             </w:tcMar>
           </w:tcPr>
           <w:p>
+            <w:proofErr w:type="spellStart"/>
             <w:r>
               <w:rPr>
                 <w:sz w:val="20"/>
@@ -5668,6 +6216,7 @@
               </w:rPr>
               <w:t>SQLAlchemy</w:t>
             </w:r>
+            <w:proofErr w:type="spellEnd"/>
           </w:p>
         </w:tc>
         <w:tc>
@@ -5688,12 +6237,21 @@
             </w:tcMar>
           </w:tcPr>
           <w:p>
-            <w:r>
-              <w:rPr>
-                <w:sz w:val="20"/>
-                <w:szCs w:val="20"/>
-              </w:rPr>
-              <w:t>SQLAlchemy — ORM Python facilitant les interactions avec PostgreSQL sans SQL brut ; abstraction complète des requêtes, typage fort et gestion des migrations</w:t>
+            <w:proofErr w:type="spellStart"/>
+            <w:r>
+              <w:rPr>
+                <w:sz w:val="20"/>
+                <w:szCs w:val="20"/>
+              </w:rPr>
+              <w:t>SQLAlchemy</w:t>
+            </w:r>
+            <w:proofErr w:type="spellEnd"/>
+            <w:r>
+              <w:rPr>
+                <w:sz w:val="20"/>
+                <w:szCs w:val="20"/>
+              </w:rPr>
+              <w:t xml:space="preserve"> — ORM Python facilitant les interactions avec PostgreSQL sans SQL brut ; abstraction complète des requêtes, typage fort et gestion des migrations</w:t>
             </w:r>
           </w:p>
         </w:tc>
@@ -5919,7 +6477,23 @@
                 <w:sz w:val="20"/>
                 <w:szCs w:val="20"/>
               </w:rPr>
-              <w:t>JWT (JSON Web Tokens)</w:t>
+              <w:t xml:space="preserve">JWT (JSON Web </w:t>
+            </w:r>
+            <w:proofErr w:type="spellStart"/>
+            <w:r>
+              <w:rPr>
+                <w:sz w:val="20"/>
+                <w:szCs w:val="20"/>
+              </w:rPr>
+              <w:t>Tokens</w:t>
+            </w:r>
+            <w:proofErr w:type="spellEnd"/>
+            <w:r>
+              <w:rPr>
+                <w:sz w:val="20"/>
+                <w:szCs w:val="20"/>
+              </w:rPr>
+              <w:t>)</w:t>
             </w:r>
           </w:p>
         </w:tc>
@@ -5975,8 +6549,17 @@
                 <w:sz w:val="20"/>
                 <w:szCs w:val="20"/>
               </w:rPr>
-              <w:t>Hachage mdp</w:t>
-            </w:r>
+              <w:t xml:space="preserve">Hachage </w:t>
+            </w:r>
+            <w:proofErr w:type="spellStart"/>
+            <w:r>
+              <w:rPr>
+                <w:sz w:val="20"/>
+                <w:szCs w:val="20"/>
+              </w:rPr>
+              <w:t>mdp</w:t>
+            </w:r>
+            <w:proofErr w:type="spellEnd"/>
           </w:p>
         </w:tc>
         <w:tc>
@@ -5997,6 +6580,8 @@
             </w:tcMar>
           </w:tcPr>
           <w:p>
+            <w:proofErr w:type="spellStart"/>
+            <w:proofErr w:type="gramStart"/>
             <w:r>
               <w:rPr>
                 <w:sz w:val="20"/>
@@ -6004,6 +6589,8 @@
               </w:rPr>
               <w:t>bcrypt</w:t>
             </w:r>
+            <w:proofErr w:type="spellEnd"/>
+            <w:proofErr w:type="gramEnd"/>
           </w:p>
         </w:tc>
         <w:tc>
@@ -6080,6 +6667,8 @@
             </w:tcMar>
           </w:tcPr>
           <w:p>
+            <w:proofErr w:type="spellStart"/>
+            <w:proofErr w:type="gramStart"/>
             <w:r>
               <w:rPr>
                 <w:sz w:val="20"/>
@@ -6087,6 +6676,8 @@
               </w:rPr>
               <w:t>pytest</w:t>
             </w:r>
+            <w:proofErr w:type="spellEnd"/>
+            <w:proofErr w:type="gramEnd"/>
           </w:p>
         </w:tc>
         <w:tc>
@@ -6163,6 +6754,7 @@
             </w:tcMar>
           </w:tcPr>
           <w:p>
+            <w:proofErr w:type="spellStart"/>
             <w:r>
               <w:rPr>
                 <w:sz w:val="20"/>
@@ -6170,6 +6762,7 @@
               </w:rPr>
               <w:t>ReportLab</w:t>
             </w:r>
+            <w:proofErr w:type="spellEnd"/>
           </w:p>
         </w:tc>
         <w:tc>
@@ -6278,7 +6871,23 @@
                 <w:sz w:val="20"/>
                 <w:szCs w:val="20"/>
               </w:rPr>
-              <w:t>Traçabilité des commits et historique du développement</w:t>
+              <w:t xml:space="preserve">Traçabilité des </w:t>
+            </w:r>
+            <w:proofErr w:type="spellStart"/>
+            <w:r>
+              <w:rPr>
+                <w:sz w:val="20"/>
+                <w:szCs w:val="20"/>
+              </w:rPr>
+              <w:t>commits</w:t>
+            </w:r>
+            <w:proofErr w:type="spellEnd"/>
+            <w:r>
+              <w:rPr>
+                <w:sz w:val="20"/>
+                <w:szCs w:val="20"/>
+              </w:rPr>
+              <w:t xml:space="preserve"> et historique du développement</w:t>
             </w:r>
           </w:p>
         </w:tc>
@@ -6444,8 +7053,17 @@
                 <w:sz w:val="20"/>
                 <w:szCs w:val="20"/>
               </w:rPr>
-              <w:t>Développement, test et débogage avec extensions Python et React</w:t>
-            </w:r>
+              <w:t xml:space="preserve">Développement, test et débogage avec extensions Python et </w:t>
+            </w:r>
+            <w:proofErr w:type="spellStart"/>
+            <w:r>
+              <w:rPr>
+                <w:sz w:val="20"/>
+                <w:szCs w:val="20"/>
+              </w:rPr>
+              <w:t>React</w:t>
+            </w:r>
+            <w:proofErr w:type="spellEnd"/>
           </w:p>
         </w:tc>
       </w:tr>
@@ -6495,12 +7113,37 @@
             </w:tcMar>
           </w:tcPr>
           <w:p>
-            <w:r>
-              <w:rPr>
-                <w:sz w:val="20"/>
-                <w:szCs w:val="20"/>
-              </w:rPr>
-              <w:t>Swagger UI (intégré FastAPI)</w:t>
+            <w:proofErr w:type="spellStart"/>
+            <w:r>
+              <w:rPr>
+                <w:sz w:val="20"/>
+                <w:szCs w:val="20"/>
+              </w:rPr>
+              <w:t>Swagger</w:t>
+            </w:r>
+            <w:proofErr w:type="spellEnd"/>
+            <w:r>
+              <w:rPr>
+                <w:sz w:val="20"/>
+                <w:szCs w:val="20"/>
+              </w:rPr>
+              <w:t xml:space="preserve"> UI (intégré </w:t>
+            </w:r>
+            <w:proofErr w:type="spellStart"/>
+            <w:r>
+              <w:rPr>
+                <w:sz w:val="20"/>
+                <w:szCs w:val="20"/>
+              </w:rPr>
+              <w:t>FastAPI</w:t>
+            </w:r>
+            <w:proofErr w:type="spellEnd"/>
+            <w:r>
+              <w:rPr>
+                <w:sz w:val="20"/>
+                <w:szCs w:val="20"/>
+              </w:rPr>
+              <w:t>)</w:t>
             </w:r>
           </w:p>
         </w:tc>
@@ -6827,7 +7470,39 @@
                 <w:sz w:val="20"/>
                 <w:szCs w:val="20"/>
               </w:rPr>
-              <w:t>Validation stricte côté backend (FastAPI) ; gestion des valeurs nulles via SQLAlchemy ; rejet des valeurs hors plage.</w:t>
+              <w:t>Validation stricte côté backend (</w:t>
+            </w:r>
+            <w:proofErr w:type="spellStart"/>
+            <w:r>
+              <w:rPr>
+                <w:sz w:val="20"/>
+                <w:szCs w:val="20"/>
+              </w:rPr>
+              <w:t>FastAPI</w:t>
+            </w:r>
+            <w:proofErr w:type="spellEnd"/>
+            <w:r>
+              <w:rPr>
+                <w:sz w:val="20"/>
+                <w:szCs w:val="20"/>
+              </w:rPr>
+              <w:t xml:space="preserve">) ; gestion des valeurs nulles via </w:t>
+            </w:r>
+            <w:proofErr w:type="spellStart"/>
+            <w:r>
+              <w:rPr>
+                <w:sz w:val="20"/>
+                <w:szCs w:val="20"/>
+              </w:rPr>
+              <w:t>SQLAlchemy</w:t>
+            </w:r>
+            <w:proofErr w:type="spellEnd"/>
+            <w:r>
+              <w:rPr>
+                <w:sz w:val="20"/>
+                <w:szCs w:val="20"/>
+              </w:rPr>
+              <w:t xml:space="preserve"> ; rejet des valeurs hors plage.</w:t>
             </w:r>
           </w:p>
         </w:tc>
@@ -6854,7 +7529,39 @@
                 <w:sz w:val="20"/>
                 <w:szCs w:val="20"/>
               </w:rPr>
-              <w:t>Rabin-Karp détecte les doublons ; Fenwick Tree tolère les gaps dans l'historique.</w:t>
+              <w:t>Rabin-</w:t>
+            </w:r>
+            <w:proofErr w:type="spellStart"/>
+            <w:r>
+              <w:rPr>
+                <w:sz w:val="20"/>
+                <w:szCs w:val="20"/>
+              </w:rPr>
+              <w:t>Karp</w:t>
+            </w:r>
+            <w:proofErr w:type="spellEnd"/>
+            <w:r>
+              <w:rPr>
+                <w:sz w:val="20"/>
+                <w:szCs w:val="20"/>
+              </w:rPr>
+              <w:t xml:space="preserve"> détecte les doublons ; Fenwick </w:t>
+            </w:r>
+            <w:proofErr w:type="spellStart"/>
+            <w:r>
+              <w:rPr>
+                <w:sz w:val="20"/>
+                <w:szCs w:val="20"/>
+              </w:rPr>
+              <w:t>Tree</w:t>
+            </w:r>
+            <w:proofErr w:type="spellEnd"/>
+            <w:r>
+              <w:rPr>
+                <w:sz w:val="20"/>
+                <w:szCs w:val="20"/>
+              </w:rPr>
+              <w:t xml:space="preserve"> tolère les gaps dans l'historique.</w:t>
             </w:r>
           </w:p>
         </w:tc>
@@ -6998,7 +7705,39 @@
                 <w:sz w:val="20"/>
                 <w:szCs w:val="20"/>
               </w:rPr>
-              <w:t>Fenwick Tree O(log n) vs O(n) naïf ; Dijkstra sur graphe extensible par ajout de nœuds.</w:t>
+              <w:t xml:space="preserve">Fenwick </w:t>
+            </w:r>
+            <w:proofErr w:type="spellStart"/>
+            <w:r>
+              <w:rPr>
+                <w:sz w:val="20"/>
+                <w:szCs w:val="20"/>
+              </w:rPr>
+              <w:t>Tree</w:t>
+            </w:r>
+            <w:proofErr w:type="spellEnd"/>
+            <w:r>
+              <w:rPr>
+                <w:sz w:val="20"/>
+                <w:szCs w:val="20"/>
+              </w:rPr>
+              <w:t xml:space="preserve"> </w:t>
+            </w:r>
+            <w:proofErr w:type="gramStart"/>
+            <w:r>
+              <w:rPr>
+                <w:sz w:val="20"/>
+                <w:szCs w:val="20"/>
+              </w:rPr>
+              <w:t>O(</w:t>
+            </w:r>
+            <w:proofErr w:type="gramEnd"/>
+            <w:r>
+              <w:rPr>
+                <w:sz w:val="20"/>
+                <w:szCs w:val="20"/>
+              </w:rPr>
+              <w:t>log n) vs O(n) naïf ; Dijkstra sur graphe extensible par ajout de nœuds.</w:t>
             </w:r>
           </w:p>
         </w:tc>
@@ -7108,7 +7847,39 @@
                 <w:sz w:val="20"/>
                 <w:szCs w:val="20"/>
               </w:rPr>
-              <w:t>File d'attente locale React Native (AsyncStorage) ; synchronisation différée à la reconnexion ; API idempotente.</w:t>
+              <w:t xml:space="preserve">File d'attente locale </w:t>
+            </w:r>
+            <w:proofErr w:type="spellStart"/>
+            <w:r>
+              <w:rPr>
+                <w:sz w:val="20"/>
+                <w:szCs w:val="20"/>
+              </w:rPr>
+              <w:t>React</w:t>
+            </w:r>
+            <w:proofErr w:type="spellEnd"/>
+            <w:r>
+              <w:rPr>
+                <w:sz w:val="20"/>
+                <w:szCs w:val="20"/>
+              </w:rPr>
+              <w:t xml:space="preserve"> Native (</w:t>
+            </w:r>
+            <w:proofErr w:type="spellStart"/>
+            <w:r>
+              <w:rPr>
+                <w:sz w:val="20"/>
+                <w:szCs w:val="20"/>
+              </w:rPr>
+              <w:t>AsyncStorage</w:t>
+            </w:r>
+            <w:proofErr w:type="spellEnd"/>
+            <w:r>
+              <w:rPr>
+                <w:sz w:val="20"/>
+                <w:szCs w:val="20"/>
+              </w:rPr>
+              <w:t>) ; synchronisation différée à la reconnexion ; API idempotente.</w:t>
             </w:r>
           </w:p>
         </w:tc>
@@ -7240,12 +8011,69 @@
             </w:tcMar>
           </w:tcPr>
           <w:p>
-            <w:r>
-              <w:rPr>
-                <w:sz w:val="20"/>
-                <w:szCs w:val="20"/>
-              </w:rPr>
-              <w:t>Endpoints FastAPI asynchrones (async/await) ; pagination des résultats.</w:t>
+            <w:proofErr w:type="spellStart"/>
+            <w:r>
+              <w:rPr>
+                <w:sz w:val="20"/>
+                <w:szCs w:val="20"/>
+              </w:rPr>
+              <w:t>Endpoints</w:t>
+            </w:r>
+            <w:proofErr w:type="spellEnd"/>
+            <w:r>
+              <w:rPr>
+                <w:sz w:val="20"/>
+                <w:szCs w:val="20"/>
+              </w:rPr>
+              <w:t xml:space="preserve"> </w:t>
+            </w:r>
+            <w:proofErr w:type="spellStart"/>
+            <w:r>
+              <w:rPr>
+                <w:sz w:val="20"/>
+                <w:szCs w:val="20"/>
+              </w:rPr>
+              <w:t>FastAPI</w:t>
+            </w:r>
+            <w:proofErr w:type="spellEnd"/>
+            <w:r>
+              <w:rPr>
+                <w:sz w:val="20"/>
+                <w:szCs w:val="20"/>
+              </w:rPr>
+              <w:t xml:space="preserve"> asynchrones (</w:t>
+            </w:r>
+            <w:proofErr w:type="spellStart"/>
+            <w:r>
+              <w:rPr>
+                <w:sz w:val="20"/>
+                <w:szCs w:val="20"/>
+              </w:rPr>
+              <w:t>async</w:t>
+            </w:r>
+            <w:proofErr w:type="spellEnd"/>
+            <w:r>
+              <w:rPr>
+                <w:sz w:val="20"/>
+                <w:szCs w:val="20"/>
+              </w:rPr>
+              <w:t>/</w:t>
+            </w:r>
+            <w:proofErr w:type="spellStart"/>
+            <w:r>
+              <w:rPr>
+                <w:sz w:val="20"/>
+                <w:szCs w:val="20"/>
+              </w:rPr>
+              <w:t>await</w:t>
+            </w:r>
+            <w:proofErr w:type="spellEnd"/>
+            <w:r>
+              <w:rPr>
+                <w:sz w:val="20"/>
+                <w:szCs w:val="20"/>
+              </w:rPr>
+              <w:t>) ; pagination des résultats.</w:t>
             </w:r>
           </w:p>
         </w:tc>
@@ -7272,7 +8100,23 @@
                 <w:sz w:val="20"/>
                 <w:szCs w:val="20"/>
               </w:rPr>
-              <w:t>Top-k O(log k) par insertion (tas binaire) ; évite un tri complet O(n log n) à chaque mise à jour.</w:t>
+              <w:t xml:space="preserve">Top-k </w:t>
+            </w:r>
+            <w:proofErr w:type="gramStart"/>
+            <w:r>
+              <w:rPr>
+                <w:sz w:val="20"/>
+                <w:szCs w:val="20"/>
+              </w:rPr>
+              <w:t>O(</w:t>
+            </w:r>
+            <w:proofErr w:type="gramEnd"/>
+            <w:r>
+              <w:rPr>
+                <w:sz w:val="20"/>
+                <w:szCs w:val="20"/>
+              </w:rPr>
+              <w:t>log k) par insertion (tas binaire) ; évite un tri complet O(n log n) à chaque mise à jour.</w:t>
             </w:r>
           </w:p>
         </w:tc>
@@ -7586,7 +8430,23 @@
                 <w:sz w:val="20"/>
                 <w:szCs w:val="20"/>
               </w:rPr>
-              <w:t>Priorisation stricte MoSCoW obligatoire ; planning Gantt rigoureux sur 12 semaines ; risque élevé de surcharge si un algorithme dépasse l'estimation de temps prévue.</w:t>
+              <w:t xml:space="preserve">Priorisation stricte </w:t>
+            </w:r>
+            <w:proofErr w:type="spellStart"/>
+            <w:r>
+              <w:rPr>
+                <w:sz w:val="20"/>
+                <w:szCs w:val="20"/>
+              </w:rPr>
+              <w:t>MoSCoW</w:t>
+            </w:r>
+            <w:proofErr w:type="spellEnd"/>
+            <w:r>
+              <w:rPr>
+                <w:sz w:val="20"/>
+                <w:szCs w:val="20"/>
+              </w:rPr>
+              <w:t xml:space="preserve"> obligatoire ; planning Gantt rigoureux sur 12 semaines ; risque élevé de surcharge si un algorithme dépasse l'estimation de temps prévue.</w:t>
             </w:r>
           </w:p>
         </w:tc>
@@ -7806,7 +8666,23 @@
                 <w:sz w:val="20"/>
                 <w:szCs w:val="20"/>
               </w:rPr>
-              <w:t>Visibilité personnelle du backlog ; nécessité d'une discipline individuelle forte pour respecter le Gantt.</w:t>
+              <w:t xml:space="preserve">Visibilité personnelle du </w:t>
+            </w:r>
+            <w:proofErr w:type="spellStart"/>
+            <w:r>
+              <w:rPr>
+                <w:sz w:val="20"/>
+                <w:szCs w:val="20"/>
+              </w:rPr>
+              <w:t>backlog</w:t>
+            </w:r>
+            <w:proofErr w:type="spellEnd"/>
+            <w:r>
+              <w:rPr>
+                <w:sz w:val="20"/>
+                <w:szCs w:val="20"/>
+              </w:rPr>
+              <w:t xml:space="preserve"> ; nécessité d'une discipline individuelle forte pour respecter le Gantt.</w:t>
             </w:r>
           </w:p>
         </w:tc>
@@ -7931,7 +8807,23 @@
                 <w:sz w:val="20"/>
                 <w:szCs w:val="20"/>
               </w:rPr>
-              <w:t>Les fonctionnalités Could Have (export PDF, mode offline complet) peuvent être sacrifiées si le délai est menacé.</w:t>
+              <w:t xml:space="preserve">Les fonctionnalités </w:t>
+            </w:r>
+            <w:proofErr w:type="spellStart"/>
+            <w:r>
+              <w:rPr>
+                <w:sz w:val="20"/>
+                <w:szCs w:val="20"/>
+              </w:rPr>
+              <w:t>Could</w:t>
+            </w:r>
+            <w:proofErr w:type="spellEnd"/>
+            <w:r>
+              <w:rPr>
+                <w:sz w:val="20"/>
+                <w:szCs w:val="20"/>
+              </w:rPr>
+              <w:t xml:space="preserve"> Have (export PDF, mode offline complet) peuvent être sacrifiées si le délai est menacé.</w:t>
             </w:r>
           </w:p>
         </w:tc>
@@ -8200,7 +9092,55 @@
                 <w:sz w:val="20"/>
                 <w:szCs w:val="20"/>
               </w:rPr>
-              <w:t>Authentification JWT (JSON Web Tokens) ; middleware de vérification du rôle sur chaque endpoint FastAPI.</w:t>
+              <w:t xml:space="preserve">Authentification JWT (JSON Web </w:t>
+            </w:r>
+            <w:proofErr w:type="spellStart"/>
+            <w:r>
+              <w:rPr>
+                <w:sz w:val="20"/>
+                <w:szCs w:val="20"/>
+              </w:rPr>
+              <w:t>Tokens</w:t>
+            </w:r>
+            <w:proofErr w:type="spellEnd"/>
+            <w:r>
+              <w:rPr>
+                <w:sz w:val="20"/>
+                <w:szCs w:val="20"/>
+              </w:rPr>
+              <w:t xml:space="preserve">) ; middleware de vérification du rôle sur chaque </w:t>
+            </w:r>
+            <w:proofErr w:type="spellStart"/>
+            <w:r>
+              <w:rPr>
+                <w:sz w:val="20"/>
+                <w:szCs w:val="20"/>
+              </w:rPr>
+              <w:t>endpoint</w:t>
+            </w:r>
+            <w:proofErr w:type="spellEnd"/>
+            <w:r>
+              <w:rPr>
+                <w:sz w:val="20"/>
+                <w:szCs w:val="20"/>
+              </w:rPr>
+              <w:t xml:space="preserve"> </w:t>
+            </w:r>
+            <w:proofErr w:type="spellStart"/>
+            <w:r>
+              <w:rPr>
+                <w:sz w:val="20"/>
+                <w:szCs w:val="20"/>
+              </w:rPr>
+              <w:t>FastAPI</w:t>
+            </w:r>
+            <w:proofErr w:type="spellEnd"/>
+            <w:r>
+              <w:rPr>
+                <w:sz w:val="20"/>
+                <w:szCs w:val="20"/>
+              </w:rPr>
+              <w:t>.</w:t>
             </w:r>
           </w:p>
         </w:tc>
@@ -8310,7 +9250,23 @@
                 <w:sz w:val="20"/>
                 <w:szCs w:val="20"/>
               </w:rPr>
-              <w:t>Hachage bcrypt avec sel aléatoire ; jamais de mot de passe en clair dans les logs.</w:t>
+              <w:t xml:space="preserve">Hachage </w:t>
+            </w:r>
+            <w:proofErr w:type="spellStart"/>
+            <w:r>
+              <w:rPr>
+                <w:sz w:val="20"/>
+                <w:szCs w:val="20"/>
+              </w:rPr>
+              <w:t>bcrypt</w:t>
+            </w:r>
+            <w:proofErr w:type="spellEnd"/>
+            <w:r>
+              <w:rPr>
+                <w:sz w:val="20"/>
+                <w:szCs w:val="20"/>
+              </w:rPr>
+              <w:t xml:space="preserve"> avec sel aléatoire ; jamais de mot de passe en clair dans les logs.</w:t>
             </w:r>
           </w:p>
         </w:tc>
@@ -8421,7 +9377,55 @@
                 <w:sz w:val="20"/>
                 <w:szCs w:val="20"/>
               </w:rPr>
-              <w:t>Validation Pydantic côté FastAPI ; typage strict des champs (float positif, date ISO 8601).</w:t>
+              <w:t xml:space="preserve">Validation </w:t>
+            </w:r>
+            <w:proofErr w:type="spellStart"/>
+            <w:r>
+              <w:rPr>
+                <w:sz w:val="20"/>
+                <w:szCs w:val="20"/>
+              </w:rPr>
+              <w:t>Pydantic</w:t>
+            </w:r>
+            <w:proofErr w:type="spellEnd"/>
+            <w:r>
+              <w:rPr>
+                <w:sz w:val="20"/>
+                <w:szCs w:val="20"/>
+              </w:rPr>
+              <w:t xml:space="preserve"> côté </w:t>
+            </w:r>
+            <w:proofErr w:type="spellStart"/>
+            <w:r>
+              <w:rPr>
+                <w:sz w:val="20"/>
+                <w:szCs w:val="20"/>
+              </w:rPr>
+              <w:t>FastAPI</w:t>
+            </w:r>
+            <w:proofErr w:type="spellEnd"/>
+            <w:r>
+              <w:rPr>
+                <w:sz w:val="20"/>
+                <w:szCs w:val="20"/>
+              </w:rPr>
+              <w:t xml:space="preserve"> ; typage strict des champs (</w:t>
+            </w:r>
+            <w:proofErr w:type="spellStart"/>
+            <w:r>
+              <w:rPr>
+                <w:sz w:val="20"/>
+                <w:szCs w:val="20"/>
+              </w:rPr>
+              <w:t>float</w:t>
+            </w:r>
+            <w:proofErr w:type="spellEnd"/>
+            <w:r>
+              <w:rPr>
+                <w:sz w:val="20"/>
+                <w:szCs w:val="20"/>
+              </w:rPr>
+              <w:t xml:space="preserve"> positif, date ISO 8601).</w:t>
             </w:r>
           </w:p>
         </w:tc>
@@ -8526,12 +9530,21 @@
             </w:tcMar>
           </w:tcPr>
           <w:p>
-            <w:r>
-              <w:rPr>
-                <w:sz w:val="20"/>
-                <w:szCs w:val="20"/>
-              </w:rPr>
-              <w:t>SQLAlchemy ORM utilisé exclusivement ; aucune requête SQL construite par concaténation de chaînes.</w:t>
+            <w:proofErr w:type="spellStart"/>
+            <w:r>
+              <w:rPr>
+                <w:sz w:val="20"/>
+                <w:szCs w:val="20"/>
+              </w:rPr>
+              <w:t>SQLAlchemy</w:t>
+            </w:r>
+            <w:proofErr w:type="spellEnd"/>
+            <w:r>
+              <w:rPr>
+                <w:sz w:val="20"/>
+                <w:szCs w:val="20"/>
+              </w:rPr>
+              <w:t xml:space="preserve"> ORM utilisé exclusivement ; aucune requête SQL construite par concaténation de chaînes.</w:t>
             </w:r>
           </w:p>
         </w:tc>
@@ -8795,7 +9808,23 @@
                 <w:sz w:val="20"/>
                 <w:szCs w:val="20"/>
               </w:rPr>
-              <w:t>Collecte minimale des données (principe de minimisation) ; pas de géolocalisation précise stockée ; données pseudonymisées dans les logs.</w:t>
+              <w:t xml:space="preserve">Collecte minimale des données (principe de minimisation) ; pas de géolocalisation précise stockée ; données </w:t>
+            </w:r>
+            <w:proofErr w:type="spellStart"/>
+            <w:r>
+              <w:rPr>
+                <w:sz w:val="20"/>
+                <w:szCs w:val="20"/>
+              </w:rPr>
+              <w:t>pseudonymisées</w:t>
+            </w:r>
+            <w:proofErr w:type="spellEnd"/>
+            <w:r>
+              <w:rPr>
+                <w:sz w:val="20"/>
+                <w:szCs w:val="20"/>
+              </w:rPr>
+              <w:t xml:space="preserve"> dans les logs.</w:t>
             </w:r>
           </w:p>
         </w:tc>
@@ -8988,7 +10017,55 @@
                 <w:sz w:val="20"/>
                 <w:szCs w:val="20"/>
               </w:rPr>
-              <w:t>Les bibliothèques open-source utilisées (FastAPI, React, SQLAlchemy, etc.) doivent être compatibles avec un usage académique.</w:t>
+              <w:t>Les bibliothèques open-source utilisées (</w:t>
+            </w:r>
+            <w:proofErr w:type="spellStart"/>
+            <w:r>
+              <w:rPr>
+                <w:sz w:val="20"/>
+                <w:szCs w:val="20"/>
+              </w:rPr>
+              <w:t>FastAPI</w:t>
+            </w:r>
+            <w:proofErr w:type="spellEnd"/>
+            <w:r>
+              <w:rPr>
+                <w:sz w:val="20"/>
+                <w:szCs w:val="20"/>
+              </w:rPr>
+              <w:t xml:space="preserve">, </w:t>
+            </w:r>
+            <w:proofErr w:type="spellStart"/>
+            <w:r>
+              <w:rPr>
+                <w:sz w:val="20"/>
+                <w:szCs w:val="20"/>
+              </w:rPr>
+              <w:t>React</w:t>
+            </w:r>
+            <w:proofErr w:type="spellEnd"/>
+            <w:r>
+              <w:rPr>
+                <w:sz w:val="20"/>
+                <w:szCs w:val="20"/>
+              </w:rPr>
+              <w:t xml:space="preserve">, </w:t>
+            </w:r>
+            <w:proofErr w:type="spellStart"/>
+            <w:r>
+              <w:rPr>
+                <w:sz w:val="20"/>
+                <w:szCs w:val="20"/>
+              </w:rPr>
+              <w:t>SQLAlchemy</w:t>
+            </w:r>
+            <w:proofErr w:type="spellEnd"/>
+            <w:r>
+              <w:rPr>
+                <w:sz w:val="20"/>
+                <w:szCs w:val="20"/>
+              </w:rPr>
+              <w:t>, etc.) doivent être compatibles avec un usage académique.</w:t>
             </w:r>
           </w:p>
         </w:tc>
@@ -9284,7 +10361,23 @@
                 <w:sz w:val="20"/>
                 <w:szCs w:val="20"/>
               </w:rPr>
-              <w:t>PostgreSQL déployé en local (localhost:5432) — configuration légère via un serveur local ; prototype exécutable sur machine personnelle avec les ressources disponibles</w:t>
+              <w:t>PostgreSQL déployé en local (</w:t>
+            </w:r>
+            <w:proofErr w:type="gramStart"/>
+            <w:r>
+              <w:rPr>
+                <w:sz w:val="20"/>
+                <w:szCs w:val="20"/>
+              </w:rPr>
+              <w:t>localhost:</w:t>
+            </w:r>
+            <w:proofErr w:type="gramEnd"/>
+            <w:r>
+              <w:rPr>
+                <w:sz w:val="20"/>
+                <w:szCs w:val="20"/>
+              </w:rPr>
+              <w:t>5432) — configuration légère via un serveur local ; prototype exécutable sur machine personnelle avec les ressources disponibles</w:t>
             </w:r>
             <w:r>
               <w:rPr>
@@ -9396,12 +10489,21 @@
             </w:tcMar>
           </w:tcPr>
           <w:p>
-            <w:r>
-              <w:rPr>
-                <w:sz w:val="20"/>
-                <w:szCs w:val="20"/>
-              </w:rPr>
-              <w:t xml:space="preserve">React Native optimisé pour Android first ; éviter les animations </w:t>
+            <w:proofErr w:type="spellStart"/>
+            <w:r>
+              <w:rPr>
+                <w:sz w:val="20"/>
+                <w:szCs w:val="20"/>
+              </w:rPr>
+              <w:t>React</w:t>
+            </w:r>
+            <w:proofErr w:type="spellEnd"/>
+            <w:r>
+              <w:rPr>
+                <w:sz w:val="20"/>
+                <w:szCs w:val="20"/>
+              </w:rPr>
+              <w:t xml:space="preserve"> Native optimisé pour Android first ; éviter les animations </w:t>
             </w:r>
             <w:r>
               <w:rPr>
@@ -9520,7 +10622,23 @@
                 <w:sz w:val="20"/>
                 <w:szCs w:val="20"/>
               </w:rPr>
-              <w:t>README avec instructions d'installation complètes ; données synthétiques pré-chargées pour la démo.</w:t>
+              <w:t xml:space="preserve">README avec instructions d'installation complètes ; données synthétiques </w:t>
+            </w:r>
+            <w:proofErr w:type="spellStart"/>
+            <w:r>
+              <w:rPr>
+                <w:sz w:val="20"/>
+                <w:szCs w:val="20"/>
+              </w:rPr>
+              <w:t>pré-chargées</w:t>
+            </w:r>
+            <w:proofErr w:type="spellEnd"/>
+            <w:r>
+              <w:rPr>
+                <w:sz w:val="20"/>
+                <w:szCs w:val="20"/>
+              </w:rPr>
+              <w:t xml:space="preserve"> pour la démo.</w:t>
             </w:r>
           </w:p>
         </w:tc>
@@ -9861,12 +10979,21 @@
             </w:tcMar>
           </w:tcPr>
           <w:p>
-            <w:r>
-              <w:rPr>
-                <w:sz w:val="20"/>
-                <w:szCs w:val="20"/>
-              </w:rPr>
-              <w:t>O((V + E) log V)</w:t>
+            <w:proofErr w:type="gramStart"/>
+            <w:r>
+              <w:rPr>
+                <w:sz w:val="20"/>
+                <w:szCs w:val="20"/>
+              </w:rPr>
+              <w:t>O(</w:t>
+            </w:r>
+            <w:proofErr w:type="gramEnd"/>
+            <w:r>
+              <w:rPr>
+                <w:sz w:val="20"/>
+                <w:szCs w:val="20"/>
+              </w:rPr>
+              <w:t>(V + E) log V)</w:t>
             </w:r>
           </w:p>
         </w:tc>
@@ -9922,7 +11049,23 @@
                 <w:sz w:val="20"/>
                 <w:szCs w:val="20"/>
               </w:rPr>
-              <w:t>Top-k (Tas binaire / Min-Heap)</w:t>
+              <w:t>Top-k (Tas binaire / Min-</w:t>
+            </w:r>
+            <w:proofErr w:type="spellStart"/>
+            <w:r>
+              <w:rPr>
+                <w:sz w:val="20"/>
+                <w:szCs w:val="20"/>
+              </w:rPr>
+              <w:t>Heap</w:t>
+            </w:r>
+            <w:proofErr w:type="spellEnd"/>
+            <w:r>
+              <w:rPr>
+                <w:sz w:val="20"/>
+                <w:szCs w:val="20"/>
+              </w:rPr>
+              <w:t>)</w:t>
             </w:r>
           </w:p>
         </w:tc>
@@ -9998,12 +11141,21 @@
             </w:tcMar>
           </w:tcPr>
           <w:p>
-            <w:r>
-              <w:rPr>
-                <w:sz w:val="20"/>
-                <w:szCs w:val="20"/>
-              </w:rPr>
-              <w:t>O(log k) par insertion</w:t>
+            <w:proofErr w:type="gramStart"/>
+            <w:r>
+              <w:rPr>
+                <w:sz w:val="20"/>
+                <w:szCs w:val="20"/>
+              </w:rPr>
+              <w:t>O(</w:t>
+            </w:r>
+            <w:proofErr w:type="gramEnd"/>
+            <w:r>
+              <w:rPr>
+                <w:sz w:val="20"/>
+                <w:szCs w:val="20"/>
+              </w:rPr>
+              <w:t>log k) par insertion</w:t>
             </w:r>
           </w:p>
         </w:tc>
@@ -10030,7 +11182,23 @@
                 <w:sz w:val="20"/>
                 <w:szCs w:val="20"/>
               </w:rPr>
-              <w:t>Évite un tri complet O(n log n) à chaque nouvelle donnée</w:t>
+              <w:t xml:space="preserve">Évite un tri complet </w:t>
+            </w:r>
+            <w:proofErr w:type="gramStart"/>
+            <w:r>
+              <w:rPr>
+                <w:sz w:val="20"/>
+                <w:szCs w:val="20"/>
+              </w:rPr>
+              <w:t>O(</w:t>
+            </w:r>
+            <w:proofErr w:type="gramEnd"/>
+            <w:r>
+              <w:rPr>
+                <w:sz w:val="20"/>
+                <w:szCs w:val="20"/>
+              </w:rPr>
+              <w:t>n log n) à chaque nouvelle donnée</w:t>
             </w:r>
           </w:p>
         </w:tc>
@@ -10059,7 +11227,23 @@
                 <w:sz w:val="20"/>
                 <w:szCs w:val="20"/>
               </w:rPr>
-              <w:t>Fenwick Tree (BIT)</w:t>
+              <w:t xml:space="preserve">Fenwick </w:t>
+            </w:r>
+            <w:proofErr w:type="spellStart"/>
+            <w:r>
+              <w:rPr>
+                <w:sz w:val="20"/>
+                <w:szCs w:val="20"/>
+              </w:rPr>
+              <w:t>Tree</w:t>
+            </w:r>
+            <w:proofErr w:type="spellEnd"/>
+            <w:r>
+              <w:rPr>
+                <w:sz w:val="20"/>
+                <w:szCs w:val="20"/>
+              </w:rPr>
+              <w:t xml:space="preserve"> (BIT)</w:t>
             </w:r>
           </w:p>
         </w:tc>
@@ -10135,12 +11319,21 @@
             </w:tcMar>
           </w:tcPr>
           <w:p>
-            <w:r>
-              <w:rPr>
-                <w:sz w:val="20"/>
-                <w:szCs w:val="20"/>
-              </w:rPr>
-              <w:t>O(log n) requête et mise à jour</w:t>
+            <w:proofErr w:type="gramStart"/>
+            <w:r>
+              <w:rPr>
+                <w:sz w:val="20"/>
+                <w:szCs w:val="20"/>
+              </w:rPr>
+              <w:t>O(</w:t>
+            </w:r>
+            <w:proofErr w:type="gramEnd"/>
+            <w:r>
+              <w:rPr>
+                <w:sz w:val="20"/>
+                <w:szCs w:val="20"/>
+              </w:rPr>
+              <w:t>log n) requête et mise à jour</w:t>
             </w:r>
           </w:p>
         </w:tc>
@@ -10196,8 +11389,17 @@
                 <w:sz w:val="20"/>
                 <w:szCs w:val="20"/>
               </w:rPr>
-              <w:t>Rabin-Karp</w:t>
-            </w:r>
+              <w:t>Rabin-</w:t>
+            </w:r>
+            <w:proofErr w:type="spellStart"/>
+            <w:r>
+              <w:rPr>
+                <w:sz w:val="20"/>
+                <w:szCs w:val="20"/>
+              </w:rPr>
+              <w:t>Karp</w:t>
+            </w:r>
+            <w:proofErr w:type="spellEnd"/>
           </w:p>
         </w:tc>
         <w:tc>
@@ -10560,12 +11762,21 @@
             </w:tcMar>
           </w:tcPr>
           <w:p>
-            <w:r>
-              <w:rPr>
-                <w:sz w:val="20"/>
-                <w:szCs w:val="20"/>
-              </w:rPr>
-              <w:t>O(V + E) espace</w:t>
+            <w:proofErr w:type="gramStart"/>
+            <w:r>
+              <w:rPr>
+                <w:sz w:val="20"/>
+                <w:szCs w:val="20"/>
+              </w:rPr>
+              <w:t>O(</w:t>
+            </w:r>
+            <w:proofErr w:type="gramEnd"/>
+            <w:r>
+              <w:rPr>
+                <w:sz w:val="20"/>
+                <w:szCs w:val="20"/>
+              </w:rPr>
+              <w:t>V + E) espace</w:t>
             </w:r>
           </w:p>
         </w:tc>
@@ -10621,7 +11832,23 @@
                 <w:sz w:val="20"/>
                 <w:szCs w:val="20"/>
               </w:rPr>
-              <w:t>Tas binaire (Min-Heap)</w:t>
+              <w:t>Tas binaire (Min-</w:t>
+            </w:r>
+            <w:proofErr w:type="spellStart"/>
+            <w:r>
+              <w:rPr>
+                <w:sz w:val="20"/>
+                <w:szCs w:val="20"/>
+              </w:rPr>
+              <w:t>Heap</w:t>
+            </w:r>
+            <w:proofErr w:type="spellEnd"/>
+            <w:r>
+              <w:rPr>
+                <w:sz w:val="20"/>
+                <w:szCs w:val="20"/>
+              </w:rPr>
+              <w:t>)</w:t>
             </w:r>
           </w:p>
         </w:tc>
@@ -10670,12 +11897,21 @@
             </w:tcMar>
           </w:tcPr>
           <w:p>
-            <w:r>
-              <w:rPr>
-                <w:sz w:val="20"/>
-                <w:szCs w:val="20"/>
-              </w:rPr>
-              <w:t>O(log n) insertion/extraction</w:t>
+            <w:proofErr w:type="gramStart"/>
+            <w:r>
+              <w:rPr>
+                <w:sz w:val="20"/>
+                <w:szCs w:val="20"/>
+              </w:rPr>
+              <w:t>O(</w:t>
+            </w:r>
+            <w:proofErr w:type="gramEnd"/>
+            <w:r>
+              <w:rPr>
+                <w:sz w:val="20"/>
+                <w:szCs w:val="20"/>
+              </w:rPr>
+              <w:t>log n) insertion/extraction</w:t>
             </w:r>
           </w:p>
         </w:tc>
@@ -10702,7 +11938,23 @@
                 <w:sz w:val="20"/>
                 <w:szCs w:val="20"/>
               </w:rPr>
-              <w:t>Structure native pour les algorithmes de priorité ; O(1) pour accéder au minimum</w:t>
+              <w:t xml:space="preserve">Structure native pour les algorithmes de priorité ; </w:t>
+            </w:r>
+            <w:proofErr w:type="gramStart"/>
+            <w:r>
+              <w:rPr>
+                <w:sz w:val="20"/>
+                <w:szCs w:val="20"/>
+              </w:rPr>
+              <w:t>O(</w:t>
+            </w:r>
+            <w:proofErr w:type="gramEnd"/>
+            <w:r>
+              <w:rPr>
+                <w:sz w:val="20"/>
+                <w:szCs w:val="20"/>
+              </w:rPr>
+              <w:t>1) pour accéder au minimum</w:t>
             </w:r>
           </w:p>
         </w:tc>
@@ -10731,7 +11983,23 @@
                 <w:sz w:val="20"/>
                 <w:szCs w:val="20"/>
               </w:rPr>
-              <w:t>Fenwick Tree (BIT)</w:t>
+              <w:t xml:space="preserve">Fenwick </w:t>
+            </w:r>
+            <w:proofErr w:type="spellStart"/>
+            <w:r>
+              <w:rPr>
+                <w:sz w:val="20"/>
+                <w:szCs w:val="20"/>
+              </w:rPr>
+              <w:t>Tree</w:t>
+            </w:r>
+            <w:proofErr w:type="spellEnd"/>
+            <w:r>
+              <w:rPr>
+                <w:sz w:val="20"/>
+                <w:szCs w:val="20"/>
+              </w:rPr>
+              <w:t xml:space="preserve"> (BIT)</w:t>
             </w:r>
           </w:p>
         </w:tc>
@@ -10780,13 +12048,31 @@
             </w:tcMar>
           </w:tcPr>
           <w:p>
-            <w:r>
-              <w:rPr>
-                <w:sz w:val="20"/>
-                <w:szCs w:val="20"/>
-              </w:rPr>
-              <w:t>O(log n) update/query</w:t>
-            </w:r>
+            <w:proofErr w:type="gramStart"/>
+            <w:r>
+              <w:rPr>
+                <w:sz w:val="20"/>
+                <w:szCs w:val="20"/>
+              </w:rPr>
+              <w:t>O(</w:t>
+            </w:r>
+            <w:proofErr w:type="gramEnd"/>
+            <w:r>
+              <w:rPr>
+                <w:sz w:val="20"/>
+                <w:szCs w:val="20"/>
+              </w:rPr>
+              <w:t>log n) update/</w:t>
+            </w:r>
+            <w:proofErr w:type="spellStart"/>
+            <w:r>
+              <w:rPr>
+                <w:sz w:val="20"/>
+                <w:szCs w:val="20"/>
+              </w:rPr>
+              <w:t>query</w:t>
+            </w:r>
+            <w:proofErr w:type="spellEnd"/>
           </w:p>
         </w:tc>
         <w:tc>
@@ -10812,7 +12098,23 @@
                 <w:sz w:val="20"/>
                 <w:szCs w:val="20"/>
               </w:rPr>
-              <w:t>Optimal pour requêtes d'intervalle dynamiques vs O(n) array naïf</w:t>
+              <w:t xml:space="preserve">Optimal pour requêtes d'intervalle dynamiques vs O(n) </w:t>
+            </w:r>
+            <w:proofErr w:type="spellStart"/>
+            <w:r>
+              <w:rPr>
+                <w:sz w:val="20"/>
+                <w:szCs w:val="20"/>
+              </w:rPr>
+              <w:t>array</w:t>
+            </w:r>
+            <w:proofErr w:type="spellEnd"/>
+            <w:r>
+              <w:rPr>
+                <w:sz w:val="20"/>
+                <w:szCs w:val="20"/>
+              </w:rPr>
+              <w:t xml:space="preserve"> naïf</w:t>
             </w:r>
           </w:p>
         </w:tc>
@@ -10868,8 +12170,17 @@
                 <w:sz w:val="20"/>
                 <w:szCs w:val="20"/>
               </w:rPr>
-              <w:t>Stockage des métadonnées produits et cache des empreintes Rabin-Karp</w:t>
-            </w:r>
+              <w:t>Stockage des métadonnées produits et cache des empreintes Rabin-</w:t>
+            </w:r>
+            <w:proofErr w:type="spellStart"/>
+            <w:r>
+              <w:rPr>
+                <w:sz w:val="20"/>
+                <w:szCs w:val="20"/>
+              </w:rPr>
+              <w:t>Karp</w:t>
+            </w:r>
+            <w:proofErr w:type="spellEnd"/>
           </w:p>
         </w:tc>
         <w:tc>
@@ -10890,12 +12201,21 @@
             </w:tcMar>
           </w:tcPr>
           <w:p>
-            <w:r>
-              <w:rPr>
-                <w:sz w:val="20"/>
-                <w:szCs w:val="20"/>
-              </w:rPr>
-              <w:t>O(1) amorti</w:t>
+            <w:proofErr w:type="gramStart"/>
+            <w:r>
+              <w:rPr>
+                <w:sz w:val="20"/>
+                <w:szCs w:val="20"/>
+              </w:rPr>
+              <w:t>O(</w:t>
+            </w:r>
+            <w:proofErr w:type="gramEnd"/>
+            <w:r>
+              <w:rPr>
+                <w:sz w:val="20"/>
+                <w:szCs w:val="20"/>
+              </w:rPr>
+              <w:t>1) amorti</w:t>
             </w:r>
           </w:p>
         </w:tc>
@@ -10951,7 +12271,23 @@
                 <w:sz w:val="20"/>
                 <w:szCs w:val="20"/>
               </w:rPr>
-              <w:t>Union-Find (DSU)</w:t>
+              <w:t>Union-</w:t>
+            </w:r>
+            <w:proofErr w:type="spellStart"/>
+            <w:r>
+              <w:rPr>
+                <w:sz w:val="20"/>
+                <w:szCs w:val="20"/>
+              </w:rPr>
+              <w:t>Find</w:t>
+            </w:r>
+            <w:proofErr w:type="spellEnd"/>
+            <w:r>
+              <w:rPr>
+                <w:sz w:val="20"/>
+                <w:szCs w:val="20"/>
+              </w:rPr>
+              <w:t xml:space="preserve"> (DSU)</w:t>
             </w:r>
           </w:p>
         </w:tc>
@@ -11070,7 +12406,15 @@
         <w:spacing w:after="140"/>
       </w:pPr>
       <w:r>
-        <w:t>Le modèle COCOMO (Constructive Cost Model) est une méthode d'estimation de l'effort de développement logiciel basée sur le nombre de lignes de code source (KLOC — milliers de lignes de code). Pour un projet académique individuel de type « organique » (petite équipe, domaine bien maîtrisé), les formules de base sont :</w:t>
+        <w:t xml:space="preserve">Le modèle COCOMO (Constructive </w:t>
+      </w:r>
+      <w:proofErr w:type="spellStart"/>
+      <w:r>
+        <w:t>Cost</w:t>
+      </w:r>
+      <w:proofErr w:type="spellEnd"/>
+      <w:r>
+        <w:t xml:space="preserve"> Model) est une méthode d'estimation de l'effort de développement logiciel basée sur le nombre de lignes de code source (KLOC — milliers de lignes de code). Pour un projet académique individuel de type « organique » (petite équipe, domaine bien maîtrisé), les formules de base sont :</w:t>
       </w:r>
     </w:p>
     <w:p>
@@ -11084,7 +12428,25 @@
           <w:bCs/>
           <w:color w:val="2E4D8A"/>
         </w:rPr>
-        <w:t>Effort (E) = 2.4 × (KLOC)^1.05  [en personnes-mois]</w:t>
+        <w:t>Effort (E) = 2.4 × (KLOC)^1.</w:t>
+      </w:r>
+      <w:proofErr w:type="gramStart"/>
+      <w:r>
+        <w:rPr>
+          <w:b/>
+          <w:bCs/>
+          <w:color w:val="2E4D8A"/>
+        </w:rPr>
+        <w:t>05  [</w:t>
+      </w:r>
+      <w:proofErr w:type="gramEnd"/>
+      <w:r>
+        <w:rPr>
+          <w:b/>
+          <w:bCs/>
+          <w:color w:val="2E4D8A"/>
+        </w:rPr>
+        <w:t>en personnes-mois]</w:t>
       </w:r>
     </w:p>
     <w:p>
@@ -11098,7 +12460,25 @@
           <w:bCs/>
           <w:color w:val="2E4D8A"/>
         </w:rPr>
-        <w:t>Durée (D) = 2.5 × E^0.38  [en mois]</w:t>
+        <w:t>Durée (D) = 2.5 × E^0.</w:t>
+      </w:r>
+      <w:proofErr w:type="gramStart"/>
+      <w:r>
+        <w:rPr>
+          <w:b/>
+          <w:bCs/>
+          <w:color w:val="2E4D8A"/>
+        </w:rPr>
+        <w:t>38  [</w:t>
+      </w:r>
+      <w:proofErr w:type="gramEnd"/>
+      <w:r>
+        <w:rPr>
+          <w:b/>
+          <w:bCs/>
+          <w:color w:val="2E4D8A"/>
+        </w:rPr>
+        <w:t>en mois]</w:t>
       </w:r>
     </w:p>
     <w:p>
@@ -11279,7 +12659,39 @@
                 <w:sz w:val="20"/>
                 <w:szCs w:val="20"/>
               </w:rPr>
-              <w:t>Fenwick Tree, Top-k, Dijkstra, Rabin-Karp + tests unitaires</w:t>
+              <w:t xml:space="preserve">Fenwick </w:t>
+            </w:r>
+            <w:proofErr w:type="spellStart"/>
+            <w:r>
+              <w:rPr>
+                <w:sz w:val="20"/>
+                <w:szCs w:val="20"/>
+              </w:rPr>
+              <w:t>Tree</w:t>
+            </w:r>
+            <w:proofErr w:type="spellEnd"/>
+            <w:r>
+              <w:rPr>
+                <w:sz w:val="20"/>
+                <w:szCs w:val="20"/>
+              </w:rPr>
+              <w:t>, Top-k, Dijkstra, Rabin-</w:t>
+            </w:r>
+            <w:proofErr w:type="spellStart"/>
+            <w:r>
+              <w:rPr>
+                <w:sz w:val="20"/>
+                <w:szCs w:val="20"/>
+              </w:rPr>
+              <w:t>Karp</w:t>
+            </w:r>
+            <w:proofErr w:type="spellEnd"/>
+            <w:r>
+              <w:rPr>
+                <w:sz w:val="20"/>
+                <w:szCs w:val="20"/>
+              </w:rPr>
+              <w:t xml:space="preserve"> + tests unitaires</w:t>
             </w:r>
           </w:p>
         </w:tc>
@@ -11335,8 +12747,17 @@
                 <w:sz w:val="20"/>
                 <w:szCs w:val="20"/>
               </w:rPr>
-              <w:t>Backend FastAPI</w:t>
-            </w:r>
+              <w:t xml:space="preserve">Backend </w:t>
+            </w:r>
+            <w:proofErr w:type="spellStart"/>
+            <w:r>
+              <w:rPr>
+                <w:sz w:val="20"/>
+                <w:szCs w:val="20"/>
+              </w:rPr>
+              <w:t>FastAPI</w:t>
+            </w:r>
+            <w:proofErr w:type="spellEnd"/>
           </w:p>
         </w:tc>
         <w:tc>
@@ -11362,7 +12783,23 @@
                 <w:sz w:val="20"/>
                 <w:szCs w:val="20"/>
               </w:rPr>
-              <w:t>Routes, controllers, services, repositories, config</w:t>
+              <w:t xml:space="preserve">Routes, </w:t>
+            </w:r>
+            <w:proofErr w:type="spellStart"/>
+            <w:r>
+              <w:rPr>
+                <w:sz w:val="20"/>
+                <w:szCs w:val="20"/>
+              </w:rPr>
+              <w:t>controllers</w:t>
+            </w:r>
+            <w:proofErr w:type="spellEnd"/>
+            <w:r>
+              <w:rPr>
+                <w:sz w:val="20"/>
+                <w:szCs w:val="20"/>
+              </w:rPr>
+              <w:t>, services, repositories, config</w:t>
             </w:r>
           </w:p>
         </w:tc>
@@ -11445,7 +12882,39 @@
                 <w:sz w:val="20"/>
                 <w:szCs w:val="20"/>
               </w:rPr>
-              <w:t>Schéma PostgreSQL, migrations SQLAlchemy, seed data — 0.4 KLOC</w:t>
+              <w:t xml:space="preserve">Schéma PostgreSQL, migrations </w:t>
+            </w:r>
+            <w:proofErr w:type="spellStart"/>
+            <w:r>
+              <w:rPr>
+                <w:sz w:val="20"/>
+                <w:szCs w:val="20"/>
+              </w:rPr>
+              <w:t>SQLAlchemy</w:t>
+            </w:r>
+            <w:proofErr w:type="spellEnd"/>
+            <w:r>
+              <w:rPr>
+                <w:sz w:val="20"/>
+                <w:szCs w:val="20"/>
+              </w:rPr>
+              <w:t xml:space="preserve">, </w:t>
+            </w:r>
+            <w:proofErr w:type="spellStart"/>
+            <w:r>
+              <w:rPr>
+                <w:sz w:val="20"/>
+                <w:szCs w:val="20"/>
+              </w:rPr>
+              <w:t>seed</w:t>
+            </w:r>
+            <w:proofErr w:type="spellEnd"/>
+            <w:r>
+              <w:rPr>
+                <w:sz w:val="20"/>
+                <w:szCs w:val="20"/>
+              </w:rPr>
+              <w:t xml:space="preserve"> data — 0.4 KLOC</w:t>
             </w:r>
           </w:p>
         </w:tc>
@@ -11584,7 +13053,23 @@
                 <w:sz w:val="20"/>
                 <w:szCs w:val="20"/>
               </w:rPr>
-              <w:t>Application React Native</w:t>
+              <w:t xml:space="preserve">Application </w:t>
+            </w:r>
+            <w:proofErr w:type="spellStart"/>
+            <w:r>
+              <w:rPr>
+                <w:sz w:val="20"/>
+                <w:szCs w:val="20"/>
+              </w:rPr>
+              <w:t>React</w:t>
+            </w:r>
+            <w:proofErr w:type="spellEnd"/>
+            <w:r>
+              <w:rPr>
+                <w:sz w:val="20"/>
+                <w:szCs w:val="20"/>
+              </w:rPr>
+              <w:t xml:space="preserve"> Native</w:t>
             </w:r>
           </w:p>
         </w:tc>
@@ -11611,7 +13096,23 @@
                 <w:sz w:val="20"/>
                 <w:szCs w:val="20"/>
               </w:rPr>
-              <w:t>Écrans mobile, navigation, sync offline</w:t>
+              <w:t xml:space="preserve">Écrans mobile, navigation, </w:t>
+            </w:r>
+            <w:proofErr w:type="spellStart"/>
+            <w:r>
+              <w:rPr>
+                <w:sz w:val="20"/>
+                <w:szCs w:val="20"/>
+              </w:rPr>
+              <w:t>sync</w:t>
+            </w:r>
+            <w:proofErr w:type="spellEnd"/>
+            <w:r>
+              <w:rPr>
+                <w:sz w:val="20"/>
+                <w:szCs w:val="20"/>
+              </w:rPr>
+              <w:t xml:space="preserve"> offline</w:t>
             </w:r>
           </w:p>
         </w:tc>
@@ -12063,7 +13564,23 @@
                 <w:sz w:val="20"/>
                 <w:szCs w:val="20"/>
               </w:rPr>
-              <w:t>2.4 × (6.5)^1.05</w:t>
+              <w:t>2.4 × (</w:t>
+            </w:r>
+            <w:proofErr w:type="gramStart"/>
+            <w:r>
+              <w:rPr>
+                <w:sz w:val="20"/>
+                <w:szCs w:val="20"/>
+              </w:rPr>
+              <w:t>6.5)^</w:t>
+            </w:r>
+            <w:proofErr w:type="gramEnd"/>
+            <w:r>
+              <w:rPr>
+                <w:sz w:val="20"/>
+                <w:szCs w:val="20"/>
+              </w:rPr>
+              <w:t>1.05</w:t>
             </w:r>
           </w:p>
         </w:tc>
@@ -12146,7 +13663,23 @@
                 <w:sz w:val="20"/>
                 <w:szCs w:val="20"/>
               </w:rPr>
-              <w:t>2.5 × (17.2)^0.38</w:t>
+              <w:t>2.5 × (</w:t>
+            </w:r>
+            <w:proofErr w:type="gramStart"/>
+            <w:r>
+              <w:rPr>
+                <w:sz w:val="20"/>
+                <w:szCs w:val="20"/>
+              </w:rPr>
+              <w:t>17.2)^</w:t>
+            </w:r>
+            <w:proofErr w:type="gramEnd"/>
+            <w:r>
+              <w:rPr>
+                <w:sz w:val="20"/>
+                <w:szCs w:val="20"/>
+              </w:rPr>
+              <w:t>0.38</w:t>
             </w:r>
           </w:p>
         </w:tc>
@@ -12365,7 +13898,25 @@
           <w:iCs/>
           <w:color w:val="555555"/>
         </w:rPr>
-        <w:t>Note : Le COCOMO confirme que 12 semaines est un délai serré mais réaliste pour un prototype fonctionnel. La priorité MoSCoW garantit que les livrables essentiels (Must Have) sont livrés en premier.</w:t>
+        <w:t xml:space="preserve">Note : Le COCOMO confirme que 12 semaines est un délai serré mais réaliste pour un prototype fonctionnel. La priorité </w:t>
+      </w:r>
+      <w:proofErr w:type="spellStart"/>
+      <w:r>
+        <w:rPr>
+          <w:i/>
+          <w:iCs/>
+          <w:color w:val="555555"/>
+        </w:rPr>
+        <w:t>MoSCoW</w:t>
+      </w:r>
+      <w:proofErr w:type="spellEnd"/>
+      <w:r>
+        <w:rPr>
+          <w:i/>
+          <w:iCs/>
+          <w:color w:val="555555"/>
+        </w:rPr>
+        <w:t xml:space="preserve"> garantit que les livrables essentiels (Must Have) sont livrés en premier.</w:t>
       </w:r>
     </w:p>
     <w:p>
@@ -13709,8 +15260,17 @@
                 <w:sz w:val="18"/>
                 <w:szCs w:val="18"/>
               </w:rPr>
-              <w:t>Fenwick Tree</w:t>
-            </w:r>
+              <w:t xml:space="preserve">Fenwick </w:t>
+            </w:r>
+            <w:proofErr w:type="spellStart"/>
+            <w:r>
+              <w:rPr>
+                <w:sz w:val="18"/>
+                <w:szCs w:val="18"/>
+              </w:rPr>
+              <w:t>Tree</w:t>
+            </w:r>
+            <w:proofErr w:type="spellEnd"/>
           </w:p>
         </w:tc>
         <w:tc>
@@ -14534,8 +16094,17 @@
                 <w:sz w:val="18"/>
                 <w:szCs w:val="18"/>
               </w:rPr>
-              <w:t>Rabin-Karp</w:t>
-            </w:r>
+              <w:t>Rabin-</w:t>
+            </w:r>
+            <w:proofErr w:type="spellStart"/>
+            <w:r>
+              <w:rPr>
+                <w:sz w:val="18"/>
+                <w:szCs w:val="18"/>
+              </w:rPr>
+              <w:t>Karp</w:t>
+            </w:r>
+            <w:proofErr w:type="spellEnd"/>
           </w:p>
         </w:tc>
         <w:tc>
@@ -15084,8 +16653,17 @@
                 <w:sz w:val="18"/>
                 <w:szCs w:val="18"/>
               </w:rPr>
-              <w:t>Backend FastAPI</w:t>
-            </w:r>
+              <w:t xml:space="preserve">Backend </w:t>
+            </w:r>
+            <w:proofErr w:type="spellStart"/>
+            <w:r>
+              <w:rPr>
+                <w:sz w:val="18"/>
+                <w:szCs w:val="18"/>
+              </w:rPr>
+              <w:t>FastAPI</w:t>
+            </w:r>
+            <w:proofErr w:type="spellEnd"/>
           </w:p>
         </w:tc>
         <w:tc>
@@ -15368,7 +16946,23 @@
                 <w:sz w:val="18"/>
                 <w:szCs w:val="18"/>
               </w:rPr>
-              <w:t>Frontend React/RN</w:t>
+              <w:t xml:space="preserve">Frontend </w:t>
+            </w:r>
+            <w:proofErr w:type="spellStart"/>
+            <w:r>
+              <w:rPr>
+                <w:sz w:val="18"/>
+                <w:szCs w:val="18"/>
+              </w:rPr>
+              <w:t>React</w:t>
+            </w:r>
+            <w:proofErr w:type="spellEnd"/>
+            <w:r>
+              <w:rPr>
+                <w:sz w:val="18"/>
+                <w:szCs w:val="18"/>
+              </w:rPr>
+              <w:t>/RN</w:t>
             </w:r>
           </w:p>
         </w:tc>
@@ -16389,7 +17983,23 @@
                 <w:sz w:val="20"/>
                 <w:szCs w:val="20"/>
               </w:rPr>
-              <w:t>Complexité algorithmique sous-estimée (Dijkstra, Fenwick Tree)</w:t>
+              <w:t xml:space="preserve">Complexité algorithmique sous-estimée (Dijkstra, Fenwick </w:t>
+            </w:r>
+            <w:proofErr w:type="spellStart"/>
+            <w:r>
+              <w:rPr>
+                <w:sz w:val="20"/>
+                <w:szCs w:val="20"/>
+              </w:rPr>
+              <w:t>Tree</w:t>
+            </w:r>
+            <w:proofErr w:type="spellEnd"/>
+            <w:r>
+              <w:rPr>
+                <w:sz w:val="20"/>
+                <w:szCs w:val="20"/>
+              </w:rPr>
+              <w:t>)</w:t>
             </w:r>
           </w:p>
         </w:tc>
@@ -16526,7 +18136,23 @@
                 <w:sz w:val="20"/>
                 <w:szCs w:val="20"/>
               </w:rPr>
-              <w:t>Manque de temps pour le frontend mobile (React Native)</w:t>
+              <w:t>Manque de temps pour le frontend mobile (</w:t>
+            </w:r>
+            <w:proofErr w:type="spellStart"/>
+            <w:r>
+              <w:rPr>
+                <w:sz w:val="20"/>
+                <w:szCs w:val="20"/>
+              </w:rPr>
+              <w:t>React</w:t>
+            </w:r>
+            <w:proofErr w:type="spellEnd"/>
+            <w:r>
+              <w:rPr>
+                <w:sz w:val="20"/>
+                <w:szCs w:val="20"/>
+              </w:rPr>
+              <w:t xml:space="preserve"> Native)</w:t>
             </w:r>
           </w:p>
         </w:tc>
@@ -16634,7 +18260,23 @@
                 <w:sz w:val="20"/>
                 <w:szCs w:val="20"/>
               </w:rPr>
-              <w:t>Prioriser MoSCoW : interface web d'abord, mobile en semaine 10-12 si le temps le permet</w:t>
+              <w:t xml:space="preserve">Prioriser </w:t>
+            </w:r>
+            <w:proofErr w:type="spellStart"/>
+            <w:r>
+              <w:rPr>
+                <w:sz w:val="20"/>
+                <w:szCs w:val="20"/>
+              </w:rPr>
+              <w:t>MoSCoW</w:t>
+            </w:r>
+            <w:proofErr w:type="spellEnd"/>
+            <w:r>
+              <w:rPr>
+                <w:sz w:val="20"/>
+                <w:szCs w:val="20"/>
+              </w:rPr>
+              <w:t xml:space="preserve"> : interface web d'abord, mobile en semaine 10-12 si le temps le permet</w:t>
             </w:r>
           </w:p>
         </w:tc>
@@ -16800,7 +18442,23 @@
                 <w:sz w:val="20"/>
                 <w:szCs w:val="20"/>
               </w:rPr>
-              <w:t>Problèmes de compatibilité SQLAlchemy +</w:t>
+              <w:t xml:space="preserve">Problèmes de compatibilité </w:t>
+            </w:r>
+            <w:proofErr w:type="spellStart"/>
+            <w:r>
+              <w:rPr>
+                <w:sz w:val="20"/>
+                <w:szCs w:val="20"/>
+              </w:rPr>
+              <w:t>SQLAlchemy</w:t>
+            </w:r>
+            <w:proofErr w:type="spellEnd"/>
+            <w:r>
+              <w:rPr>
+                <w:sz w:val="20"/>
+                <w:szCs w:val="20"/>
+              </w:rPr>
+              <w:t xml:space="preserve"> +</w:t>
             </w:r>
             <w:r>
               <w:rPr>
@@ -16923,7 +18581,23 @@
                 <w:sz w:val="20"/>
                 <w:szCs w:val="20"/>
               </w:rPr>
-              <w:t>Tester la connexion dès la mise en place ; SQLAlchemy est bien documenté pour PostgreSQL, vérifier que le serveur PostgreSQL est bien lancé en local avant chaque session de développement</w:t>
+              <w:t xml:space="preserve">Tester la connexion dès la mise en place ; </w:t>
+            </w:r>
+            <w:proofErr w:type="spellStart"/>
+            <w:r>
+              <w:rPr>
+                <w:sz w:val="20"/>
+                <w:szCs w:val="20"/>
+              </w:rPr>
+              <w:t>SQLAlchemy</w:t>
+            </w:r>
+            <w:proofErr w:type="spellEnd"/>
+            <w:r>
+              <w:rPr>
+                <w:sz w:val="20"/>
+                <w:szCs w:val="20"/>
+              </w:rPr>
+              <w:t xml:space="preserve"> est bien documenté pour PostgreSQL, vérifier que le serveur PostgreSQL est bien lancé en local avant chaque session de développement</w:t>
             </w:r>
           </w:p>
         </w:tc>
@@ -17060,7 +18734,23 @@
                 <w:sz w:val="20"/>
                 <w:szCs w:val="20"/>
               </w:rPr>
-              <w:t>Préparer une version de démo figée (données pré-chargées) en plus du prototype live</w:t>
+              <w:t xml:space="preserve">Préparer une version de démo figée (données </w:t>
+            </w:r>
+            <w:proofErr w:type="spellStart"/>
+            <w:r>
+              <w:rPr>
+                <w:sz w:val="20"/>
+                <w:szCs w:val="20"/>
+              </w:rPr>
+              <w:t>pré-chargées</w:t>
+            </w:r>
+            <w:proofErr w:type="spellEnd"/>
+            <w:r>
+              <w:rPr>
+                <w:sz w:val="20"/>
+                <w:szCs w:val="20"/>
+              </w:rPr>
+              <w:t>) en plus du prototype live</w:t>
             </w:r>
           </w:p>
         </w:tc>
@@ -17497,7 +19187,23 @@
                 <w:sz w:val="20"/>
                 <w:szCs w:val="20"/>
               </w:rPr>
-              <w:t>Fenwick Tree (BIT)</w:t>
+              <w:t xml:space="preserve">Fenwick </w:t>
+            </w:r>
+            <w:proofErr w:type="spellStart"/>
+            <w:r>
+              <w:rPr>
+                <w:sz w:val="20"/>
+                <w:szCs w:val="20"/>
+              </w:rPr>
+              <w:t>Tree</w:t>
+            </w:r>
+            <w:proofErr w:type="spellEnd"/>
+            <w:r>
+              <w:rPr>
+                <w:sz w:val="20"/>
+                <w:szCs w:val="20"/>
+              </w:rPr>
+              <w:t xml:space="preserve"> (BIT)</w:t>
             </w:r>
           </w:p>
         </w:tc>
@@ -17524,7 +19230,71 @@
                 <w:sz w:val="20"/>
                 <w:szCs w:val="20"/>
               </w:rPr>
-              <w:t>Structure de données permettant des mises à jour et des requêtes de sommes préfixes en O(log n). Aussi appelée Binary Indexed Tree.</w:t>
+              <w:t xml:space="preserve">Structure de données permettant des mises à jour et des requêtes de sommes préfixes en </w:t>
+            </w:r>
+            <w:proofErr w:type="gramStart"/>
+            <w:r>
+              <w:rPr>
+                <w:sz w:val="20"/>
+                <w:szCs w:val="20"/>
+              </w:rPr>
+              <w:t>O(</w:t>
+            </w:r>
+            <w:proofErr w:type="gramEnd"/>
+            <w:r>
+              <w:rPr>
+                <w:sz w:val="20"/>
+                <w:szCs w:val="20"/>
+              </w:rPr>
+              <w:t xml:space="preserve">log n). Aussi appelée </w:t>
+            </w:r>
+            <w:proofErr w:type="spellStart"/>
+            <w:r>
+              <w:rPr>
+                <w:sz w:val="20"/>
+                <w:szCs w:val="20"/>
+              </w:rPr>
+              <w:t>Binary</w:t>
+            </w:r>
+            <w:proofErr w:type="spellEnd"/>
+            <w:r>
+              <w:rPr>
+                <w:sz w:val="20"/>
+                <w:szCs w:val="20"/>
+              </w:rPr>
+              <w:t xml:space="preserve"> </w:t>
+            </w:r>
+            <w:proofErr w:type="spellStart"/>
+            <w:r>
+              <w:rPr>
+                <w:sz w:val="20"/>
+                <w:szCs w:val="20"/>
+              </w:rPr>
+              <w:t>Indexed</w:t>
+            </w:r>
+            <w:proofErr w:type="spellEnd"/>
+            <w:r>
+              <w:rPr>
+                <w:sz w:val="20"/>
+                <w:szCs w:val="20"/>
+              </w:rPr>
+              <w:t xml:space="preserve"> </w:t>
+            </w:r>
+            <w:proofErr w:type="spellStart"/>
+            <w:r>
+              <w:rPr>
+                <w:sz w:val="20"/>
+                <w:szCs w:val="20"/>
+              </w:rPr>
+              <w:t>Tree</w:t>
+            </w:r>
+            <w:proofErr w:type="spellEnd"/>
+            <w:r>
+              <w:rPr>
+                <w:sz w:val="20"/>
+                <w:szCs w:val="20"/>
+              </w:rPr>
+              <w:t>.</w:t>
             </w:r>
           </w:p>
         </w:tc>
@@ -17548,6 +19318,7 @@
             </w:tcMar>
           </w:tcPr>
           <w:p>
+            <w:proofErr w:type="spellStart"/>
             <w:r>
               <w:rPr>
                 <w:sz w:val="20"/>
@@ -17555,6 +19326,7 @@
               </w:rPr>
               <w:t>FastAPI</w:t>
             </w:r>
+            <w:proofErr w:type="spellEnd"/>
           </w:p>
         </w:tc>
         <w:tc>
@@ -17580,7 +19352,23 @@
                 <w:sz w:val="20"/>
                 <w:szCs w:val="20"/>
               </w:rPr>
-              <w:t>Framework Python moderne pour créer des API REST avec documentation automatique (Swagger UI) et typage fort.</w:t>
+              <w:t>Framework Python moderne pour créer des API REST avec documentation automatique (</w:t>
+            </w:r>
+            <w:proofErr w:type="spellStart"/>
+            <w:r>
+              <w:rPr>
+                <w:sz w:val="20"/>
+                <w:szCs w:val="20"/>
+              </w:rPr>
+              <w:t>Swagger</w:t>
+            </w:r>
+            <w:proofErr w:type="spellEnd"/>
+            <w:r>
+              <w:rPr>
+                <w:sz w:val="20"/>
+                <w:szCs w:val="20"/>
+              </w:rPr>
+              <w:t xml:space="preserve"> UI) et typage fort.</w:t>
             </w:r>
           </w:p>
         </w:tc>
@@ -17660,6 +19448,7 @@
             </w:tcMar>
           </w:tcPr>
           <w:p>
+            <w:proofErr w:type="spellStart"/>
             <w:r>
               <w:rPr>
                 <w:sz w:val="20"/>
@@ -17667,6 +19456,7 @@
               </w:rPr>
               <w:t>MoSCoW</w:t>
             </w:r>
+            <w:proofErr w:type="spellEnd"/>
           </w:p>
         </w:tc>
         <w:tc>
@@ -17692,7 +19482,55 @@
                 <w:sz w:val="20"/>
                 <w:szCs w:val="20"/>
               </w:rPr>
-              <w:t>Méthode de priorisation des besoins en quatre catégories : Must Have, Should Have, Could Have, Won't Have.</w:t>
+              <w:t xml:space="preserve">Méthode de priorisation des besoins en quatre catégories : Must Have, </w:t>
+            </w:r>
+            <w:proofErr w:type="spellStart"/>
+            <w:r>
+              <w:rPr>
+                <w:sz w:val="20"/>
+                <w:szCs w:val="20"/>
+              </w:rPr>
+              <w:t>Should</w:t>
+            </w:r>
+            <w:proofErr w:type="spellEnd"/>
+            <w:r>
+              <w:rPr>
+                <w:sz w:val="20"/>
+                <w:szCs w:val="20"/>
+              </w:rPr>
+              <w:t xml:space="preserve"> Have, </w:t>
+            </w:r>
+            <w:proofErr w:type="spellStart"/>
+            <w:r>
+              <w:rPr>
+                <w:sz w:val="20"/>
+                <w:szCs w:val="20"/>
+              </w:rPr>
+              <w:t>Could</w:t>
+            </w:r>
+            <w:proofErr w:type="spellEnd"/>
+            <w:r>
+              <w:rPr>
+                <w:sz w:val="20"/>
+                <w:szCs w:val="20"/>
+              </w:rPr>
+              <w:t xml:space="preserve"> Have, </w:t>
+            </w:r>
+            <w:proofErr w:type="spellStart"/>
+            <w:r>
+              <w:rPr>
+                <w:sz w:val="20"/>
+                <w:szCs w:val="20"/>
+              </w:rPr>
+              <w:t>Won't</w:t>
+            </w:r>
+            <w:proofErr w:type="spellEnd"/>
+            <w:r>
+              <w:rPr>
+                <w:sz w:val="20"/>
+                <w:szCs w:val="20"/>
+              </w:rPr>
+              <w:t xml:space="preserve"> Have.</w:t>
             </w:r>
           </w:p>
         </w:tc>
@@ -17721,8 +19559,17 @@
                 <w:sz w:val="20"/>
                 <w:szCs w:val="20"/>
               </w:rPr>
-              <w:t>Rabin-Karp</w:t>
-            </w:r>
+              <w:t>Rabin-</w:t>
+            </w:r>
+            <w:proofErr w:type="spellStart"/>
+            <w:r>
+              <w:rPr>
+                <w:sz w:val="20"/>
+                <w:szCs w:val="20"/>
+              </w:rPr>
+              <w:t>Karp</w:t>
+            </w:r>
+            <w:proofErr w:type="spellEnd"/>
           </w:p>
         </w:tc>
         <w:tc>
@@ -17772,12 +19619,21 @@
             </w:tcMar>
           </w:tcPr>
           <w:p>
-            <w:r>
-              <w:rPr>
-                <w:sz w:val="20"/>
-                <w:szCs w:val="20"/>
-              </w:rPr>
-              <w:t>React Native</w:t>
+            <w:proofErr w:type="spellStart"/>
+            <w:r>
+              <w:rPr>
+                <w:sz w:val="20"/>
+                <w:szCs w:val="20"/>
+              </w:rPr>
+              <w:t>React</w:t>
+            </w:r>
+            <w:proofErr w:type="spellEnd"/>
+            <w:r>
+              <w:rPr>
+                <w:sz w:val="20"/>
+                <w:szCs w:val="20"/>
+              </w:rPr>
+              <w:t xml:space="preserve"> Native</w:t>
             </w:r>
           </w:p>
         </w:tc>
@@ -17828,6 +19684,7 @@
             </w:tcMar>
           </w:tcPr>
           <w:p>
+            <w:proofErr w:type="spellStart"/>
             <w:r>
               <w:rPr>
                 <w:sz w:val="20"/>
@@ -17835,6 +19692,7 @@
               </w:rPr>
               <w:t>SQLAlchemy</w:t>
             </w:r>
+            <w:proofErr w:type="spellEnd"/>
           </w:p>
         </w:tc>
         <w:tc>
@@ -17860,7 +19718,23 @@
                 <w:sz w:val="20"/>
                 <w:szCs w:val="20"/>
               </w:rPr>
-              <w:t>ORM (Object-Relational Mapper) Python qui permet de manipuler une base de données en écrivant du code Python plutôt que du SQL brut.</w:t>
+              <w:t>ORM (Object-</w:t>
+            </w:r>
+            <w:proofErr w:type="spellStart"/>
+            <w:r>
+              <w:rPr>
+                <w:sz w:val="20"/>
+                <w:szCs w:val="20"/>
+              </w:rPr>
+              <w:t>Relational</w:t>
+            </w:r>
+            <w:proofErr w:type="spellEnd"/>
+            <w:r>
+              <w:rPr>
+                <w:sz w:val="20"/>
+                <w:szCs w:val="20"/>
+              </w:rPr>
+              <w:t xml:space="preserve"> Mapper) Python qui permet de manipuler une base de données en écrivant du code Python plutôt que du SQL brut.</w:t>
             </w:r>
           </w:p>
         </w:tc>
@@ -17884,12 +19758,21 @@
             </w:tcMar>
           </w:tcPr>
           <w:p>
-            <w:r>
-              <w:rPr>
-                <w:sz w:val="20"/>
-                <w:szCs w:val="20"/>
-              </w:rPr>
-              <w:t>Swagger UI</w:t>
+            <w:proofErr w:type="spellStart"/>
+            <w:r>
+              <w:rPr>
+                <w:sz w:val="20"/>
+                <w:szCs w:val="20"/>
+              </w:rPr>
+              <w:t>Swagger</w:t>
+            </w:r>
+            <w:proofErr w:type="spellEnd"/>
+            <w:r>
+              <w:rPr>
+                <w:sz w:val="20"/>
+                <w:szCs w:val="20"/>
+              </w:rPr>
+              <w:t xml:space="preserve"> UI</w:t>
             </w:r>
           </w:p>
         </w:tc>
@@ -17916,7 +19799,39 @@
                 <w:sz w:val="20"/>
                 <w:szCs w:val="20"/>
               </w:rPr>
-              <w:t>Interface web auto-générée par FastAPI permettant de tester tous les endpoints de l'API directement dans le navigateur.</w:t>
+              <w:t xml:space="preserve">Interface web auto-générée par </w:t>
+            </w:r>
+            <w:proofErr w:type="spellStart"/>
+            <w:r>
+              <w:rPr>
+                <w:sz w:val="20"/>
+                <w:szCs w:val="20"/>
+              </w:rPr>
+              <w:t>FastAPI</w:t>
+            </w:r>
+            <w:proofErr w:type="spellEnd"/>
+            <w:r>
+              <w:rPr>
+                <w:sz w:val="20"/>
+                <w:szCs w:val="20"/>
+              </w:rPr>
+              <w:t xml:space="preserve"> permettant de tester tous les </w:t>
+            </w:r>
+            <w:proofErr w:type="spellStart"/>
+            <w:r>
+              <w:rPr>
+                <w:sz w:val="20"/>
+                <w:szCs w:val="20"/>
+              </w:rPr>
+              <w:t>endpoints</w:t>
+            </w:r>
+            <w:proofErr w:type="spellEnd"/>
+            <w:r>
+              <w:rPr>
+                <w:sz w:val="20"/>
+                <w:szCs w:val="20"/>
+              </w:rPr>
+              <w:t xml:space="preserve"> de l'API directement dans le navigateur.</w:t>
             </w:r>
           </w:p>
         </w:tc>
@@ -17945,7 +19860,23 @@
                 <w:sz w:val="20"/>
                 <w:szCs w:val="20"/>
               </w:rPr>
-              <w:t>Tas binaire (Min-Heap)</w:t>
+              <w:t>Tas binaire (Min-</w:t>
+            </w:r>
+            <w:proofErr w:type="spellStart"/>
+            <w:r>
+              <w:rPr>
+                <w:sz w:val="20"/>
+                <w:szCs w:val="20"/>
+              </w:rPr>
+              <w:t>Heap</w:t>
+            </w:r>
+            <w:proofErr w:type="spellEnd"/>
+            <w:r>
+              <w:rPr>
+                <w:sz w:val="20"/>
+                <w:szCs w:val="20"/>
+              </w:rPr>
+              <w:t>)</w:t>
             </w:r>
           </w:p>
         </w:tc>
@@ -18052,6 +19983,7 @@
             </w:tcMar>
           </w:tcPr>
           <w:p>
+            <w:proofErr w:type="spellStart"/>
             <w:r>
               <w:rPr>
                 <w:sz w:val="20"/>
@@ -18059,6 +19991,7 @@
               </w:rPr>
               <w:t>Tsenan'tsika</w:t>
             </w:r>
+            <w:proofErr w:type="spellEnd"/>
           </w:p>
         </w:tc>
         <w:tc>
@@ -18113,7 +20046,23 @@
                 <w:sz w:val="20"/>
                 <w:szCs w:val="20"/>
               </w:rPr>
-              <w:t>Union-Find (DSU)</w:t>
+              <w:t>Union-</w:t>
+            </w:r>
+            <w:proofErr w:type="spellStart"/>
+            <w:r>
+              <w:rPr>
+                <w:sz w:val="20"/>
+                <w:szCs w:val="20"/>
+              </w:rPr>
+              <w:t>Find</w:t>
+            </w:r>
+            <w:proofErr w:type="spellEnd"/>
+            <w:r>
+              <w:rPr>
+                <w:sz w:val="20"/>
+                <w:szCs w:val="20"/>
+              </w:rPr>
+              <w:t xml:space="preserve"> (DSU)</w:t>
             </w:r>
           </w:p>
         </w:tc>
@@ -18208,7 +20157,23 @@
                 <w:sz w:val="20"/>
                 <w:szCs w:val="20"/>
               </w:rPr>
-              <w:t>Système de gestion de base de données relationnelle open-source avancé, utilisé comme couche de persistance du système. Accessible via SQLAlchemy sur le port 5432.</w:t>
+              <w:t xml:space="preserve">Système de gestion de base de données relationnelle open-source avancé, utilisé comme couche de persistance du système. Accessible via </w:t>
+            </w:r>
+            <w:proofErr w:type="spellStart"/>
+            <w:r>
+              <w:rPr>
+                <w:sz w:val="20"/>
+                <w:szCs w:val="20"/>
+              </w:rPr>
+              <w:t>SQLAlchemy</w:t>
+            </w:r>
+            <w:proofErr w:type="spellEnd"/>
+            <w:r>
+              <w:rPr>
+                <w:sz w:val="20"/>
+                <w:szCs w:val="20"/>
+              </w:rPr>
+              <w:t xml:space="preserve"> sur le port 5432.</w:t>
             </w:r>
           </w:p>
         </w:tc>
@@ -18232,7 +20197,29 @@
           <w:sz w:val="18"/>
           <w:szCs w:val="18"/>
         </w:rPr>
-        <w:t>RAKOTOJAONA Tsiaronomena Rohann — NIE : SE20240253 — 12 Mars 2026</w:t>
+        <w:t xml:space="preserve">RAKOTOJAONA </w:t>
+      </w:r>
+      <w:proofErr w:type="spellStart"/>
+      <w:r>
+        <w:rPr>
+          <w:i/>
+          <w:iCs/>
+          <w:color w:val="888888"/>
+          <w:sz w:val="18"/>
+          <w:szCs w:val="18"/>
+        </w:rPr>
+        <w:t>Tsiaronomena</w:t>
+      </w:r>
+      <w:proofErr w:type="spellEnd"/>
+      <w:r>
+        <w:rPr>
+          <w:i/>
+          <w:iCs/>
+          <w:color w:val="888888"/>
+          <w:sz w:val="18"/>
+          <w:szCs w:val="18"/>
+        </w:rPr>
+        <w:t xml:space="preserve"> Rohann — NIE : SE20240253 — 12 Mars 2026</w:t>
       </w:r>
     </w:p>
     <w:sectPr>

</xml_diff>